<commit_message>
Date: 23 Aug 2025
</commit_message>
<xml_diff>
--- a/Notes.docx
+++ b/Notes.docx
@@ -9692,6 +9692,30 @@
           <w:lang w:val="en-US"/>
         </w:rPr>
       </w:pPr>
+      <w:r>
+        <w:rPr>
+          <w:sz w:val="24"/>
+          <w:szCs w:val="22"/>
+          <w:lang w:val="en-US"/>
+        </w:rPr>
+        <w:t xml:space="preserve">@DataProvider </w:t>
+      </w:r>
+      <w:r>
+        <w:rPr>
+          <w:sz w:val="24"/>
+          <w:szCs w:val="22"/>
+          <w:lang w:val="en-US"/>
+        </w:rPr>
+        <w:sym w:font="Wingdings" w:char="F0E0"/>
+      </w:r>
+      <w:r>
+        <w:rPr>
+          <w:sz w:val="24"/>
+          <w:szCs w:val="22"/>
+          <w:lang w:val="en-US"/>
+        </w:rPr>
+        <w:t xml:space="preserve"> This method passes the data to test case. So the test case will get executed for multiple times. The data is passed in the form of 2D array.</w:t>
+      </w:r>
     </w:p>
     <w:p>
       <w:pPr>
@@ -10104,8 +10128,210 @@
           <w:lang w:val="en-US"/>
         </w:rPr>
       </w:pPr>
+    </w:p>
+    <w:p>
+      <w:pPr>
+        <w:rPr>
+          <w:sz w:val="24"/>
+          <w:szCs w:val="22"/>
+          <w:lang w:val="en-US"/>
+        </w:rPr>
+      </w:pPr>
+      <w:r>
+        <w:rPr>
+          <w:b/>
+          <w:bCs/>
+          <w:sz w:val="24"/>
+          <w:szCs w:val="22"/>
+          <w:lang w:val="en-US"/>
+        </w:rPr>
+        <w:t>Assertion – Is the process to mark any test case as pass or fail.</w:t>
+      </w:r>
+    </w:p>
+    <w:p>
+      <w:pPr>
+        <w:rPr>
+          <w:sz w:val="24"/>
+          <w:szCs w:val="22"/>
+          <w:lang w:val="en-US"/>
+        </w:rPr>
+      </w:pPr>
+    </w:p>
+    <w:p>
+      <w:pPr>
+        <w:rPr>
+          <w:b/>
+          <w:bCs/>
+          <w:sz w:val="24"/>
+          <w:szCs w:val="22"/>
+          <w:lang w:val="en-US"/>
+        </w:rPr>
+      </w:pPr>
+      <w:r>
+        <w:rPr>
+          <w:b/>
+          <w:bCs/>
+          <w:sz w:val="24"/>
+          <w:szCs w:val="22"/>
+          <w:lang w:val="en-US"/>
+        </w:rPr>
+        <w:t>Modular Framework</w:t>
+      </w:r>
+    </w:p>
+    <w:p>
+      <w:pPr>
+        <w:pStyle w:val="ListParagraph"/>
+        <w:numPr>
+          <w:ilvl w:val="0"/>
+          <w:numId w:val="31"/>
+        </w:numPr>
+        <w:rPr>
+          <w:sz w:val="24"/>
+          <w:szCs w:val="22"/>
+          <w:lang w:val="en-US"/>
+        </w:rPr>
+      </w:pPr>
+      <w:r>
+        <w:rPr>
+          <w:sz w:val="24"/>
+          <w:szCs w:val="22"/>
+          <w:lang w:val="en-US"/>
+        </w:rPr>
+        <w:t>Executing / Skipping Single / Multiple tests</w:t>
+      </w:r>
+    </w:p>
+    <w:p>
+      <w:pPr>
+        <w:pStyle w:val="ListParagraph"/>
+        <w:numPr>
+          <w:ilvl w:val="0"/>
+          <w:numId w:val="31"/>
+        </w:numPr>
+        <w:rPr>
+          <w:sz w:val="24"/>
+          <w:szCs w:val="22"/>
+          <w:lang w:val="en-US"/>
+        </w:rPr>
+      </w:pPr>
+      <w:r>
+        <w:rPr>
+          <w:sz w:val="24"/>
+          <w:szCs w:val="22"/>
+          <w:lang w:val="en-US"/>
+        </w:rPr>
+        <w:t>Execution via XML file</w:t>
+      </w:r>
+    </w:p>
+    <w:p>
+      <w:pPr>
+        <w:rPr>
+          <w:sz w:val="24"/>
+          <w:szCs w:val="22"/>
+          <w:lang w:val="en-US"/>
+        </w:rPr>
+      </w:pPr>
+      <w:r>
+        <w:rPr>
+          <w:sz w:val="24"/>
+          <w:szCs w:val="22"/>
+          <w:lang w:val="en-US"/>
+        </w:rPr>
+        <w:t>Points to be noted while creating xml file</w:t>
+      </w:r>
+    </w:p>
+    <w:p>
+      <w:pPr>
+        <w:pStyle w:val="ListParagraph"/>
+        <w:numPr>
+          <w:ilvl w:val="0"/>
+          <w:numId w:val="32"/>
+        </w:numPr>
+        <w:rPr>
+          <w:sz w:val="24"/>
+          <w:szCs w:val="22"/>
+          <w:lang w:val="en-US"/>
+        </w:rPr>
+      </w:pPr>
+      <w:r>
+        <w:rPr>
+          <w:sz w:val="24"/>
+          <w:szCs w:val="22"/>
+          <w:lang w:val="en-US"/>
+        </w:rPr>
+        <w:t>All the tags are pre-defined</w:t>
+      </w:r>
+    </w:p>
+    <w:p>
+      <w:pPr>
+        <w:pStyle w:val="ListParagraph"/>
+        <w:numPr>
+          <w:ilvl w:val="0"/>
+          <w:numId w:val="32"/>
+        </w:numPr>
+        <w:rPr>
+          <w:sz w:val="24"/>
+          <w:szCs w:val="22"/>
+          <w:lang w:val="en-US"/>
+        </w:rPr>
+      </w:pPr>
+      <w:r>
+        <w:rPr>
+          <w:sz w:val="24"/>
+          <w:szCs w:val="22"/>
+          <w:lang w:val="en-US"/>
+        </w:rPr>
+        <w:t>You cannot alter the sequence of tags</w:t>
+      </w:r>
+    </w:p>
+    <w:p>
+      <w:pPr>
+        <w:pStyle w:val="ListParagraph"/>
+        <w:numPr>
+          <w:ilvl w:val="0"/>
+          <w:numId w:val="32"/>
+        </w:numPr>
+        <w:rPr>
+          <w:sz w:val="24"/>
+          <w:szCs w:val="22"/>
+          <w:lang w:val="en-US"/>
+        </w:rPr>
+      </w:pPr>
+      <w:r>
+        <w:rPr>
+          <w:sz w:val="24"/>
+          <w:szCs w:val="22"/>
+          <w:lang w:val="en-US"/>
+        </w:rPr>
+        <w:t>All the tags are case sensitive.</w:t>
+      </w:r>
+      <w:r>
+        <w:rPr>
+          <w:sz w:val="24"/>
+          <w:szCs w:val="22"/>
+          <w:lang w:val="en-US"/>
+        </w:rPr>
+        <w:t xml:space="preserve"> (All tags needs to be written in small case)</w:t>
+      </w:r>
       <w:bookmarkStart w:id="0" w:name="_GoBack"/>
       <w:bookmarkEnd w:id="0"/>
+    </w:p>
+    <w:p>
+      <w:pPr>
+        <w:rPr>
+          <w:sz w:val="24"/>
+          <w:szCs w:val="22"/>
+          <w:lang w:val="en-US"/>
+        </w:rPr>
+      </w:pPr>
+    </w:p>
+    <w:p>
+      <w:pPr>
+        <w:rPr>
+          <w:sz w:val="24"/>
+          <w:szCs w:val="22"/>
+          <w:lang w:val="en-US"/>
+        </w:rPr>
+      </w:pPr>
     </w:p>
     <w:sectPr>
       <w:pgSz w:w="11906" w:h="16838"/>
@@ -10928,6 +11154,119 @@
     </w:lvl>
   </w:abstractNum>
   <w:abstractNum w:abstractNumId="8">
+    <w:nsid w:val="2A553A44"/>
+    <w:multiLevelType w:val="hybridMultilevel"/>
+    <w:tmpl w:val="F2845826"/>
+    <w:lvl w:ilvl="0" w:tplc="40090001">
+      <w:start w:val="1"/>
+      <w:numFmt w:val="bullet"/>
+      <w:lvlText w:val=""/>
+      <w:lvlJc w:val="left"/>
+      <w:pPr>
+        <w:ind w:left="720" w:hanging="360"/>
+      </w:pPr>
+      <w:rPr>
+        <w:rFonts w:ascii="Symbol" w:hAnsi="Symbol" w:hint="default"/>
+      </w:rPr>
+    </w:lvl>
+    <w:lvl w:ilvl="1" w:tplc="40090003" w:tentative="1">
+      <w:start w:val="1"/>
+      <w:numFmt w:val="bullet"/>
+      <w:lvlText w:val="o"/>
+      <w:lvlJc w:val="left"/>
+      <w:pPr>
+        <w:ind w:left="1440" w:hanging="360"/>
+      </w:pPr>
+      <w:rPr>
+        <w:rFonts w:ascii="Courier New" w:hAnsi="Courier New" w:cs="Courier New" w:hint="default"/>
+      </w:rPr>
+    </w:lvl>
+    <w:lvl w:ilvl="2" w:tplc="40090005" w:tentative="1">
+      <w:start w:val="1"/>
+      <w:numFmt w:val="bullet"/>
+      <w:lvlText w:val=""/>
+      <w:lvlJc w:val="left"/>
+      <w:pPr>
+        <w:ind w:left="2160" w:hanging="360"/>
+      </w:pPr>
+      <w:rPr>
+        <w:rFonts w:ascii="Wingdings" w:hAnsi="Wingdings" w:hint="default"/>
+      </w:rPr>
+    </w:lvl>
+    <w:lvl w:ilvl="3" w:tplc="40090001" w:tentative="1">
+      <w:start w:val="1"/>
+      <w:numFmt w:val="bullet"/>
+      <w:lvlText w:val=""/>
+      <w:lvlJc w:val="left"/>
+      <w:pPr>
+        <w:ind w:left="2880" w:hanging="360"/>
+      </w:pPr>
+      <w:rPr>
+        <w:rFonts w:ascii="Symbol" w:hAnsi="Symbol" w:hint="default"/>
+      </w:rPr>
+    </w:lvl>
+    <w:lvl w:ilvl="4" w:tplc="40090003" w:tentative="1">
+      <w:start w:val="1"/>
+      <w:numFmt w:val="bullet"/>
+      <w:lvlText w:val="o"/>
+      <w:lvlJc w:val="left"/>
+      <w:pPr>
+        <w:ind w:left="3600" w:hanging="360"/>
+      </w:pPr>
+      <w:rPr>
+        <w:rFonts w:ascii="Courier New" w:hAnsi="Courier New" w:cs="Courier New" w:hint="default"/>
+      </w:rPr>
+    </w:lvl>
+    <w:lvl w:ilvl="5" w:tplc="40090005" w:tentative="1">
+      <w:start w:val="1"/>
+      <w:numFmt w:val="bullet"/>
+      <w:lvlText w:val=""/>
+      <w:lvlJc w:val="left"/>
+      <w:pPr>
+        <w:ind w:left="4320" w:hanging="360"/>
+      </w:pPr>
+      <w:rPr>
+        <w:rFonts w:ascii="Wingdings" w:hAnsi="Wingdings" w:hint="default"/>
+      </w:rPr>
+    </w:lvl>
+    <w:lvl w:ilvl="6" w:tplc="40090001" w:tentative="1">
+      <w:start w:val="1"/>
+      <w:numFmt w:val="bullet"/>
+      <w:lvlText w:val=""/>
+      <w:lvlJc w:val="left"/>
+      <w:pPr>
+        <w:ind w:left="5040" w:hanging="360"/>
+      </w:pPr>
+      <w:rPr>
+        <w:rFonts w:ascii="Symbol" w:hAnsi="Symbol" w:hint="default"/>
+      </w:rPr>
+    </w:lvl>
+    <w:lvl w:ilvl="7" w:tplc="40090003" w:tentative="1">
+      <w:start w:val="1"/>
+      <w:numFmt w:val="bullet"/>
+      <w:lvlText w:val="o"/>
+      <w:lvlJc w:val="left"/>
+      <w:pPr>
+        <w:ind w:left="5760" w:hanging="360"/>
+      </w:pPr>
+      <w:rPr>
+        <w:rFonts w:ascii="Courier New" w:hAnsi="Courier New" w:cs="Courier New" w:hint="default"/>
+      </w:rPr>
+    </w:lvl>
+    <w:lvl w:ilvl="8" w:tplc="40090005" w:tentative="1">
+      <w:start w:val="1"/>
+      <w:numFmt w:val="bullet"/>
+      <w:lvlText w:val=""/>
+      <w:lvlJc w:val="left"/>
+      <w:pPr>
+        <w:ind w:left="6480" w:hanging="360"/>
+      </w:pPr>
+      <w:rPr>
+        <w:rFonts w:ascii="Wingdings" w:hAnsi="Wingdings" w:hint="default"/>
+      </w:rPr>
+    </w:lvl>
+  </w:abstractNum>
+  <w:abstractNum w:abstractNumId="9">
     <w:nsid w:val="2C6C6B11"/>
     <w:multiLevelType w:val="hybridMultilevel"/>
     <w:tmpl w:val="54D27682"/>
@@ -11040,7 +11379,7 @@
       </w:rPr>
     </w:lvl>
   </w:abstractNum>
-  <w:abstractNum w:abstractNumId="9">
+  <w:abstractNum w:abstractNumId="10">
     <w:nsid w:val="2D6F4250"/>
     <w:multiLevelType w:val="hybridMultilevel"/>
     <w:tmpl w:val="5DCCE37A"/>
@@ -11153,7 +11492,7 @@
       </w:rPr>
     </w:lvl>
   </w:abstractNum>
-  <w:abstractNum w:abstractNumId="10">
+  <w:abstractNum w:abstractNumId="11">
     <w:nsid w:val="2F10367A"/>
     <w:multiLevelType w:val="hybridMultilevel"/>
     <w:tmpl w:val="65084898"/>
@@ -11266,7 +11605,7 @@
       </w:rPr>
     </w:lvl>
   </w:abstractNum>
-  <w:abstractNum w:abstractNumId="11">
+  <w:abstractNum w:abstractNumId="12">
     <w:nsid w:val="352D3A5C"/>
     <w:multiLevelType w:val="hybridMultilevel"/>
     <w:tmpl w:val="7244368A"/>
@@ -11355,7 +11694,7 @@
       </w:pPr>
     </w:lvl>
   </w:abstractNum>
-  <w:abstractNum w:abstractNumId="12">
+  <w:abstractNum w:abstractNumId="13">
     <w:nsid w:val="359B3FD5"/>
     <w:multiLevelType w:val="hybridMultilevel"/>
     <w:tmpl w:val="874AA4A8"/>
@@ -11444,7 +11783,7 @@
       </w:pPr>
     </w:lvl>
   </w:abstractNum>
-  <w:abstractNum w:abstractNumId="13">
+  <w:abstractNum w:abstractNumId="14">
     <w:nsid w:val="36A069BE"/>
     <w:multiLevelType w:val="hybridMultilevel"/>
     <w:tmpl w:val="B666D886"/>
@@ -11557,7 +11896,7 @@
       </w:rPr>
     </w:lvl>
   </w:abstractNum>
-  <w:abstractNum w:abstractNumId="14">
+  <w:abstractNum w:abstractNumId="15">
     <w:nsid w:val="3DBF0974"/>
     <w:multiLevelType w:val="hybridMultilevel"/>
     <w:tmpl w:val="656C528C"/>
@@ -11646,7 +11985,7 @@
       </w:pPr>
     </w:lvl>
   </w:abstractNum>
-  <w:abstractNum w:abstractNumId="15">
+  <w:abstractNum w:abstractNumId="16">
     <w:nsid w:val="3E3F3676"/>
     <w:multiLevelType w:val="hybridMultilevel"/>
     <w:tmpl w:val="CDAE370A"/>
@@ -11735,7 +12074,7 @@
       </w:pPr>
     </w:lvl>
   </w:abstractNum>
-  <w:abstractNum w:abstractNumId="16">
+  <w:abstractNum w:abstractNumId="17">
     <w:nsid w:val="3F6D0AB0"/>
     <w:multiLevelType w:val="hybridMultilevel"/>
     <w:tmpl w:val="0876E60C"/>
@@ -11824,7 +12163,7 @@
       </w:pPr>
     </w:lvl>
   </w:abstractNum>
-  <w:abstractNum w:abstractNumId="17">
+  <w:abstractNum w:abstractNumId="18">
     <w:nsid w:val="3F863012"/>
     <w:multiLevelType w:val="hybridMultilevel"/>
     <w:tmpl w:val="794CFB18"/>
@@ -11913,7 +12252,7 @@
       </w:pPr>
     </w:lvl>
   </w:abstractNum>
-  <w:abstractNum w:abstractNumId="18">
+  <w:abstractNum w:abstractNumId="19">
     <w:nsid w:val="41F63E31"/>
     <w:multiLevelType w:val="hybridMultilevel"/>
     <w:tmpl w:val="47F60D22"/>
@@ -12026,7 +12365,7 @@
       </w:rPr>
     </w:lvl>
   </w:abstractNum>
-  <w:abstractNum w:abstractNumId="19">
+  <w:abstractNum w:abstractNumId="20">
     <w:nsid w:val="48BF0798"/>
     <w:multiLevelType w:val="hybridMultilevel"/>
     <w:tmpl w:val="1CCABF8C"/>
@@ -12115,7 +12454,7 @@
       </w:pPr>
     </w:lvl>
   </w:abstractNum>
-  <w:abstractNum w:abstractNumId="20">
+  <w:abstractNum w:abstractNumId="21">
     <w:nsid w:val="4A6953B6"/>
     <w:multiLevelType w:val="hybridMultilevel"/>
     <w:tmpl w:val="F8C434D8"/>
@@ -12204,7 +12543,7 @@
       </w:pPr>
     </w:lvl>
   </w:abstractNum>
-  <w:abstractNum w:abstractNumId="21">
+  <w:abstractNum w:abstractNumId="22">
     <w:nsid w:val="4B7A4655"/>
     <w:multiLevelType w:val="hybridMultilevel"/>
     <w:tmpl w:val="EC7AB170"/>
@@ -12317,7 +12656,7 @@
       </w:rPr>
     </w:lvl>
   </w:abstractNum>
-  <w:abstractNum w:abstractNumId="22">
+  <w:abstractNum w:abstractNumId="23">
     <w:nsid w:val="5310622E"/>
     <w:multiLevelType w:val="hybridMultilevel"/>
     <w:tmpl w:val="9906F9CE"/>
@@ -12430,7 +12769,7 @@
       </w:rPr>
     </w:lvl>
   </w:abstractNum>
-  <w:abstractNum w:abstractNumId="23">
+  <w:abstractNum w:abstractNumId="24">
     <w:nsid w:val="58E925AA"/>
     <w:multiLevelType w:val="hybridMultilevel"/>
     <w:tmpl w:val="4C34E418"/>
@@ -12519,7 +12858,7 @@
       </w:pPr>
     </w:lvl>
   </w:abstractNum>
-  <w:abstractNum w:abstractNumId="24">
+  <w:abstractNum w:abstractNumId="25">
     <w:nsid w:val="625A54F2"/>
     <w:multiLevelType w:val="hybridMultilevel"/>
     <w:tmpl w:val="0694B584"/>
@@ -12605,7 +12944,7 @@
       </w:pPr>
     </w:lvl>
   </w:abstractNum>
-  <w:abstractNum w:abstractNumId="25">
+  <w:abstractNum w:abstractNumId="26">
     <w:nsid w:val="636D1023"/>
     <w:multiLevelType w:val="hybridMultilevel"/>
     <w:tmpl w:val="817E55B8"/>
@@ -12718,7 +13057,7 @@
       </w:rPr>
     </w:lvl>
   </w:abstractNum>
-  <w:abstractNum w:abstractNumId="26">
+  <w:abstractNum w:abstractNumId="27">
     <w:nsid w:val="729755FC"/>
     <w:multiLevelType w:val="hybridMultilevel"/>
     <w:tmpl w:val="25D6C8E0"/>
@@ -12807,7 +13146,7 @@
       </w:pPr>
     </w:lvl>
   </w:abstractNum>
-  <w:abstractNum w:abstractNumId="27">
+  <w:abstractNum w:abstractNumId="28">
     <w:nsid w:val="73AD1520"/>
     <w:multiLevelType w:val="hybridMultilevel"/>
     <w:tmpl w:val="56149FBA"/>
@@ -12893,7 +13232,7 @@
       </w:pPr>
     </w:lvl>
   </w:abstractNum>
-  <w:abstractNum w:abstractNumId="28">
+  <w:abstractNum w:abstractNumId="29">
     <w:nsid w:val="747C125B"/>
     <w:multiLevelType w:val="hybridMultilevel"/>
     <w:tmpl w:val="7AB85DE6"/>
@@ -12982,7 +13321,96 @@
       </w:pPr>
     </w:lvl>
   </w:abstractNum>
-  <w:abstractNum w:abstractNumId="29">
+  <w:abstractNum w:abstractNumId="30">
+    <w:nsid w:val="7B0F502E"/>
+    <w:multiLevelType w:val="hybridMultilevel"/>
+    <w:tmpl w:val="D0CA6452"/>
+    <w:lvl w:ilvl="0" w:tplc="4009000F">
+      <w:start w:val="1"/>
+      <w:numFmt w:val="decimal"/>
+      <w:lvlText w:val="%1."/>
+      <w:lvlJc w:val="left"/>
+      <w:pPr>
+        <w:ind w:left="720" w:hanging="360"/>
+      </w:pPr>
+      <w:rPr>
+        <w:rFonts w:hint="default"/>
+      </w:rPr>
+    </w:lvl>
+    <w:lvl w:ilvl="1" w:tplc="40090019" w:tentative="1">
+      <w:start w:val="1"/>
+      <w:numFmt w:val="lowerLetter"/>
+      <w:lvlText w:val="%2."/>
+      <w:lvlJc w:val="left"/>
+      <w:pPr>
+        <w:ind w:left="1440" w:hanging="360"/>
+      </w:pPr>
+    </w:lvl>
+    <w:lvl w:ilvl="2" w:tplc="4009001B" w:tentative="1">
+      <w:start w:val="1"/>
+      <w:numFmt w:val="lowerRoman"/>
+      <w:lvlText w:val="%3."/>
+      <w:lvlJc w:val="right"/>
+      <w:pPr>
+        <w:ind w:left="2160" w:hanging="180"/>
+      </w:pPr>
+    </w:lvl>
+    <w:lvl w:ilvl="3" w:tplc="4009000F" w:tentative="1">
+      <w:start w:val="1"/>
+      <w:numFmt w:val="decimal"/>
+      <w:lvlText w:val="%4."/>
+      <w:lvlJc w:val="left"/>
+      <w:pPr>
+        <w:ind w:left="2880" w:hanging="360"/>
+      </w:pPr>
+    </w:lvl>
+    <w:lvl w:ilvl="4" w:tplc="40090019" w:tentative="1">
+      <w:start w:val="1"/>
+      <w:numFmt w:val="lowerLetter"/>
+      <w:lvlText w:val="%5."/>
+      <w:lvlJc w:val="left"/>
+      <w:pPr>
+        <w:ind w:left="3600" w:hanging="360"/>
+      </w:pPr>
+    </w:lvl>
+    <w:lvl w:ilvl="5" w:tplc="4009001B" w:tentative="1">
+      <w:start w:val="1"/>
+      <w:numFmt w:val="lowerRoman"/>
+      <w:lvlText w:val="%6."/>
+      <w:lvlJc w:val="right"/>
+      <w:pPr>
+        <w:ind w:left="4320" w:hanging="180"/>
+      </w:pPr>
+    </w:lvl>
+    <w:lvl w:ilvl="6" w:tplc="4009000F" w:tentative="1">
+      <w:start w:val="1"/>
+      <w:numFmt w:val="decimal"/>
+      <w:lvlText w:val="%7."/>
+      <w:lvlJc w:val="left"/>
+      <w:pPr>
+        <w:ind w:left="5040" w:hanging="360"/>
+      </w:pPr>
+    </w:lvl>
+    <w:lvl w:ilvl="7" w:tplc="40090019" w:tentative="1">
+      <w:start w:val="1"/>
+      <w:numFmt w:val="lowerLetter"/>
+      <w:lvlText w:val="%8."/>
+      <w:lvlJc w:val="left"/>
+      <w:pPr>
+        <w:ind w:left="5760" w:hanging="360"/>
+      </w:pPr>
+    </w:lvl>
+    <w:lvl w:ilvl="8" w:tplc="4009001B" w:tentative="1">
+      <w:start w:val="1"/>
+      <w:numFmt w:val="lowerRoman"/>
+      <w:lvlText w:val="%9."/>
+      <w:lvlJc w:val="right"/>
+      <w:pPr>
+        <w:ind w:left="6480" w:hanging="180"/>
+      </w:pPr>
+    </w:lvl>
+  </w:abstractNum>
+  <w:abstractNum w:abstractNumId="31">
     <w:nsid w:val="7EE72A42"/>
     <w:multiLevelType w:val="hybridMultilevel"/>
     <w:tmpl w:val="E0164236"/>
@@ -13072,40 +13500,40 @@
     </w:lvl>
   </w:abstractNum>
   <w:num w:numId="1">
-    <w:abstractNumId w:val="9"/>
+    <w:abstractNumId w:val="10"/>
   </w:num>
   <w:num w:numId="2">
     <w:abstractNumId w:val="7"/>
   </w:num>
   <w:num w:numId="3">
-    <w:abstractNumId w:val="13"/>
+    <w:abstractNumId w:val="14"/>
   </w:num>
   <w:num w:numId="4">
-    <w:abstractNumId w:val="8"/>
+    <w:abstractNumId w:val="9"/>
   </w:num>
   <w:num w:numId="5">
-    <w:abstractNumId w:val="22"/>
+    <w:abstractNumId w:val="23"/>
   </w:num>
   <w:num w:numId="6">
-    <w:abstractNumId w:val="14"/>
+    <w:abstractNumId w:val="15"/>
   </w:num>
   <w:num w:numId="7">
     <w:abstractNumId w:val="3"/>
   </w:num>
   <w:num w:numId="8">
-    <w:abstractNumId w:val="28"/>
+    <w:abstractNumId w:val="29"/>
   </w:num>
   <w:num w:numId="9">
-    <w:abstractNumId w:val="25"/>
+    <w:abstractNumId w:val="26"/>
   </w:num>
   <w:num w:numId="10">
-    <w:abstractNumId w:val="21"/>
+    <w:abstractNumId w:val="22"/>
   </w:num>
   <w:num w:numId="11">
     <w:abstractNumId w:val="2"/>
   </w:num>
   <w:num w:numId="12">
-    <w:abstractNumId w:val="20"/>
+    <w:abstractNumId w:val="21"/>
   </w:num>
   <w:num w:numId="13">
     <w:abstractNumId w:val="4"/>
@@ -13114,52 +13542,58 @@
     <w:abstractNumId w:val="0"/>
   </w:num>
   <w:num w:numId="15">
-    <w:abstractNumId w:val="10"/>
+    <w:abstractNumId w:val="11"/>
   </w:num>
   <w:num w:numId="16">
-    <w:abstractNumId w:val="24"/>
+    <w:abstractNumId w:val="25"/>
   </w:num>
   <w:num w:numId="17">
-    <w:abstractNumId w:val="26"/>
+    <w:abstractNumId w:val="27"/>
   </w:num>
   <w:num w:numId="18">
-    <w:abstractNumId w:val="23"/>
+    <w:abstractNumId w:val="24"/>
   </w:num>
   <w:num w:numId="19">
     <w:abstractNumId w:val="5"/>
   </w:num>
   <w:num w:numId="20">
-    <w:abstractNumId w:val="15"/>
+    <w:abstractNumId w:val="16"/>
   </w:num>
   <w:num w:numId="21">
     <w:abstractNumId w:val="1"/>
   </w:num>
   <w:num w:numId="22">
-    <w:abstractNumId w:val="12"/>
+    <w:abstractNumId w:val="13"/>
   </w:num>
   <w:num w:numId="23">
-    <w:abstractNumId w:val="19"/>
+    <w:abstractNumId w:val="20"/>
   </w:num>
   <w:num w:numId="24">
-    <w:abstractNumId w:val="17"/>
+    <w:abstractNumId w:val="18"/>
   </w:num>
   <w:num w:numId="25">
     <w:abstractNumId w:val="6"/>
   </w:num>
   <w:num w:numId="26">
-    <w:abstractNumId w:val="16"/>
+    <w:abstractNumId w:val="17"/>
   </w:num>
   <w:num w:numId="27">
-    <w:abstractNumId w:val="29"/>
+    <w:abstractNumId w:val="31"/>
   </w:num>
   <w:num w:numId="28">
-    <w:abstractNumId w:val="18"/>
+    <w:abstractNumId w:val="19"/>
   </w:num>
   <w:num w:numId="29">
-    <w:abstractNumId w:val="27"/>
+    <w:abstractNumId w:val="28"/>
   </w:num>
   <w:num w:numId="30">
-    <w:abstractNumId w:val="11"/>
+    <w:abstractNumId w:val="12"/>
+  </w:num>
+  <w:num w:numId="31">
+    <w:abstractNumId w:val="8"/>
+  </w:num>
+  <w:num w:numId="32">
+    <w:abstractNumId w:val="30"/>
   </w:num>
 </w:numbering>
 </file>
@@ -14785,22 +15219,22 @@
     </dgm:pt>
   </dgm:ptLst>
   <dgm:cxnLst>
-    <dgm:cxn modelId="{D6A9FBA7-ADB7-4789-9694-7FE7D3EA2382}" type="presOf" srcId="{12905BA0-FFBC-4F6F-A638-860052C3C22E}" destId="{7DC38E28-F114-44F6-A466-CCCEAA6E3A2B}" srcOrd="0" destOrd="0" presId="urn:microsoft.com/office/officeart/2005/8/layout/chevron1"/>
+    <dgm:cxn modelId="{6EB35C6B-B3A3-4CFA-91DF-BAB1C22335A1}" type="presOf" srcId="{7C35FEF7-DC0D-43AE-8BE3-2149FB2A04A2}" destId="{CBCE1630-5EA0-49CF-B64F-8E2E518136D4}" srcOrd="0" destOrd="0" presId="urn:microsoft.com/office/officeart/2005/8/layout/chevron1"/>
+    <dgm:cxn modelId="{6A907DD5-2CE7-415A-AABA-F6F63343A2C0}" type="presOf" srcId="{E4F40C07-A169-42D7-9A7C-EC1908A68E5F}" destId="{73B709FB-7B30-472B-AD65-EC980FF821F6}" srcOrd="0" destOrd="0" presId="urn:microsoft.com/office/officeart/2005/8/layout/chevron1"/>
+    <dgm:cxn modelId="{2E97E40F-E44E-4E18-A17B-80B520D1376D}" type="presOf" srcId="{518BBF31-5473-4647-89A8-1F7190FDD7CC}" destId="{5F46AD52-443D-445C-A0DE-55C3F3A14D43}" srcOrd="0" destOrd="0" presId="urn:microsoft.com/office/officeart/2005/8/layout/chevron1"/>
+    <dgm:cxn modelId="{B6E549AA-99FE-42D6-AC81-F5876D20206A}" type="presOf" srcId="{12905BA0-FFBC-4F6F-A638-860052C3C22E}" destId="{7DC38E28-F114-44F6-A466-CCCEAA6E3A2B}" srcOrd="0" destOrd="0" presId="urn:microsoft.com/office/officeart/2005/8/layout/chevron1"/>
+    <dgm:cxn modelId="{4FE1FE6A-5803-4018-B509-658EC487FBE6}" srcId="{E4F40C07-A169-42D7-9A7C-EC1908A68E5F}" destId="{C10563B1-D17B-4828-B40F-E64A77D38593}" srcOrd="0" destOrd="0" parTransId="{EEE0B6B6-BBA2-456F-B015-6F0E37F436A8}" sibTransId="{402CAF88-2D00-497D-BD34-BD7D8188DA24}"/>
+    <dgm:cxn modelId="{FBE79D26-2316-4364-8F3B-5098C5BA0A92}" srcId="{E4F40C07-A169-42D7-9A7C-EC1908A68E5F}" destId="{518BBF31-5473-4647-89A8-1F7190FDD7CC}" srcOrd="1" destOrd="0" parTransId="{51A8C620-C424-463F-9BEF-6A08563C7A06}" sibTransId="{017B1192-391E-4A65-81D1-6D7C5AF2AA1D}"/>
     <dgm:cxn modelId="{E2A6A5E9-A2D0-4BF2-AF8E-ACB6C085CA8C}" srcId="{E4F40C07-A169-42D7-9A7C-EC1908A68E5F}" destId="{7C35FEF7-DC0D-43AE-8BE3-2149FB2A04A2}" srcOrd="2" destOrd="0" parTransId="{F35C3024-56BC-477B-B2DD-7628EC4D0598}" sibTransId="{5E9DDC1B-8E20-45BD-B2C4-DE21EC41E73E}"/>
-    <dgm:cxn modelId="{A8631F1C-F240-4674-BD8E-B0AB5BD05516}" type="presOf" srcId="{7C35FEF7-DC0D-43AE-8BE3-2149FB2A04A2}" destId="{CBCE1630-5EA0-49CF-B64F-8E2E518136D4}" srcOrd="0" destOrd="0" presId="urn:microsoft.com/office/officeart/2005/8/layout/chevron1"/>
+    <dgm:cxn modelId="{9324BE21-9476-408D-AA24-8F0D5845A5B1}" type="presOf" srcId="{C10563B1-D17B-4828-B40F-E64A77D38593}" destId="{4D560F50-8F16-4794-86B3-C3D8DE2F9386}" srcOrd="0" destOrd="0" presId="urn:microsoft.com/office/officeart/2005/8/layout/chevron1"/>
     <dgm:cxn modelId="{3C1C0D14-6DF2-4652-9E4E-340880213B41}" srcId="{E4F40C07-A169-42D7-9A7C-EC1908A68E5F}" destId="{12905BA0-FFBC-4F6F-A638-860052C3C22E}" srcOrd="3" destOrd="0" parTransId="{51C23596-DA0B-4497-9E19-6A9465F512F2}" sibTransId="{B30D78C5-2EE3-4FC4-ADE9-34EAB867FD7E}"/>
-    <dgm:cxn modelId="{0E67B827-A200-42A6-98BF-5E42CBEA3757}" type="presOf" srcId="{518BBF31-5473-4647-89A8-1F7190FDD7CC}" destId="{5F46AD52-443D-445C-A0DE-55C3F3A14D43}" srcOrd="0" destOrd="0" presId="urn:microsoft.com/office/officeart/2005/8/layout/chevron1"/>
-    <dgm:cxn modelId="{FBE79D26-2316-4364-8F3B-5098C5BA0A92}" srcId="{E4F40C07-A169-42D7-9A7C-EC1908A68E5F}" destId="{518BBF31-5473-4647-89A8-1F7190FDD7CC}" srcOrd="1" destOrd="0" parTransId="{51A8C620-C424-463F-9BEF-6A08563C7A06}" sibTransId="{017B1192-391E-4A65-81D1-6D7C5AF2AA1D}"/>
-    <dgm:cxn modelId="{44E3BD51-CCB5-45F7-AC48-C0E2836F795C}" type="presOf" srcId="{C10563B1-D17B-4828-B40F-E64A77D38593}" destId="{4D560F50-8F16-4794-86B3-C3D8DE2F9386}" srcOrd="0" destOrd="0" presId="urn:microsoft.com/office/officeart/2005/8/layout/chevron1"/>
-    <dgm:cxn modelId="{182D613E-EC8C-4DB3-9D44-9B2AF9D795CC}" type="presOf" srcId="{E4F40C07-A169-42D7-9A7C-EC1908A68E5F}" destId="{73B709FB-7B30-472B-AD65-EC980FF821F6}" srcOrd="0" destOrd="0" presId="urn:microsoft.com/office/officeart/2005/8/layout/chevron1"/>
-    <dgm:cxn modelId="{4FE1FE6A-5803-4018-B509-658EC487FBE6}" srcId="{E4F40C07-A169-42D7-9A7C-EC1908A68E5F}" destId="{C10563B1-D17B-4828-B40F-E64A77D38593}" srcOrd="0" destOrd="0" parTransId="{EEE0B6B6-BBA2-456F-B015-6F0E37F436A8}" sibTransId="{402CAF88-2D00-497D-BD34-BD7D8188DA24}"/>
-    <dgm:cxn modelId="{2922B745-C767-473F-9C71-01B4748933F8}" type="presParOf" srcId="{73B709FB-7B30-472B-AD65-EC980FF821F6}" destId="{4D560F50-8F16-4794-86B3-C3D8DE2F9386}" srcOrd="0" destOrd="0" presId="urn:microsoft.com/office/officeart/2005/8/layout/chevron1"/>
-    <dgm:cxn modelId="{7671D8AA-D911-49CC-943F-B8D95F6C2AD8}" type="presParOf" srcId="{73B709FB-7B30-472B-AD65-EC980FF821F6}" destId="{154621DC-2D17-41EF-803D-3A82BFCEB308}" srcOrd="1" destOrd="0" presId="urn:microsoft.com/office/officeart/2005/8/layout/chevron1"/>
-    <dgm:cxn modelId="{959D4F8C-809F-4E2C-9019-127B397EF0F8}" type="presParOf" srcId="{73B709FB-7B30-472B-AD65-EC980FF821F6}" destId="{5F46AD52-443D-445C-A0DE-55C3F3A14D43}" srcOrd="2" destOrd="0" presId="urn:microsoft.com/office/officeart/2005/8/layout/chevron1"/>
-    <dgm:cxn modelId="{5AFBDB9C-EED8-4A03-9715-F639F29711D2}" type="presParOf" srcId="{73B709FB-7B30-472B-AD65-EC980FF821F6}" destId="{3E86C66D-943B-4F67-81EE-8C1894017E0F}" srcOrd="3" destOrd="0" presId="urn:microsoft.com/office/officeart/2005/8/layout/chevron1"/>
-    <dgm:cxn modelId="{FF69C1F9-566D-42C4-AC1D-D8F061B6AEE3}" type="presParOf" srcId="{73B709FB-7B30-472B-AD65-EC980FF821F6}" destId="{CBCE1630-5EA0-49CF-B64F-8E2E518136D4}" srcOrd="4" destOrd="0" presId="urn:microsoft.com/office/officeart/2005/8/layout/chevron1"/>
-    <dgm:cxn modelId="{838CEC65-E995-4144-B7ED-1EA92BA995A1}" type="presParOf" srcId="{73B709FB-7B30-472B-AD65-EC980FF821F6}" destId="{594D3F54-EE82-44DD-84F9-B2DCBA830960}" srcOrd="5" destOrd="0" presId="urn:microsoft.com/office/officeart/2005/8/layout/chevron1"/>
-    <dgm:cxn modelId="{F7129214-EB90-4723-9E7F-317BC668F343}" type="presParOf" srcId="{73B709FB-7B30-472B-AD65-EC980FF821F6}" destId="{7DC38E28-F114-44F6-A466-CCCEAA6E3A2B}" srcOrd="6" destOrd="0" presId="urn:microsoft.com/office/officeart/2005/8/layout/chevron1"/>
+    <dgm:cxn modelId="{77D26004-DAB8-425E-9252-9292E3E25326}" type="presParOf" srcId="{73B709FB-7B30-472B-AD65-EC980FF821F6}" destId="{4D560F50-8F16-4794-86B3-C3D8DE2F9386}" srcOrd="0" destOrd="0" presId="urn:microsoft.com/office/officeart/2005/8/layout/chevron1"/>
+    <dgm:cxn modelId="{E042C8E9-6A29-403C-896B-D69E971557F2}" type="presParOf" srcId="{73B709FB-7B30-472B-AD65-EC980FF821F6}" destId="{154621DC-2D17-41EF-803D-3A82BFCEB308}" srcOrd="1" destOrd="0" presId="urn:microsoft.com/office/officeart/2005/8/layout/chevron1"/>
+    <dgm:cxn modelId="{F5986667-F0C1-4AC5-86A9-15C0537C9B7F}" type="presParOf" srcId="{73B709FB-7B30-472B-AD65-EC980FF821F6}" destId="{5F46AD52-443D-445C-A0DE-55C3F3A14D43}" srcOrd="2" destOrd="0" presId="urn:microsoft.com/office/officeart/2005/8/layout/chevron1"/>
+    <dgm:cxn modelId="{F1EE30B8-4D54-4937-8FD6-5D693D671940}" type="presParOf" srcId="{73B709FB-7B30-472B-AD65-EC980FF821F6}" destId="{3E86C66D-943B-4F67-81EE-8C1894017E0F}" srcOrd="3" destOrd="0" presId="urn:microsoft.com/office/officeart/2005/8/layout/chevron1"/>
+    <dgm:cxn modelId="{7FE7CA2F-EDA0-4203-B639-146848FC53E7}" type="presParOf" srcId="{73B709FB-7B30-472B-AD65-EC980FF821F6}" destId="{CBCE1630-5EA0-49CF-B64F-8E2E518136D4}" srcOrd="4" destOrd="0" presId="urn:microsoft.com/office/officeart/2005/8/layout/chevron1"/>
+    <dgm:cxn modelId="{EE59F615-BBFE-4F1C-AA32-76187BF3C734}" type="presParOf" srcId="{73B709FB-7B30-472B-AD65-EC980FF821F6}" destId="{594D3F54-EE82-44DD-84F9-B2DCBA830960}" srcOrd="5" destOrd="0" presId="urn:microsoft.com/office/officeart/2005/8/layout/chevron1"/>
+    <dgm:cxn modelId="{89E2C96B-42B1-4EA1-9FC5-ECDC8F9482B8}" type="presParOf" srcId="{73B709FB-7B30-472B-AD65-EC980FF821F6}" destId="{7DC38E28-F114-44F6-A466-CCCEAA6E3A2B}" srcOrd="6" destOrd="0" presId="urn:microsoft.com/office/officeart/2005/8/layout/chevron1"/>
   </dgm:cxnLst>
   <dgm:bg/>
   <dgm:whole/>

</xml_diff>

<commit_message>
Date: 30 Aug 2025
</commit_message>
<xml_diff>
--- a/Notes.docx
+++ b/Notes.docx
@@ -33,8 +33,18 @@
           <w:szCs w:val="22"/>
           <w:lang w:val="en-US"/>
         </w:rPr>
-        <w:t>Duration: 48 + 18 Hrs</w:t>
-      </w:r>
+        <w:t xml:space="preserve">Duration: 48 + 18 </w:t>
+      </w:r>
+      <w:proofErr w:type="spellStart"/>
+      <w:r>
+        <w:rPr>
+          <w:sz w:val="24"/>
+          <w:szCs w:val="22"/>
+          <w:lang w:val="en-US"/>
+        </w:rPr>
+        <w:t>Hrs</w:t>
+      </w:r>
+      <w:proofErr w:type="spellEnd"/>
     </w:p>
     <w:p>
       <w:pPr>
@@ -718,13 +728,23 @@
           <w:lang w:val="en-US"/>
         </w:rPr>
       </w:pPr>
-      <w:r>
-        <w:rPr>
-          <w:sz w:val="24"/>
-          <w:szCs w:val="22"/>
-          <w:lang w:val="en-US"/>
-        </w:rPr>
-        <w:t>Thread.Sleep()</w:t>
+      <w:proofErr w:type="spellStart"/>
+      <w:r>
+        <w:rPr>
+          <w:sz w:val="24"/>
+          <w:szCs w:val="22"/>
+          <w:lang w:val="en-US"/>
+        </w:rPr>
+        <w:t>Thread.Sleep</w:t>
+      </w:r>
+      <w:proofErr w:type="spellEnd"/>
+      <w:r>
+        <w:rPr>
+          <w:sz w:val="24"/>
+          <w:szCs w:val="22"/>
+          <w:lang w:val="en-US"/>
+        </w:rPr>
+        <w:t>()</w:t>
       </w:r>
     </w:p>
     <w:p>
@@ -2890,8 +2910,18 @@
           <w:szCs w:val="22"/>
           <w:lang w:val="en-US"/>
         </w:rPr>
-        <w:t>Manual tester uses their Hand-Eye-Brain co-ordanitation</w:t>
-      </w:r>
+        <w:t>Manual tester uses their Hand-Eye-Brain co-</w:t>
+      </w:r>
+      <w:proofErr w:type="spellStart"/>
+      <w:r>
+        <w:rPr>
+          <w:sz w:val="24"/>
+          <w:szCs w:val="22"/>
+          <w:lang w:val="en-US"/>
+        </w:rPr>
+        <w:t>ordanitation</w:t>
+      </w:r>
+      <w:proofErr w:type="spellEnd"/>
     </w:p>
     <w:p>
       <w:pPr>
@@ -3607,8 +3637,18 @@
           <w:szCs w:val="22"/>
           <w:lang w:val="en-US"/>
         </w:rPr>
-        <w:t xml:space="preserve"> – Record and playback mech</w:t>
-      </w:r>
+        <w:t xml:space="preserve"> – Record and playback </w:t>
+      </w:r>
+      <w:proofErr w:type="spellStart"/>
+      <w:r>
+        <w:rPr>
+          <w:sz w:val="24"/>
+          <w:szCs w:val="22"/>
+          <w:lang w:val="en-US"/>
+        </w:rPr>
+        <w:t>mech</w:t>
+      </w:r>
+      <w:proofErr w:type="spellEnd"/>
     </w:p>
     <w:p>
       <w:pPr>
@@ -4031,8 +4071,18 @@
           <w:szCs w:val="22"/>
           <w:lang w:val="en-US"/>
         </w:rPr>
-        <w:t>Idea Intellj</w:t>
-      </w:r>
+        <w:t xml:space="preserve">Idea </w:t>
+      </w:r>
+      <w:proofErr w:type="spellStart"/>
+      <w:r>
+        <w:rPr>
+          <w:sz w:val="24"/>
+          <w:szCs w:val="22"/>
+          <w:lang w:val="en-US"/>
+        </w:rPr>
+        <w:t>Intellj</w:t>
+      </w:r>
+      <w:proofErr w:type="spellEnd"/>
     </w:p>
     <w:p>
       <w:pPr>
@@ -4081,7 +4131,25 @@
           <w:szCs w:val="24"/>
           <w:lang w:val="en-US"/>
         </w:rPr>
-        <w:t>Open selenium.dev website in any browser</w:t>
+        <w:t xml:space="preserve">Open </w:t>
+      </w:r>
+      <w:proofErr w:type="spellStart"/>
+      <w:r>
+        <w:rPr>
+          <w:sz w:val="24"/>
+          <w:szCs w:val="24"/>
+          <w:lang w:val="en-US"/>
+        </w:rPr>
+        <w:t>selenium.dev</w:t>
+      </w:r>
+      <w:proofErr w:type="spellEnd"/>
+      <w:r>
+        <w:rPr>
+          <w:sz w:val="24"/>
+          <w:szCs w:val="24"/>
+          <w:lang w:val="en-US"/>
+        </w:rPr>
+        <w:t xml:space="preserve"> website in any browser</w:t>
       </w:r>
     </w:p>
     <w:p>
@@ -4664,8 +4732,18 @@
           <w:szCs w:val="24"/>
           <w:lang w:val="en-US"/>
         </w:rPr>
-        <w:t>Click on Classpath</w:t>
-      </w:r>
+        <w:t xml:space="preserve">Click on </w:t>
+      </w:r>
+      <w:proofErr w:type="spellStart"/>
+      <w:r>
+        <w:rPr>
+          <w:sz w:val="24"/>
+          <w:szCs w:val="24"/>
+          <w:lang w:val="en-US"/>
+        </w:rPr>
+        <w:t>Classpath</w:t>
+      </w:r>
+      <w:proofErr w:type="spellEnd"/>
     </w:p>
     <w:p>
       <w:pPr>
@@ -4880,13 +4958,23 @@
           <w:lang w:val="en-US"/>
         </w:rPr>
       </w:pPr>
-      <w:r>
-        <w:rPr>
-          <w:sz w:val="24"/>
-          <w:szCs w:val="22"/>
-          <w:lang w:val="en-US"/>
-        </w:rPr>
-        <w:t xml:space="preserve">get() </w:t>
+      <w:proofErr w:type="gramStart"/>
+      <w:r>
+        <w:rPr>
+          <w:sz w:val="24"/>
+          <w:szCs w:val="22"/>
+          <w:lang w:val="en-US"/>
+        </w:rPr>
+        <w:t>get(</w:t>
+      </w:r>
+      <w:proofErr w:type="gramEnd"/>
+      <w:r>
+        <w:rPr>
+          <w:sz w:val="24"/>
+          <w:szCs w:val="22"/>
+          <w:lang w:val="en-US"/>
+        </w:rPr>
+        <w:t xml:space="preserve">) </w:t>
       </w:r>
       <w:r>
         <w:rPr>
@@ -4926,13 +5014,23 @@
           <w:lang w:val="en-US"/>
         </w:rPr>
       </w:pPr>
-      <w:r>
-        <w:rPr>
-          <w:sz w:val="24"/>
-          <w:szCs w:val="22"/>
-          <w:lang w:val="en-US"/>
-        </w:rPr>
-        <w:t xml:space="preserve">close() </w:t>
+      <w:proofErr w:type="gramStart"/>
+      <w:r>
+        <w:rPr>
+          <w:sz w:val="24"/>
+          <w:szCs w:val="22"/>
+          <w:lang w:val="en-US"/>
+        </w:rPr>
+        <w:t>close(</w:t>
+      </w:r>
+      <w:proofErr w:type="gramEnd"/>
+      <w:r>
+        <w:rPr>
+          <w:sz w:val="24"/>
+          <w:szCs w:val="22"/>
+          <w:lang w:val="en-US"/>
+        </w:rPr>
+        <w:t xml:space="preserve">) </w:t>
       </w:r>
       <w:r>
         <w:rPr>
@@ -4980,13 +5078,23 @@
           <w:lang w:val="en-US"/>
         </w:rPr>
       </w:pPr>
-      <w:r>
-        <w:rPr>
-          <w:sz w:val="24"/>
-          <w:szCs w:val="22"/>
-          <w:lang w:val="en-US"/>
-        </w:rPr>
-        <w:t xml:space="preserve">getTitle() </w:t>
+      <w:proofErr w:type="gramStart"/>
+      <w:r>
+        <w:rPr>
+          <w:sz w:val="24"/>
+          <w:szCs w:val="22"/>
+          <w:lang w:val="en-US"/>
+        </w:rPr>
+        <w:t>getTitle(</w:t>
+      </w:r>
+      <w:proofErr w:type="gramEnd"/>
+      <w:r>
+        <w:rPr>
+          <w:sz w:val="24"/>
+          <w:szCs w:val="22"/>
+          <w:lang w:val="en-US"/>
+        </w:rPr>
+        <w:t xml:space="preserve">) </w:t>
       </w:r>
       <w:r>
         <w:rPr>
@@ -5056,13 +5164,23 @@
           <w:lang w:val="en-US"/>
         </w:rPr>
       </w:pPr>
-      <w:r>
-        <w:rPr>
-          <w:sz w:val="24"/>
-          <w:szCs w:val="22"/>
-          <w:lang w:val="en-US"/>
-        </w:rPr>
-        <w:t xml:space="preserve">getPageSource() </w:t>
+      <w:proofErr w:type="gramStart"/>
+      <w:r>
+        <w:rPr>
+          <w:sz w:val="24"/>
+          <w:szCs w:val="22"/>
+          <w:lang w:val="en-US"/>
+        </w:rPr>
+        <w:t>getPageSource(</w:t>
+      </w:r>
+      <w:proofErr w:type="gramEnd"/>
+      <w:r>
+        <w:rPr>
+          <w:sz w:val="24"/>
+          <w:szCs w:val="22"/>
+          <w:lang w:val="en-US"/>
+        </w:rPr>
+        <w:t xml:space="preserve">) </w:t>
       </w:r>
       <w:r>
         <w:rPr>
@@ -5094,13 +5212,23 @@
           <w:lang w:val="en-US"/>
         </w:rPr>
       </w:pPr>
-      <w:r>
-        <w:rPr>
-          <w:sz w:val="24"/>
-          <w:szCs w:val="22"/>
-          <w:lang w:val="en-US"/>
-        </w:rPr>
-        <w:t xml:space="preserve">findElement() </w:t>
+      <w:proofErr w:type="gramStart"/>
+      <w:r>
+        <w:rPr>
+          <w:sz w:val="24"/>
+          <w:szCs w:val="22"/>
+          <w:lang w:val="en-US"/>
+        </w:rPr>
+        <w:t>findElement(</w:t>
+      </w:r>
+      <w:proofErr w:type="gramEnd"/>
+      <w:r>
+        <w:rPr>
+          <w:sz w:val="24"/>
+          <w:szCs w:val="22"/>
+          <w:lang w:val="en-US"/>
+        </w:rPr>
+        <w:t xml:space="preserve">) </w:t>
       </w:r>
       <w:r>
         <w:rPr>
@@ -5183,13 +5311,23 @@
           <w:lang w:val="en-US"/>
         </w:rPr>
       </w:pPr>
-      <w:r>
-        <w:rPr>
-          <w:sz w:val="24"/>
-          <w:szCs w:val="22"/>
-          <w:lang w:val="en-US"/>
-        </w:rPr>
-        <w:t xml:space="preserve">findElements() </w:t>
+      <w:proofErr w:type="gramStart"/>
+      <w:r>
+        <w:rPr>
+          <w:sz w:val="24"/>
+          <w:szCs w:val="22"/>
+          <w:lang w:val="en-US"/>
+        </w:rPr>
+        <w:t>findElements(</w:t>
+      </w:r>
+      <w:proofErr w:type="gramEnd"/>
+      <w:r>
+        <w:rPr>
+          <w:sz w:val="24"/>
+          <w:szCs w:val="22"/>
+          <w:lang w:val="en-US"/>
+        </w:rPr>
+        <w:t xml:space="preserve">) </w:t>
       </w:r>
       <w:r>
         <w:rPr>
@@ -5239,13 +5377,23 @@
           <w:lang w:val="en-US"/>
         </w:rPr>
       </w:pPr>
-      <w:r>
-        <w:rPr>
-          <w:sz w:val="24"/>
-          <w:szCs w:val="22"/>
-          <w:lang w:val="en-US"/>
-        </w:rPr>
-        <w:t xml:space="preserve">getWindowHandles() </w:t>
+      <w:proofErr w:type="gramStart"/>
+      <w:r>
+        <w:rPr>
+          <w:sz w:val="24"/>
+          <w:szCs w:val="22"/>
+          <w:lang w:val="en-US"/>
+        </w:rPr>
+        <w:t>getWindowHandles(</w:t>
+      </w:r>
+      <w:proofErr w:type="gramEnd"/>
+      <w:r>
+        <w:rPr>
+          <w:sz w:val="24"/>
+          <w:szCs w:val="22"/>
+          <w:lang w:val="en-US"/>
+        </w:rPr>
+        <w:t xml:space="preserve">) </w:t>
       </w:r>
       <w:r>
         <w:rPr>
@@ -5277,13 +5425,23 @@
           <w:lang w:val="en-US"/>
         </w:rPr>
       </w:pPr>
-      <w:r>
-        <w:rPr>
-          <w:sz w:val="24"/>
-          <w:szCs w:val="22"/>
-          <w:lang w:val="en-US"/>
-        </w:rPr>
-        <w:t xml:space="preserve">quit() </w:t>
+      <w:proofErr w:type="gramStart"/>
+      <w:r>
+        <w:rPr>
+          <w:sz w:val="24"/>
+          <w:szCs w:val="22"/>
+          <w:lang w:val="en-US"/>
+        </w:rPr>
+        <w:t>quit(</w:t>
+      </w:r>
+      <w:proofErr w:type="gramEnd"/>
+      <w:r>
+        <w:rPr>
+          <w:sz w:val="24"/>
+          <w:szCs w:val="22"/>
+          <w:lang w:val="en-US"/>
+        </w:rPr>
+        <w:t xml:space="preserve">) </w:t>
       </w:r>
       <w:r>
         <w:rPr>
@@ -6137,13 +6295,23 @@
           <w:lang w:val="en-US"/>
         </w:rPr>
       </w:pPr>
-      <w:r>
-        <w:rPr>
-          <w:sz w:val="24"/>
-          <w:szCs w:val="22"/>
-          <w:lang w:val="en-US"/>
-        </w:rPr>
-        <w:t xml:space="preserve">sendKeys() </w:t>
+      <w:proofErr w:type="gramStart"/>
+      <w:r>
+        <w:rPr>
+          <w:sz w:val="24"/>
+          <w:szCs w:val="22"/>
+          <w:lang w:val="en-US"/>
+        </w:rPr>
+        <w:t>sendKeys(</w:t>
+      </w:r>
+      <w:proofErr w:type="gramEnd"/>
+      <w:r>
+        <w:rPr>
+          <w:sz w:val="24"/>
+          <w:szCs w:val="22"/>
+          <w:lang w:val="en-US"/>
+        </w:rPr>
+        <w:t xml:space="preserve">) </w:t>
       </w:r>
       <w:r>
         <w:rPr>
@@ -6183,13 +6351,23 @@
           <w:lang w:val="en-US"/>
         </w:rPr>
       </w:pPr>
-      <w:r>
-        <w:rPr>
-          <w:sz w:val="24"/>
-          <w:szCs w:val="22"/>
-          <w:lang w:val="en-US"/>
-        </w:rPr>
-        <w:t xml:space="preserve">click() </w:t>
+      <w:proofErr w:type="gramStart"/>
+      <w:r>
+        <w:rPr>
+          <w:sz w:val="24"/>
+          <w:szCs w:val="22"/>
+          <w:lang w:val="en-US"/>
+        </w:rPr>
+        <w:t>click(</w:t>
+      </w:r>
+      <w:proofErr w:type="gramEnd"/>
+      <w:r>
+        <w:rPr>
+          <w:sz w:val="24"/>
+          <w:szCs w:val="22"/>
+          <w:lang w:val="en-US"/>
+        </w:rPr>
+        <w:t xml:space="preserve">) </w:t>
       </w:r>
       <w:r>
         <w:rPr>
@@ -6221,13 +6399,23 @@
           <w:lang w:val="en-US"/>
         </w:rPr>
       </w:pPr>
-      <w:r>
-        <w:rPr>
-          <w:sz w:val="24"/>
-          <w:szCs w:val="22"/>
-          <w:lang w:val="en-US"/>
-        </w:rPr>
-        <w:t xml:space="preserve">getText() </w:t>
+      <w:proofErr w:type="gramStart"/>
+      <w:r>
+        <w:rPr>
+          <w:sz w:val="24"/>
+          <w:szCs w:val="22"/>
+          <w:lang w:val="en-US"/>
+        </w:rPr>
+        <w:t>getText(</w:t>
+      </w:r>
+      <w:proofErr w:type="gramEnd"/>
+      <w:r>
+        <w:rPr>
+          <w:sz w:val="24"/>
+          <w:szCs w:val="22"/>
+          <w:lang w:val="en-US"/>
+        </w:rPr>
+        <w:t xml:space="preserve">) </w:t>
       </w:r>
       <w:r>
         <w:rPr>
@@ -6267,13 +6455,23 @@
           <w:lang w:val="en-US"/>
         </w:rPr>
       </w:pPr>
-      <w:r>
-        <w:rPr>
-          <w:sz w:val="24"/>
-          <w:szCs w:val="22"/>
-          <w:lang w:val="en-US"/>
-        </w:rPr>
-        <w:t xml:space="preserve">isSelected() </w:t>
+      <w:proofErr w:type="gramStart"/>
+      <w:r>
+        <w:rPr>
+          <w:sz w:val="24"/>
+          <w:szCs w:val="22"/>
+          <w:lang w:val="en-US"/>
+        </w:rPr>
+        <w:t>isSelected(</w:t>
+      </w:r>
+      <w:proofErr w:type="gramEnd"/>
+      <w:r>
+        <w:rPr>
+          <w:sz w:val="24"/>
+          <w:szCs w:val="22"/>
+          <w:lang w:val="en-US"/>
+        </w:rPr>
+        <w:t xml:space="preserve">) </w:t>
       </w:r>
       <w:r>
         <w:rPr>
@@ -6305,13 +6503,23 @@
           <w:lang w:val="en-US"/>
         </w:rPr>
       </w:pPr>
-      <w:r>
-        <w:rPr>
-          <w:sz w:val="24"/>
-          <w:szCs w:val="22"/>
-          <w:lang w:val="en-US"/>
-        </w:rPr>
-        <w:t xml:space="preserve">isEnabled() </w:t>
+      <w:proofErr w:type="gramStart"/>
+      <w:r>
+        <w:rPr>
+          <w:sz w:val="24"/>
+          <w:szCs w:val="22"/>
+          <w:lang w:val="en-US"/>
+        </w:rPr>
+        <w:t>isEnabled(</w:t>
+      </w:r>
+      <w:proofErr w:type="gramEnd"/>
+      <w:r>
+        <w:rPr>
+          <w:sz w:val="24"/>
+          <w:szCs w:val="22"/>
+          <w:lang w:val="en-US"/>
+        </w:rPr>
+        <w:t xml:space="preserve">) </w:t>
       </w:r>
       <w:r>
         <w:rPr>
@@ -6343,13 +6551,23 @@
           <w:lang w:val="en-US"/>
         </w:rPr>
       </w:pPr>
-      <w:r>
-        <w:rPr>
-          <w:sz w:val="24"/>
-          <w:szCs w:val="22"/>
-          <w:lang w:val="en-US"/>
-        </w:rPr>
-        <w:t xml:space="preserve">isDisplayed() </w:t>
+      <w:proofErr w:type="gramStart"/>
+      <w:r>
+        <w:rPr>
+          <w:sz w:val="24"/>
+          <w:szCs w:val="22"/>
+          <w:lang w:val="en-US"/>
+        </w:rPr>
+        <w:t>isDisplayed(</w:t>
+      </w:r>
+      <w:proofErr w:type="gramEnd"/>
+      <w:r>
+        <w:rPr>
+          <w:sz w:val="24"/>
+          <w:szCs w:val="22"/>
+          <w:lang w:val="en-US"/>
+        </w:rPr>
+        <w:t xml:space="preserve">) </w:t>
       </w:r>
       <w:r>
         <w:rPr>
@@ -6381,13 +6599,23 @@
           <w:lang w:val="en-US"/>
         </w:rPr>
       </w:pPr>
-      <w:r>
-        <w:rPr>
-          <w:sz w:val="24"/>
-          <w:szCs w:val="22"/>
-          <w:lang w:val="en-US"/>
-        </w:rPr>
-        <w:t xml:space="preserve">getAttribute() </w:t>
+      <w:proofErr w:type="gramStart"/>
+      <w:r>
+        <w:rPr>
+          <w:sz w:val="24"/>
+          <w:szCs w:val="22"/>
+          <w:lang w:val="en-US"/>
+        </w:rPr>
+        <w:t>getAttribute(</w:t>
+      </w:r>
+      <w:proofErr w:type="gramEnd"/>
+      <w:r>
+        <w:rPr>
+          <w:sz w:val="24"/>
+          <w:szCs w:val="22"/>
+          <w:lang w:val="en-US"/>
+        </w:rPr>
+        <w:t xml:space="preserve">) </w:t>
       </w:r>
       <w:r>
         <w:rPr>
@@ -6538,7 +6766,29 @@
           <w:szCs w:val="22"/>
           <w:lang w:val="en-US"/>
         </w:rPr>
-        <w:t>input[data-testid="royal-email"]</w:t>
+        <w:t>input[data-</w:t>
+      </w:r>
+      <w:proofErr w:type="spellStart"/>
+      <w:r>
+        <w:rPr>
+          <w:b/>
+          <w:bCs/>
+          <w:sz w:val="24"/>
+          <w:szCs w:val="22"/>
+          <w:lang w:val="en-US"/>
+        </w:rPr>
+        <w:t>testid</w:t>
+      </w:r>
+      <w:proofErr w:type="spellEnd"/>
+      <w:r>
+        <w:rPr>
+          <w:b/>
+          <w:bCs/>
+          <w:sz w:val="24"/>
+          <w:szCs w:val="22"/>
+          <w:lang w:val="en-US"/>
+        </w:rPr>
+        <w:t>="royal-email"]</w:t>
       </w:r>
     </w:p>
     <w:p>
@@ -6800,13 +7050,23 @@
           <w:lang w:val="en-US"/>
         </w:rPr>
       </w:pPr>
-      <w:r>
-        <w:rPr>
-          <w:sz w:val="24"/>
-          <w:szCs w:val="22"/>
-          <w:lang w:val="en-US"/>
-        </w:rPr>
-        <w:t xml:space="preserve">Swargate </w:t>
+      <w:proofErr w:type="spellStart"/>
+      <w:r>
+        <w:rPr>
+          <w:sz w:val="24"/>
+          <w:szCs w:val="22"/>
+          <w:lang w:val="en-US"/>
+        </w:rPr>
+        <w:t>Swargate</w:t>
+      </w:r>
+      <w:proofErr w:type="spellEnd"/>
+      <w:r>
+        <w:rPr>
+          <w:sz w:val="24"/>
+          <w:szCs w:val="22"/>
+          <w:lang w:val="en-US"/>
+        </w:rPr>
+        <w:t xml:space="preserve"> </w:t>
       </w:r>
       <w:r>
         <w:rPr>
@@ -6830,7 +7090,25 @@
           <w:szCs w:val="22"/>
           <w:lang w:val="en-US"/>
         </w:rPr>
-        <w:t xml:space="preserve"> Kothrud </w:t>
+        <w:t xml:space="preserve"> </w:t>
+      </w:r>
+      <w:proofErr w:type="spellStart"/>
+      <w:r>
+        <w:rPr>
+          <w:sz w:val="24"/>
+          <w:szCs w:val="22"/>
+          <w:lang w:val="en-US"/>
+        </w:rPr>
+        <w:t>Kothrud</w:t>
+      </w:r>
+      <w:proofErr w:type="spellEnd"/>
+      <w:r>
+        <w:rPr>
+          <w:sz w:val="24"/>
+          <w:szCs w:val="22"/>
+          <w:lang w:val="en-US"/>
+        </w:rPr>
+        <w:t xml:space="preserve"> </w:t>
       </w:r>
       <w:r>
         <w:rPr>
@@ -6846,7 +7124,25 @@
           <w:szCs w:val="22"/>
           <w:lang w:val="en-US"/>
         </w:rPr>
-        <w:t xml:space="preserve"> Kothrud Demo </w:t>
+        <w:t xml:space="preserve"> </w:t>
+      </w:r>
+      <w:proofErr w:type="spellStart"/>
+      <w:r>
+        <w:rPr>
+          <w:sz w:val="24"/>
+          <w:szCs w:val="22"/>
+          <w:lang w:val="en-US"/>
+        </w:rPr>
+        <w:t>Kothrud</w:t>
+      </w:r>
+      <w:proofErr w:type="spellEnd"/>
+      <w:r>
+        <w:rPr>
+          <w:sz w:val="24"/>
+          <w:szCs w:val="22"/>
+          <w:lang w:val="en-US"/>
+        </w:rPr>
+        <w:t xml:space="preserve"> Demo </w:t>
       </w:r>
       <w:r>
         <w:rPr>
@@ -6862,7 +7158,61 @@
           <w:szCs w:val="22"/>
           <w:lang w:val="en-US"/>
         </w:rPr>
-        <w:t xml:space="preserve"> Shubheccha Managal Karyalay </w:t>
+        <w:t xml:space="preserve"> </w:t>
+      </w:r>
+      <w:proofErr w:type="spellStart"/>
+      <w:r>
+        <w:rPr>
+          <w:sz w:val="24"/>
+          <w:szCs w:val="22"/>
+          <w:lang w:val="en-US"/>
+        </w:rPr>
+        <w:t>Shubheccha</w:t>
+      </w:r>
+      <w:proofErr w:type="spellEnd"/>
+      <w:r>
+        <w:rPr>
+          <w:sz w:val="24"/>
+          <w:szCs w:val="22"/>
+          <w:lang w:val="en-US"/>
+        </w:rPr>
+        <w:t xml:space="preserve"> </w:t>
+      </w:r>
+      <w:proofErr w:type="spellStart"/>
+      <w:r>
+        <w:rPr>
+          <w:sz w:val="24"/>
+          <w:szCs w:val="22"/>
+          <w:lang w:val="en-US"/>
+        </w:rPr>
+        <w:t>Managal</w:t>
+      </w:r>
+      <w:proofErr w:type="spellEnd"/>
+      <w:r>
+        <w:rPr>
+          <w:sz w:val="24"/>
+          <w:szCs w:val="22"/>
+          <w:lang w:val="en-US"/>
+        </w:rPr>
+        <w:t xml:space="preserve"> </w:t>
+      </w:r>
+      <w:proofErr w:type="spellStart"/>
+      <w:r>
+        <w:rPr>
+          <w:sz w:val="24"/>
+          <w:szCs w:val="22"/>
+          <w:lang w:val="en-US"/>
+        </w:rPr>
+        <w:t>Karyalay</w:t>
+      </w:r>
+      <w:proofErr w:type="spellEnd"/>
+      <w:r>
+        <w:rPr>
+          <w:sz w:val="24"/>
+          <w:szCs w:val="22"/>
+          <w:lang w:val="en-US"/>
+        </w:rPr>
+        <w:t xml:space="preserve"> </w:t>
       </w:r>
       <w:r>
         <w:rPr>
@@ -6878,7 +7228,25 @@
           <w:szCs w:val="22"/>
           <w:lang w:val="en-US"/>
         </w:rPr>
-        <w:t xml:space="preserve"> Viom Building </w:t>
+        <w:t xml:space="preserve"> </w:t>
+      </w:r>
+      <w:proofErr w:type="spellStart"/>
+      <w:r>
+        <w:rPr>
+          <w:sz w:val="24"/>
+          <w:szCs w:val="22"/>
+          <w:lang w:val="en-US"/>
+        </w:rPr>
+        <w:t>Viom</w:t>
+      </w:r>
+      <w:proofErr w:type="spellEnd"/>
+      <w:r>
+        <w:rPr>
+          <w:sz w:val="24"/>
+          <w:szCs w:val="22"/>
+          <w:lang w:val="en-US"/>
+        </w:rPr>
+        <w:t xml:space="preserve"> Building </w:t>
       </w:r>
       <w:r>
         <w:rPr>
@@ -7090,7 +7458,25 @@
           <w:szCs w:val="22"/>
           <w:lang w:val="en-US"/>
         </w:rPr>
-        <w:t xml:space="preserve">Selenium has provided special class to handle this control ie. </w:t>
+        <w:t xml:space="preserve">Selenium has provided special class to handle this control </w:t>
+      </w:r>
+      <w:proofErr w:type="spellStart"/>
+      <w:r>
+        <w:rPr>
+          <w:sz w:val="24"/>
+          <w:szCs w:val="22"/>
+          <w:lang w:val="en-US"/>
+        </w:rPr>
+        <w:t>ie</w:t>
+      </w:r>
+      <w:proofErr w:type="spellEnd"/>
+      <w:r>
+        <w:rPr>
+          <w:sz w:val="24"/>
+          <w:szCs w:val="22"/>
+          <w:lang w:val="en-US"/>
+        </w:rPr>
+        <w:t xml:space="preserve">. </w:t>
       </w:r>
       <w:r>
         <w:rPr>
@@ -7141,13 +7527,23 @@
           <w:lang w:val="en-US"/>
         </w:rPr>
       </w:pPr>
-      <w:r>
-        <w:rPr>
-          <w:sz w:val="24"/>
-          <w:szCs w:val="22"/>
-          <w:lang w:val="en-US"/>
-        </w:rPr>
-        <w:t xml:space="preserve">getFirstSelectedOption() </w:t>
+      <w:proofErr w:type="gramStart"/>
+      <w:r>
+        <w:rPr>
+          <w:sz w:val="24"/>
+          <w:szCs w:val="22"/>
+          <w:lang w:val="en-US"/>
+        </w:rPr>
+        <w:t>getFirstSelectedOption(</w:t>
+      </w:r>
+      <w:proofErr w:type="gramEnd"/>
+      <w:r>
+        <w:rPr>
+          <w:sz w:val="24"/>
+          <w:szCs w:val="22"/>
+          <w:lang w:val="en-US"/>
+        </w:rPr>
+        <w:t xml:space="preserve">) </w:t>
       </w:r>
       <w:r>
         <w:rPr>
@@ -7187,6 +7583,7 @@
           <w:lang w:val="en-US"/>
         </w:rPr>
       </w:pPr>
+      <w:proofErr w:type="gramStart"/>
       <w:r>
         <w:rPr>
           <w:sz w:val="24"/>
@@ -7194,7 +7591,16 @@
           <w:lang w:val="en-US"/>
         </w:rPr>
         <w:lastRenderedPageBreak/>
-        <w:t xml:space="preserve">getOptions() </w:t>
+        <w:t>getOptions(</w:t>
+      </w:r>
+      <w:proofErr w:type="gramEnd"/>
+      <w:r>
+        <w:rPr>
+          <w:sz w:val="24"/>
+          <w:szCs w:val="22"/>
+          <w:lang w:val="en-US"/>
+        </w:rPr>
+        <w:t xml:space="preserve">) </w:t>
       </w:r>
       <w:r>
         <w:rPr>
@@ -7360,13 +7766,23 @@
           <w:lang w:val="en-US"/>
         </w:rPr>
       </w:pPr>
-      <w:r>
-        <w:rPr>
-          <w:sz w:val="24"/>
-          <w:szCs w:val="22"/>
-          <w:lang w:val="en-US"/>
-        </w:rPr>
-        <w:t xml:space="preserve">isMultiple() </w:t>
+      <w:proofErr w:type="gramStart"/>
+      <w:r>
+        <w:rPr>
+          <w:sz w:val="24"/>
+          <w:szCs w:val="22"/>
+          <w:lang w:val="en-US"/>
+        </w:rPr>
+        <w:t>isMultiple(</w:t>
+      </w:r>
+      <w:proofErr w:type="gramEnd"/>
+      <w:r>
+        <w:rPr>
+          <w:sz w:val="24"/>
+          <w:szCs w:val="22"/>
+          <w:lang w:val="en-US"/>
+        </w:rPr>
+        <w:t xml:space="preserve">) </w:t>
       </w:r>
       <w:r>
         <w:rPr>
@@ -7467,13 +7883,33 @@
           <w:lang w:val="en-US"/>
         </w:rPr>
       </w:pPr>
-      <w:r>
-        <w:rPr>
-          <w:sz w:val="24"/>
-          <w:szCs w:val="22"/>
-          <w:lang w:val="en-US"/>
-        </w:rPr>
-        <w:t>Thread.Sleep()</w:t>
+      <w:proofErr w:type="spellStart"/>
+      <w:proofErr w:type="gramStart"/>
+      <w:r>
+        <w:rPr>
+          <w:sz w:val="24"/>
+          <w:szCs w:val="22"/>
+          <w:lang w:val="en-US"/>
+        </w:rPr>
+        <w:t>Thread.Sleep</w:t>
+      </w:r>
+      <w:proofErr w:type="spellEnd"/>
+      <w:r>
+        <w:rPr>
+          <w:sz w:val="24"/>
+          <w:szCs w:val="22"/>
+          <w:lang w:val="en-US"/>
+        </w:rPr>
+        <w:t>(</w:t>
+      </w:r>
+      <w:proofErr w:type="gramEnd"/>
+      <w:r>
+        <w:rPr>
+          <w:sz w:val="24"/>
+          <w:szCs w:val="22"/>
+          <w:lang w:val="en-US"/>
+        </w:rPr>
+        <w:t>)</w:t>
       </w:r>
       <w:r>
         <w:rPr>
@@ -7855,7 +8291,24 @@
           <w:lang w:val="en-US"/>
         </w:rPr>
         <w:br/>
-        <w:t xml:space="preserve">i – ignoring </w:t>
+      </w:r>
+      <w:proofErr w:type="spellStart"/>
+      <w:r>
+        <w:rPr>
+          <w:sz w:val="24"/>
+          <w:szCs w:val="22"/>
+          <w:lang w:val="en-US"/>
+        </w:rPr>
+        <w:t>i</w:t>
+      </w:r>
+      <w:proofErr w:type="spellEnd"/>
+      <w:r>
+        <w:rPr>
+          <w:sz w:val="24"/>
+          <w:szCs w:val="22"/>
+          <w:lang w:val="en-US"/>
+        </w:rPr>
+        <w:t xml:space="preserve"> – ignoring </w:t>
       </w:r>
       <w:r>
         <w:rPr>
@@ -8121,7 +8574,25 @@
           <w:szCs w:val="22"/>
           <w:lang w:val="en-US"/>
         </w:rPr>
-        <w:t>Alerts (Javascript Alert) are</w:t>
+        <w:t>Alerts (</w:t>
+      </w:r>
+      <w:proofErr w:type="spellStart"/>
+      <w:r>
+        <w:rPr>
+          <w:sz w:val="24"/>
+          <w:szCs w:val="22"/>
+          <w:lang w:val="en-US"/>
+        </w:rPr>
+        <w:t>Javascript</w:t>
+      </w:r>
+      <w:proofErr w:type="spellEnd"/>
+      <w:r>
+        <w:rPr>
+          <w:sz w:val="24"/>
+          <w:szCs w:val="22"/>
+          <w:lang w:val="en-US"/>
+        </w:rPr>
+        <w:t xml:space="preserve"> Alert) are</w:t>
       </w:r>
     </w:p>
     <w:p>
@@ -8255,13 +8726,33 @@
           <w:lang w:val="en-US"/>
         </w:rPr>
       </w:pPr>
-      <w:r>
-        <w:rPr>
-          <w:sz w:val="24"/>
-          <w:szCs w:val="22"/>
-          <w:lang w:val="en-US"/>
-        </w:rPr>
-        <w:t xml:space="preserve">driver.switchTo().alert() </w:t>
+      <w:proofErr w:type="spellStart"/>
+      <w:proofErr w:type="gramStart"/>
+      <w:r>
+        <w:rPr>
+          <w:sz w:val="24"/>
+          <w:szCs w:val="22"/>
+          <w:lang w:val="en-US"/>
+        </w:rPr>
+        <w:t>driver.switchTo</w:t>
+      </w:r>
+      <w:proofErr w:type="spellEnd"/>
+      <w:r>
+        <w:rPr>
+          <w:sz w:val="24"/>
+          <w:szCs w:val="22"/>
+          <w:lang w:val="en-US"/>
+        </w:rPr>
+        <w:t>(</w:t>
+      </w:r>
+      <w:proofErr w:type="gramEnd"/>
+      <w:r>
+        <w:rPr>
+          <w:sz w:val="24"/>
+          <w:szCs w:val="22"/>
+          <w:lang w:val="en-US"/>
+        </w:rPr>
+        <w:t xml:space="preserve">).alert() </w:t>
       </w:r>
       <w:r>
         <w:rPr>
@@ -8331,13 +8822,23 @@
           <w:lang w:val="en-US"/>
         </w:rPr>
       </w:pPr>
-      <w:r>
-        <w:rPr>
-          <w:sz w:val="24"/>
-          <w:szCs w:val="22"/>
-          <w:lang w:val="en-US"/>
-        </w:rPr>
-        <w:t xml:space="preserve">accept() </w:t>
+      <w:proofErr w:type="gramStart"/>
+      <w:r>
+        <w:rPr>
+          <w:sz w:val="24"/>
+          <w:szCs w:val="22"/>
+          <w:lang w:val="en-US"/>
+        </w:rPr>
+        <w:t>accept(</w:t>
+      </w:r>
+      <w:proofErr w:type="gramEnd"/>
+      <w:r>
+        <w:rPr>
+          <w:sz w:val="24"/>
+          <w:szCs w:val="22"/>
+          <w:lang w:val="en-US"/>
+        </w:rPr>
+        <w:t xml:space="preserve">) </w:t>
       </w:r>
       <w:r>
         <w:rPr>
@@ -8599,13 +9100,23 @@
           <w:lang w:val="en-US"/>
         </w:rPr>
       </w:pPr>
-      <w:r>
-        <w:rPr>
-          <w:sz w:val="24"/>
-          <w:szCs w:val="22"/>
-          <w:lang w:val="en-US"/>
-        </w:rPr>
-        <w:t xml:space="preserve">moveToElement() </w:t>
+      <w:proofErr w:type="gramStart"/>
+      <w:r>
+        <w:rPr>
+          <w:sz w:val="24"/>
+          <w:szCs w:val="22"/>
+          <w:lang w:val="en-US"/>
+        </w:rPr>
+        <w:t>moveToElement(</w:t>
+      </w:r>
+      <w:proofErr w:type="gramEnd"/>
+      <w:r>
+        <w:rPr>
+          <w:sz w:val="24"/>
+          <w:szCs w:val="22"/>
+          <w:lang w:val="en-US"/>
+        </w:rPr>
+        <w:t xml:space="preserve">) </w:t>
       </w:r>
       <w:r>
         <w:rPr>
@@ -8637,13 +9148,23 @@
           <w:lang w:val="en-US"/>
         </w:rPr>
       </w:pPr>
-      <w:r>
-        <w:rPr>
-          <w:sz w:val="24"/>
-          <w:szCs w:val="22"/>
-          <w:lang w:val="en-US"/>
-        </w:rPr>
-        <w:t xml:space="preserve">perform() </w:t>
+      <w:proofErr w:type="gramStart"/>
+      <w:r>
+        <w:rPr>
+          <w:sz w:val="24"/>
+          <w:szCs w:val="22"/>
+          <w:lang w:val="en-US"/>
+        </w:rPr>
+        <w:t>perform(</w:t>
+      </w:r>
+      <w:proofErr w:type="gramEnd"/>
+      <w:r>
+        <w:rPr>
+          <w:sz w:val="24"/>
+          <w:szCs w:val="22"/>
+          <w:lang w:val="en-US"/>
+        </w:rPr>
+        <w:t xml:space="preserve">) </w:t>
       </w:r>
       <w:r>
         <w:rPr>
@@ -8675,13 +9196,23 @@
           <w:lang w:val="en-US"/>
         </w:rPr>
       </w:pPr>
-      <w:r>
-        <w:rPr>
-          <w:sz w:val="24"/>
-          <w:szCs w:val="22"/>
-          <w:lang w:val="en-US"/>
-        </w:rPr>
-        <w:t xml:space="preserve">contextClick() </w:t>
+      <w:proofErr w:type="gramStart"/>
+      <w:r>
+        <w:rPr>
+          <w:sz w:val="24"/>
+          <w:szCs w:val="22"/>
+          <w:lang w:val="en-US"/>
+        </w:rPr>
+        <w:t>contextClick(</w:t>
+      </w:r>
+      <w:proofErr w:type="gramEnd"/>
+      <w:r>
+        <w:rPr>
+          <w:sz w:val="24"/>
+          <w:szCs w:val="22"/>
+          <w:lang w:val="en-US"/>
+        </w:rPr>
+        <w:t xml:space="preserve">) </w:t>
       </w:r>
       <w:r>
         <w:rPr>
@@ -8713,13 +9244,23 @@
           <w:lang w:val="en-US"/>
         </w:rPr>
       </w:pPr>
-      <w:r>
-        <w:rPr>
-          <w:sz w:val="24"/>
-          <w:szCs w:val="22"/>
-          <w:lang w:val="en-US"/>
-        </w:rPr>
-        <w:t xml:space="preserve">doubleClick() </w:t>
+      <w:proofErr w:type="gramStart"/>
+      <w:r>
+        <w:rPr>
+          <w:sz w:val="24"/>
+          <w:szCs w:val="22"/>
+          <w:lang w:val="en-US"/>
+        </w:rPr>
+        <w:t>doubleClick(</w:t>
+      </w:r>
+      <w:proofErr w:type="gramEnd"/>
+      <w:r>
+        <w:rPr>
+          <w:sz w:val="24"/>
+          <w:szCs w:val="22"/>
+          <w:lang w:val="en-US"/>
+        </w:rPr>
+        <w:t xml:space="preserve">) </w:t>
       </w:r>
       <w:r>
         <w:rPr>
@@ -10312,26 +10853,175 @@
         </w:rPr>
         <w:t xml:space="preserve"> (All tags needs to be written in small case)</w:t>
       </w:r>
+    </w:p>
+    <w:p>
+      <w:pPr>
+        <w:rPr>
+          <w:sz w:val="24"/>
+          <w:szCs w:val="22"/>
+          <w:lang w:val="en-US"/>
+        </w:rPr>
+      </w:pPr>
+    </w:p>
+    <w:p>
+      <w:pPr>
+        <w:rPr>
+          <w:sz w:val="24"/>
+          <w:szCs w:val="22"/>
+          <w:lang w:val="en-US"/>
+        </w:rPr>
+      </w:pPr>
+      <w:r>
+        <w:rPr>
+          <w:sz w:val="24"/>
+          <w:szCs w:val="22"/>
+          <w:lang w:val="en-US"/>
+        </w:rPr>
+        <w:br w:type="page"/>
+      </w:r>
+    </w:p>
+    <w:p>
+      <w:pPr>
+        <w:rPr>
+          <w:sz w:val="24"/>
+          <w:szCs w:val="22"/>
+          <w:lang w:val="en-US"/>
+        </w:rPr>
+      </w:pPr>
+      <w:r>
+        <w:rPr>
+          <w:sz w:val="24"/>
+          <w:szCs w:val="22"/>
+          <w:lang w:val="en-US"/>
+        </w:rPr>
+        <w:lastRenderedPageBreak/>
+        <w:t>Data Driven Framework</w:t>
+      </w:r>
+    </w:p>
+    <w:p>
+      <w:pPr>
+        <w:rPr>
+          <w:sz w:val="24"/>
+          <w:szCs w:val="22"/>
+          <w:lang w:val="en-US"/>
+        </w:rPr>
+      </w:pPr>
+      <w:r>
+        <w:rPr>
+          <w:noProof/>
+          <w:lang w:eastAsia="en-IN"/>
+        </w:rPr>
+        <w:drawing>
+          <wp:inline distT="0" distB="0" distL="0" distR="0" wp14:anchorId="46225D1E" wp14:editId="539C1FB8">
+            <wp:extent cx="3800475" cy="2095500"/>
+            <wp:effectExtent l="0" t="0" r="9525" b="0"/>
+            <wp:docPr id="3" name="Picture 3"/>
+            <wp:cNvGraphicFramePr>
+              <a:graphicFrameLocks xmlns:a="http://schemas.openxmlformats.org/drawingml/2006/main" noChangeAspect="1"/>
+            </wp:cNvGraphicFramePr>
+            <a:graphic xmlns:a="http://schemas.openxmlformats.org/drawingml/2006/main">
+              <a:graphicData uri="http://schemas.openxmlformats.org/drawingml/2006/picture">
+                <pic:pic xmlns:pic="http://schemas.openxmlformats.org/drawingml/2006/picture">
+                  <pic:nvPicPr>
+                    <pic:cNvPr id="1" name=""/>
+                    <pic:cNvPicPr/>
+                  </pic:nvPicPr>
+                  <pic:blipFill rotWithShape="1">
+                    <a:blip r:embed="rId12"/>
+                    <a:srcRect l="24762" t="23054" r="8930" b="11921"/>
+                    <a:stretch/>
+                  </pic:blipFill>
+                  <pic:spPr bwMode="auto">
+                    <a:xfrm>
+                      <a:off x="0" y="0"/>
+                      <a:ext cx="3800475" cy="2095500"/>
+                    </a:xfrm>
+                    <a:prstGeom prst="rect">
+                      <a:avLst/>
+                    </a:prstGeom>
+                    <a:ln>
+                      <a:noFill/>
+                    </a:ln>
+                    <a:extLst>
+                      <a:ext uri="{53640926-AAD7-44D8-BBD7-CCE9431645EC}">
+                        <a14:shadowObscured xmlns:a14="http://schemas.microsoft.com/office/drawing/2010/main"/>
+                      </a:ext>
+                    </a:extLst>
+                  </pic:spPr>
+                </pic:pic>
+              </a:graphicData>
+            </a:graphic>
+          </wp:inline>
+        </w:drawing>
+      </w:r>
+    </w:p>
+    <w:p>
+      <w:pPr>
+        <w:rPr>
+          <w:sz w:val="24"/>
+          <w:szCs w:val="22"/>
+          <w:lang w:val="en-US"/>
+        </w:rPr>
+      </w:pPr>
+    </w:p>
+    <w:p>
+      <w:pPr>
+        <w:rPr>
+          <w:sz w:val="24"/>
+          <w:szCs w:val="22"/>
+          <w:lang w:val="en-US"/>
+        </w:rPr>
+      </w:pPr>
+      <w:r>
+        <w:rPr>
+          <w:noProof/>
+          <w:lang w:eastAsia="en-IN"/>
+        </w:rPr>
+        <w:drawing>
+          <wp:inline distT="0" distB="0" distL="0" distR="0" wp14:anchorId="44EC12D8" wp14:editId="7435A1F1">
+            <wp:extent cx="3552825" cy="1924050"/>
+            <wp:effectExtent l="0" t="0" r="9525" b="0"/>
+            <wp:docPr id="4" name="Picture 4"/>
+            <wp:cNvGraphicFramePr>
+              <a:graphicFrameLocks xmlns:a="http://schemas.openxmlformats.org/drawingml/2006/main" noChangeAspect="1"/>
+            </wp:cNvGraphicFramePr>
+            <a:graphic xmlns:a="http://schemas.openxmlformats.org/drawingml/2006/main">
+              <a:graphicData uri="http://schemas.openxmlformats.org/drawingml/2006/picture">
+                <pic:pic xmlns:pic="http://schemas.openxmlformats.org/drawingml/2006/picture">
+                  <pic:nvPicPr>
+                    <pic:cNvPr id="1" name=""/>
+                    <pic:cNvPicPr/>
+                  </pic:nvPicPr>
+                  <pic:blipFill rotWithShape="1">
+                    <a:blip r:embed="rId13"/>
+                    <a:srcRect l="27752" t="22758" r="10259" b="17537"/>
+                    <a:stretch/>
+                  </pic:blipFill>
+                  <pic:spPr bwMode="auto">
+                    <a:xfrm>
+                      <a:off x="0" y="0"/>
+                      <a:ext cx="3552825" cy="1924050"/>
+                    </a:xfrm>
+                    <a:prstGeom prst="rect">
+                      <a:avLst/>
+                    </a:prstGeom>
+                    <a:ln>
+                      <a:noFill/>
+                    </a:ln>
+                    <a:extLst>
+                      <a:ext uri="{53640926-AAD7-44D8-BBD7-CCE9431645EC}">
+                        <a14:shadowObscured xmlns:a14="http://schemas.microsoft.com/office/drawing/2010/main"/>
+                      </a:ext>
+                    </a:extLst>
+                  </pic:spPr>
+                </pic:pic>
+              </a:graphicData>
+            </a:graphic>
+          </wp:inline>
+        </w:drawing>
+      </w:r>
       <w:bookmarkStart w:id="0" w:name="_GoBack"/>
       <w:bookmarkEnd w:id="0"/>
-    </w:p>
-    <w:p>
-      <w:pPr>
-        <w:rPr>
-          <w:sz w:val="24"/>
-          <w:szCs w:val="22"/>
-          <w:lang w:val="en-US"/>
-        </w:rPr>
-      </w:pPr>
-    </w:p>
-    <w:p>
-      <w:pPr>
-        <w:rPr>
-          <w:sz w:val="24"/>
-          <w:szCs w:val="22"/>
-          <w:lang w:val="en-US"/>
-        </w:rPr>
-      </w:pPr>
     </w:p>
     <w:sectPr>
       <w:pgSz w:w="11906" w:h="16838"/>
@@ -15219,22 +15909,22 @@
     </dgm:pt>
   </dgm:ptLst>
   <dgm:cxnLst>
-    <dgm:cxn modelId="{6EB35C6B-B3A3-4CFA-91DF-BAB1C22335A1}" type="presOf" srcId="{7C35FEF7-DC0D-43AE-8BE3-2149FB2A04A2}" destId="{CBCE1630-5EA0-49CF-B64F-8E2E518136D4}" srcOrd="0" destOrd="0" presId="urn:microsoft.com/office/officeart/2005/8/layout/chevron1"/>
-    <dgm:cxn modelId="{6A907DD5-2CE7-415A-AABA-F6F63343A2C0}" type="presOf" srcId="{E4F40C07-A169-42D7-9A7C-EC1908A68E5F}" destId="{73B709FB-7B30-472B-AD65-EC980FF821F6}" srcOrd="0" destOrd="0" presId="urn:microsoft.com/office/officeart/2005/8/layout/chevron1"/>
-    <dgm:cxn modelId="{2E97E40F-E44E-4E18-A17B-80B520D1376D}" type="presOf" srcId="{518BBF31-5473-4647-89A8-1F7190FDD7CC}" destId="{5F46AD52-443D-445C-A0DE-55C3F3A14D43}" srcOrd="0" destOrd="0" presId="urn:microsoft.com/office/officeart/2005/8/layout/chevron1"/>
-    <dgm:cxn modelId="{B6E549AA-99FE-42D6-AC81-F5876D20206A}" type="presOf" srcId="{12905BA0-FFBC-4F6F-A638-860052C3C22E}" destId="{7DC38E28-F114-44F6-A466-CCCEAA6E3A2B}" srcOrd="0" destOrd="0" presId="urn:microsoft.com/office/officeart/2005/8/layout/chevron1"/>
+    <dgm:cxn modelId="{E2A6A5E9-A2D0-4BF2-AF8E-ACB6C085CA8C}" srcId="{E4F40C07-A169-42D7-9A7C-EC1908A68E5F}" destId="{7C35FEF7-DC0D-43AE-8BE3-2149FB2A04A2}" srcOrd="2" destOrd="0" parTransId="{F35C3024-56BC-477B-B2DD-7628EC4D0598}" sibTransId="{5E9DDC1B-8E20-45BD-B2C4-DE21EC41E73E}"/>
+    <dgm:cxn modelId="{3C1C0D14-6DF2-4652-9E4E-340880213B41}" srcId="{E4F40C07-A169-42D7-9A7C-EC1908A68E5F}" destId="{12905BA0-FFBC-4F6F-A638-860052C3C22E}" srcOrd="3" destOrd="0" parTransId="{51C23596-DA0B-4497-9E19-6A9465F512F2}" sibTransId="{B30D78C5-2EE3-4FC4-ADE9-34EAB867FD7E}"/>
+    <dgm:cxn modelId="{FBE79D26-2316-4364-8F3B-5098C5BA0A92}" srcId="{E4F40C07-A169-42D7-9A7C-EC1908A68E5F}" destId="{518BBF31-5473-4647-89A8-1F7190FDD7CC}" srcOrd="1" destOrd="0" parTransId="{51A8C620-C424-463F-9BEF-6A08563C7A06}" sibTransId="{017B1192-391E-4A65-81D1-6D7C5AF2AA1D}"/>
+    <dgm:cxn modelId="{15A50B50-F5D1-4481-AC37-812422ADACED}" type="presOf" srcId="{C10563B1-D17B-4828-B40F-E64A77D38593}" destId="{4D560F50-8F16-4794-86B3-C3D8DE2F9386}" srcOrd="0" destOrd="0" presId="urn:microsoft.com/office/officeart/2005/8/layout/chevron1"/>
+    <dgm:cxn modelId="{06CF3F45-80C6-456F-AD8B-09FEA6D4FBE0}" type="presOf" srcId="{12905BA0-FFBC-4F6F-A638-860052C3C22E}" destId="{7DC38E28-F114-44F6-A466-CCCEAA6E3A2B}" srcOrd="0" destOrd="0" presId="urn:microsoft.com/office/officeart/2005/8/layout/chevron1"/>
+    <dgm:cxn modelId="{2843DFEB-8FE1-48F0-8F28-9B480A1EA2BB}" type="presOf" srcId="{518BBF31-5473-4647-89A8-1F7190FDD7CC}" destId="{5F46AD52-443D-445C-A0DE-55C3F3A14D43}" srcOrd="0" destOrd="0" presId="urn:microsoft.com/office/officeart/2005/8/layout/chevron1"/>
+    <dgm:cxn modelId="{63B1BBEE-2B19-4347-A942-C30A94415B92}" type="presOf" srcId="{E4F40C07-A169-42D7-9A7C-EC1908A68E5F}" destId="{73B709FB-7B30-472B-AD65-EC980FF821F6}" srcOrd="0" destOrd="0" presId="urn:microsoft.com/office/officeart/2005/8/layout/chevron1"/>
     <dgm:cxn modelId="{4FE1FE6A-5803-4018-B509-658EC487FBE6}" srcId="{E4F40C07-A169-42D7-9A7C-EC1908A68E5F}" destId="{C10563B1-D17B-4828-B40F-E64A77D38593}" srcOrd="0" destOrd="0" parTransId="{EEE0B6B6-BBA2-456F-B015-6F0E37F436A8}" sibTransId="{402CAF88-2D00-497D-BD34-BD7D8188DA24}"/>
-    <dgm:cxn modelId="{FBE79D26-2316-4364-8F3B-5098C5BA0A92}" srcId="{E4F40C07-A169-42D7-9A7C-EC1908A68E5F}" destId="{518BBF31-5473-4647-89A8-1F7190FDD7CC}" srcOrd="1" destOrd="0" parTransId="{51A8C620-C424-463F-9BEF-6A08563C7A06}" sibTransId="{017B1192-391E-4A65-81D1-6D7C5AF2AA1D}"/>
-    <dgm:cxn modelId="{E2A6A5E9-A2D0-4BF2-AF8E-ACB6C085CA8C}" srcId="{E4F40C07-A169-42D7-9A7C-EC1908A68E5F}" destId="{7C35FEF7-DC0D-43AE-8BE3-2149FB2A04A2}" srcOrd="2" destOrd="0" parTransId="{F35C3024-56BC-477B-B2DD-7628EC4D0598}" sibTransId="{5E9DDC1B-8E20-45BD-B2C4-DE21EC41E73E}"/>
-    <dgm:cxn modelId="{9324BE21-9476-408D-AA24-8F0D5845A5B1}" type="presOf" srcId="{C10563B1-D17B-4828-B40F-E64A77D38593}" destId="{4D560F50-8F16-4794-86B3-C3D8DE2F9386}" srcOrd="0" destOrd="0" presId="urn:microsoft.com/office/officeart/2005/8/layout/chevron1"/>
-    <dgm:cxn modelId="{3C1C0D14-6DF2-4652-9E4E-340880213B41}" srcId="{E4F40C07-A169-42D7-9A7C-EC1908A68E5F}" destId="{12905BA0-FFBC-4F6F-A638-860052C3C22E}" srcOrd="3" destOrd="0" parTransId="{51C23596-DA0B-4497-9E19-6A9465F512F2}" sibTransId="{B30D78C5-2EE3-4FC4-ADE9-34EAB867FD7E}"/>
-    <dgm:cxn modelId="{77D26004-DAB8-425E-9252-9292E3E25326}" type="presParOf" srcId="{73B709FB-7B30-472B-AD65-EC980FF821F6}" destId="{4D560F50-8F16-4794-86B3-C3D8DE2F9386}" srcOrd="0" destOrd="0" presId="urn:microsoft.com/office/officeart/2005/8/layout/chevron1"/>
-    <dgm:cxn modelId="{E042C8E9-6A29-403C-896B-D69E971557F2}" type="presParOf" srcId="{73B709FB-7B30-472B-AD65-EC980FF821F6}" destId="{154621DC-2D17-41EF-803D-3A82BFCEB308}" srcOrd="1" destOrd="0" presId="urn:microsoft.com/office/officeart/2005/8/layout/chevron1"/>
-    <dgm:cxn modelId="{F5986667-F0C1-4AC5-86A9-15C0537C9B7F}" type="presParOf" srcId="{73B709FB-7B30-472B-AD65-EC980FF821F6}" destId="{5F46AD52-443D-445C-A0DE-55C3F3A14D43}" srcOrd="2" destOrd="0" presId="urn:microsoft.com/office/officeart/2005/8/layout/chevron1"/>
-    <dgm:cxn modelId="{F1EE30B8-4D54-4937-8FD6-5D693D671940}" type="presParOf" srcId="{73B709FB-7B30-472B-AD65-EC980FF821F6}" destId="{3E86C66D-943B-4F67-81EE-8C1894017E0F}" srcOrd="3" destOrd="0" presId="urn:microsoft.com/office/officeart/2005/8/layout/chevron1"/>
-    <dgm:cxn modelId="{7FE7CA2F-EDA0-4203-B639-146848FC53E7}" type="presParOf" srcId="{73B709FB-7B30-472B-AD65-EC980FF821F6}" destId="{CBCE1630-5EA0-49CF-B64F-8E2E518136D4}" srcOrd="4" destOrd="0" presId="urn:microsoft.com/office/officeart/2005/8/layout/chevron1"/>
-    <dgm:cxn modelId="{EE59F615-BBFE-4F1C-AA32-76187BF3C734}" type="presParOf" srcId="{73B709FB-7B30-472B-AD65-EC980FF821F6}" destId="{594D3F54-EE82-44DD-84F9-B2DCBA830960}" srcOrd="5" destOrd="0" presId="urn:microsoft.com/office/officeart/2005/8/layout/chevron1"/>
-    <dgm:cxn modelId="{89E2C96B-42B1-4EA1-9FC5-ECDC8F9482B8}" type="presParOf" srcId="{73B709FB-7B30-472B-AD65-EC980FF821F6}" destId="{7DC38E28-F114-44F6-A466-CCCEAA6E3A2B}" srcOrd="6" destOrd="0" presId="urn:microsoft.com/office/officeart/2005/8/layout/chevron1"/>
+    <dgm:cxn modelId="{A1EBADDC-538B-49CB-B46B-B3CBE1D7FBEA}" type="presOf" srcId="{7C35FEF7-DC0D-43AE-8BE3-2149FB2A04A2}" destId="{CBCE1630-5EA0-49CF-B64F-8E2E518136D4}" srcOrd="0" destOrd="0" presId="urn:microsoft.com/office/officeart/2005/8/layout/chevron1"/>
+    <dgm:cxn modelId="{E16B5841-61B2-4584-8431-7CC1D7F86476}" type="presParOf" srcId="{73B709FB-7B30-472B-AD65-EC980FF821F6}" destId="{4D560F50-8F16-4794-86B3-C3D8DE2F9386}" srcOrd="0" destOrd="0" presId="urn:microsoft.com/office/officeart/2005/8/layout/chevron1"/>
+    <dgm:cxn modelId="{E7F6DD5E-CA08-49F3-92C1-886C79E7A93E}" type="presParOf" srcId="{73B709FB-7B30-472B-AD65-EC980FF821F6}" destId="{154621DC-2D17-41EF-803D-3A82BFCEB308}" srcOrd="1" destOrd="0" presId="urn:microsoft.com/office/officeart/2005/8/layout/chevron1"/>
+    <dgm:cxn modelId="{5A5592B2-EE72-4651-872C-0F5C0A2A3632}" type="presParOf" srcId="{73B709FB-7B30-472B-AD65-EC980FF821F6}" destId="{5F46AD52-443D-445C-A0DE-55C3F3A14D43}" srcOrd="2" destOrd="0" presId="urn:microsoft.com/office/officeart/2005/8/layout/chevron1"/>
+    <dgm:cxn modelId="{EBA6007D-1AA3-4B3A-88D9-B6D10CAEB3B5}" type="presParOf" srcId="{73B709FB-7B30-472B-AD65-EC980FF821F6}" destId="{3E86C66D-943B-4F67-81EE-8C1894017E0F}" srcOrd="3" destOrd="0" presId="urn:microsoft.com/office/officeart/2005/8/layout/chevron1"/>
+    <dgm:cxn modelId="{4243C1A1-BC61-4106-90C1-5ED442899699}" type="presParOf" srcId="{73B709FB-7B30-472B-AD65-EC980FF821F6}" destId="{CBCE1630-5EA0-49CF-B64F-8E2E518136D4}" srcOrd="4" destOrd="0" presId="urn:microsoft.com/office/officeart/2005/8/layout/chevron1"/>
+    <dgm:cxn modelId="{8579FF74-B947-482E-B9AF-FFCD6ACF098E}" type="presParOf" srcId="{73B709FB-7B30-472B-AD65-EC980FF821F6}" destId="{594D3F54-EE82-44DD-84F9-B2DCBA830960}" srcOrd="5" destOrd="0" presId="urn:microsoft.com/office/officeart/2005/8/layout/chevron1"/>
+    <dgm:cxn modelId="{A2996563-363D-4FF8-868B-FCD2238AF0F8}" type="presParOf" srcId="{73B709FB-7B30-472B-AD65-EC980FF821F6}" destId="{7DC38E28-F114-44F6-A466-CCCEAA6E3A2B}" srcOrd="6" destOrd="0" presId="urn:microsoft.com/office/officeart/2005/8/layout/chevron1"/>
   </dgm:cxnLst>
   <dgm:bg/>
   <dgm:whole/>

</xml_diff>

<commit_message>
Date: 03 Sept 2025
</commit_message>
<xml_diff>
--- a/Notes.docx
+++ b/Notes.docx
@@ -11020,6 +11020,186 @@
           </wp:inline>
         </w:drawing>
       </w:r>
+    </w:p>
+    <w:p>
+      <w:pPr>
+        <w:rPr>
+          <w:sz w:val="24"/>
+          <w:szCs w:val="22"/>
+          <w:lang w:val="en-US"/>
+        </w:rPr>
+      </w:pPr>
+      <w:r>
+        <w:rPr>
+          <w:sz w:val="24"/>
+          <w:szCs w:val="22"/>
+          <w:lang w:val="en-US"/>
+        </w:rPr>
+        <w:br w:type="page"/>
+      </w:r>
+    </w:p>
+    <w:p>
+      <w:pPr>
+        <w:rPr>
+          <w:b/>
+          <w:bCs/>
+          <w:sz w:val="24"/>
+          <w:szCs w:val="22"/>
+          <w:lang w:val="en-US"/>
+        </w:rPr>
+      </w:pPr>
+      <w:r>
+        <w:rPr>
+          <w:b/>
+          <w:bCs/>
+          <w:sz w:val="24"/>
+          <w:szCs w:val="22"/>
+          <w:lang w:val="en-US"/>
+        </w:rPr>
+        <w:lastRenderedPageBreak/>
+        <w:t>Maven</w:t>
+      </w:r>
+    </w:p>
+    <w:p>
+      <w:pPr>
+        <w:rPr>
+          <w:sz w:val="24"/>
+          <w:szCs w:val="22"/>
+          <w:lang w:val="en-US"/>
+        </w:rPr>
+      </w:pPr>
+      <w:r>
+        <w:rPr>
+          <w:sz w:val="24"/>
+          <w:szCs w:val="22"/>
+          <w:lang w:val="en-US"/>
+        </w:rPr>
+        <w:t>Build management tool</w:t>
+      </w:r>
+    </w:p>
+    <w:p>
+      <w:pPr>
+        <w:pStyle w:val="ListParagraph"/>
+        <w:numPr>
+          <w:ilvl w:val="0"/>
+          <w:numId w:val="33"/>
+        </w:numPr>
+        <w:rPr>
+          <w:sz w:val="24"/>
+          <w:szCs w:val="22"/>
+          <w:lang w:val="en-US"/>
+        </w:rPr>
+      </w:pPr>
+      <w:r>
+        <w:rPr>
+          <w:sz w:val="24"/>
+          <w:szCs w:val="22"/>
+          <w:lang w:val="en-US"/>
+        </w:rPr>
+        <w:t>Apache product</w:t>
+      </w:r>
+    </w:p>
+    <w:p>
+      <w:pPr>
+        <w:pStyle w:val="ListParagraph"/>
+        <w:numPr>
+          <w:ilvl w:val="0"/>
+          <w:numId w:val="33"/>
+        </w:numPr>
+        <w:rPr>
+          <w:sz w:val="24"/>
+          <w:szCs w:val="22"/>
+          <w:lang w:val="en-US"/>
+        </w:rPr>
+      </w:pPr>
+      <w:r>
+        <w:rPr>
+          <w:sz w:val="24"/>
+          <w:szCs w:val="22"/>
+          <w:lang w:val="en-US"/>
+        </w:rPr>
+        <w:t>Open source</w:t>
+      </w:r>
+    </w:p>
+    <w:p>
+      <w:pPr>
+        <w:pStyle w:val="ListParagraph"/>
+        <w:numPr>
+          <w:ilvl w:val="0"/>
+          <w:numId w:val="33"/>
+        </w:numPr>
+        <w:rPr>
+          <w:sz w:val="24"/>
+          <w:szCs w:val="22"/>
+          <w:lang w:val="en-US"/>
+        </w:rPr>
+      </w:pPr>
+      <w:r>
+        <w:rPr>
+          <w:sz w:val="24"/>
+          <w:szCs w:val="22"/>
+          <w:lang w:val="en-US"/>
+        </w:rPr>
+        <w:t>Uses dependency</w:t>
+      </w:r>
+    </w:p>
+    <w:p>
+      <w:pPr>
+        <w:pStyle w:val="ListParagraph"/>
+        <w:numPr>
+          <w:ilvl w:val="0"/>
+          <w:numId w:val="33"/>
+        </w:numPr>
+        <w:rPr>
+          <w:sz w:val="24"/>
+          <w:szCs w:val="22"/>
+          <w:lang w:val="en-US"/>
+        </w:rPr>
+      </w:pPr>
+      <w:r>
+        <w:rPr>
+          <w:sz w:val="24"/>
+          <w:szCs w:val="22"/>
+          <w:lang w:val="en-US"/>
+        </w:rPr>
+        <w:t>Easy configuration via pom.xml file</w:t>
+      </w:r>
+    </w:p>
+    <w:p>
+      <w:pPr>
+        <w:pStyle w:val="ListParagraph"/>
+        <w:numPr>
+          <w:ilvl w:val="0"/>
+          <w:numId w:val="33"/>
+        </w:numPr>
+        <w:rPr>
+          <w:sz w:val="24"/>
+          <w:szCs w:val="22"/>
+          <w:lang w:val="en-US"/>
+        </w:rPr>
+      </w:pPr>
+      <w:r>
+        <w:rPr>
+          <w:sz w:val="24"/>
+          <w:szCs w:val="22"/>
+          <w:lang w:val="en-US"/>
+        </w:rPr>
+        <w:t>Single project can be used by developer and tester both</w:t>
+      </w:r>
+    </w:p>
+    <w:p>
+      <w:pPr>
+        <w:pStyle w:val="ListParagraph"/>
+        <w:numPr>
+          <w:ilvl w:val="0"/>
+          <w:numId w:val="33"/>
+        </w:numPr>
+        <w:rPr>
+          <w:sz w:val="24"/>
+          <w:szCs w:val="22"/>
+          <w:lang w:val="en-US"/>
+        </w:rPr>
+      </w:pPr>
       <w:bookmarkStart w:id="0" w:name="_GoBack"/>
       <w:bookmarkEnd w:id="0"/>
     </w:p>
@@ -13347,6 +13527,119 @@
     </w:lvl>
   </w:abstractNum>
   <w:abstractNum w:abstractNumId="23">
+    <w:nsid w:val="4D7B2612"/>
+    <w:multiLevelType w:val="hybridMultilevel"/>
+    <w:tmpl w:val="8752CAAA"/>
+    <w:lvl w:ilvl="0" w:tplc="40090001">
+      <w:start w:val="1"/>
+      <w:numFmt w:val="bullet"/>
+      <w:lvlText w:val=""/>
+      <w:lvlJc w:val="left"/>
+      <w:pPr>
+        <w:ind w:left="720" w:hanging="360"/>
+      </w:pPr>
+      <w:rPr>
+        <w:rFonts w:ascii="Symbol" w:hAnsi="Symbol" w:hint="default"/>
+      </w:rPr>
+    </w:lvl>
+    <w:lvl w:ilvl="1" w:tplc="40090003" w:tentative="1">
+      <w:start w:val="1"/>
+      <w:numFmt w:val="bullet"/>
+      <w:lvlText w:val="o"/>
+      <w:lvlJc w:val="left"/>
+      <w:pPr>
+        <w:ind w:left="1440" w:hanging="360"/>
+      </w:pPr>
+      <w:rPr>
+        <w:rFonts w:ascii="Courier New" w:hAnsi="Courier New" w:cs="Courier New" w:hint="default"/>
+      </w:rPr>
+    </w:lvl>
+    <w:lvl w:ilvl="2" w:tplc="40090005" w:tentative="1">
+      <w:start w:val="1"/>
+      <w:numFmt w:val="bullet"/>
+      <w:lvlText w:val=""/>
+      <w:lvlJc w:val="left"/>
+      <w:pPr>
+        <w:ind w:left="2160" w:hanging="360"/>
+      </w:pPr>
+      <w:rPr>
+        <w:rFonts w:ascii="Wingdings" w:hAnsi="Wingdings" w:hint="default"/>
+      </w:rPr>
+    </w:lvl>
+    <w:lvl w:ilvl="3" w:tplc="40090001" w:tentative="1">
+      <w:start w:val="1"/>
+      <w:numFmt w:val="bullet"/>
+      <w:lvlText w:val=""/>
+      <w:lvlJc w:val="left"/>
+      <w:pPr>
+        <w:ind w:left="2880" w:hanging="360"/>
+      </w:pPr>
+      <w:rPr>
+        <w:rFonts w:ascii="Symbol" w:hAnsi="Symbol" w:hint="default"/>
+      </w:rPr>
+    </w:lvl>
+    <w:lvl w:ilvl="4" w:tplc="40090003" w:tentative="1">
+      <w:start w:val="1"/>
+      <w:numFmt w:val="bullet"/>
+      <w:lvlText w:val="o"/>
+      <w:lvlJc w:val="left"/>
+      <w:pPr>
+        <w:ind w:left="3600" w:hanging="360"/>
+      </w:pPr>
+      <w:rPr>
+        <w:rFonts w:ascii="Courier New" w:hAnsi="Courier New" w:cs="Courier New" w:hint="default"/>
+      </w:rPr>
+    </w:lvl>
+    <w:lvl w:ilvl="5" w:tplc="40090005" w:tentative="1">
+      <w:start w:val="1"/>
+      <w:numFmt w:val="bullet"/>
+      <w:lvlText w:val=""/>
+      <w:lvlJc w:val="left"/>
+      <w:pPr>
+        <w:ind w:left="4320" w:hanging="360"/>
+      </w:pPr>
+      <w:rPr>
+        <w:rFonts w:ascii="Wingdings" w:hAnsi="Wingdings" w:hint="default"/>
+      </w:rPr>
+    </w:lvl>
+    <w:lvl w:ilvl="6" w:tplc="40090001" w:tentative="1">
+      <w:start w:val="1"/>
+      <w:numFmt w:val="bullet"/>
+      <w:lvlText w:val=""/>
+      <w:lvlJc w:val="left"/>
+      <w:pPr>
+        <w:ind w:left="5040" w:hanging="360"/>
+      </w:pPr>
+      <w:rPr>
+        <w:rFonts w:ascii="Symbol" w:hAnsi="Symbol" w:hint="default"/>
+      </w:rPr>
+    </w:lvl>
+    <w:lvl w:ilvl="7" w:tplc="40090003" w:tentative="1">
+      <w:start w:val="1"/>
+      <w:numFmt w:val="bullet"/>
+      <w:lvlText w:val="o"/>
+      <w:lvlJc w:val="left"/>
+      <w:pPr>
+        <w:ind w:left="5760" w:hanging="360"/>
+      </w:pPr>
+      <w:rPr>
+        <w:rFonts w:ascii="Courier New" w:hAnsi="Courier New" w:cs="Courier New" w:hint="default"/>
+      </w:rPr>
+    </w:lvl>
+    <w:lvl w:ilvl="8" w:tplc="40090005" w:tentative="1">
+      <w:start w:val="1"/>
+      <w:numFmt w:val="bullet"/>
+      <w:lvlText w:val=""/>
+      <w:lvlJc w:val="left"/>
+      <w:pPr>
+        <w:ind w:left="6480" w:hanging="360"/>
+      </w:pPr>
+      <w:rPr>
+        <w:rFonts w:ascii="Wingdings" w:hAnsi="Wingdings" w:hint="default"/>
+      </w:rPr>
+    </w:lvl>
+  </w:abstractNum>
+  <w:abstractNum w:abstractNumId="24">
     <w:nsid w:val="5310622E"/>
     <w:multiLevelType w:val="hybridMultilevel"/>
     <w:tmpl w:val="9906F9CE"/>
@@ -13459,7 +13752,7 @@
       </w:rPr>
     </w:lvl>
   </w:abstractNum>
-  <w:abstractNum w:abstractNumId="24">
+  <w:abstractNum w:abstractNumId="25">
     <w:nsid w:val="58E925AA"/>
     <w:multiLevelType w:val="hybridMultilevel"/>
     <w:tmpl w:val="4C34E418"/>
@@ -13548,7 +13841,7 @@
       </w:pPr>
     </w:lvl>
   </w:abstractNum>
-  <w:abstractNum w:abstractNumId="25">
+  <w:abstractNum w:abstractNumId="26">
     <w:nsid w:val="625A54F2"/>
     <w:multiLevelType w:val="hybridMultilevel"/>
     <w:tmpl w:val="0694B584"/>
@@ -13634,7 +13927,7 @@
       </w:pPr>
     </w:lvl>
   </w:abstractNum>
-  <w:abstractNum w:abstractNumId="26">
+  <w:abstractNum w:abstractNumId="27">
     <w:nsid w:val="636D1023"/>
     <w:multiLevelType w:val="hybridMultilevel"/>
     <w:tmpl w:val="817E55B8"/>
@@ -13747,7 +14040,7 @@
       </w:rPr>
     </w:lvl>
   </w:abstractNum>
-  <w:abstractNum w:abstractNumId="27">
+  <w:abstractNum w:abstractNumId="28">
     <w:nsid w:val="729755FC"/>
     <w:multiLevelType w:val="hybridMultilevel"/>
     <w:tmpl w:val="25D6C8E0"/>
@@ -13836,7 +14129,7 @@
       </w:pPr>
     </w:lvl>
   </w:abstractNum>
-  <w:abstractNum w:abstractNumId="28">
+  <w:abstractNum w:abstractNumId="29">
     <w:nsid w:val="73AD1520"/>
     <w:multiLevelType w:val="hybridMultilevel"/>
     <w:tmpl w:val="56149FBA"/>
@@ -13922,7 +14215,7 @@
       </w:pPr>
     </w:lvl>
   </w:abstractNum>
-  <w:abstractNum w:abstractNumId="29">
+  <w:abstractNum w:abstractNumId="30">
     <w:nsid w:val="747C125B"/>
     <w:multiLevelType w:val="hybridMultilevel"/>
     <w:tmpl w:val="7AB85DE6"/>
@@ -14011,7 +14304,7 @@
       </w:pPr>
     </w:lvl>
   </w:abstractNum>
-  <w:abstractNum w:abstractNumId="30">
+  <w:abstractNum w:abstractNumId="31">
     <w:nsid w:val="7B0F502E"/>
     <w:multiLevelType w:val="hybridMultilevel"/>
     <w:tmpl w:val="D0CA6452"/>
@@ -14100,7 +14393,7 @@
       </w:pPr>
     </w:lvl>
   </w:abstractNum>
-  <w:abstractNum w:abstractNumId="31">
+  <w:abstractNum w:abstractNumId="32">
     <w:nsid w:val="7EE72A42"/>
     <w:multiLevelType w:val="hybridMultilevel"/>
     <w:tmpl w:val="E0164236"/>
@@ -14202,7 +14495,7 @@
     <w:abstractNumId w:val="9"/>
   </w:num>
   <w:num w:numId="5">
-    <w:abstractNumId w:val="23"/>
+    <w:abstractNumId w:val="24"/>
   </w:num>
   <w:num w:numId="6">
     <w:abstractNumId w:val="15"/>
@@ -14211,10 +14504,10 @@
     <w:abstractNumId w:val="3"/>
   </w:num>
   <w:num w:numId="8">
-    <w:abstractNumId w:val="29"/>
+    <w:abstractNumId w:val="30"/>
   </w:num>
   <w:num w:numId="9">
-    <w:abstractNumId w:val="26"/>
+    <w:abstractNumId w:val="27"/>
   </w:num>
   <w:num w:numId="10">
     <w:abstractNumId w:val="22"/>
@@ -14235,13 +14528,13 @@
     <w:abstractNumId w:val="11"/>
   </w:num>
   <w:num w:numId="16">
-    <w:abstractNumId w:val="25"/>
+    <w:abstractNumId w:val="26"/>
   </w:num>
   <w:num w:numId="17">
-    <w:abstractNumId w:val="27"/>
+    <w:abstractNumId w:val="28"/>
   </w:num>
   <w:num w:numId="18">
-    <w:abstractNumId w:val="24"/>
+    <w:abstractNumId w:val="25"/>
   </w:num>
   <w:num w:numId="19">
     <w:abstractNumId w:val="5"/>
@@ -14268,13 +14561,13 @@
     <w:abstractNumId w:val="17"/>
   </w:num>
   <w:num w:numId="27">
-    <w:abstractNumId w:val="31"/>
+    <w:abstractNumId w:val="32"/>
   </w:num>
   <w:num w:numId="28">
     <w:abstractNumId w:val="19"/>
   </w:num>
   <w:num w:numId="29">
-    <w:abstractNumId w:val="28"/>
+    <w:abstractNumId w:val="29"/>
   </w:num>
   <w:num w:numId="30">
     <w:abstractNumId w:val="12"/>
@@ -14283,7 +14576,10 @@
     <w:abstractNumId w:val="8"/>
   </w:num>
   <w:num w:numId="32">
-    <w:abstractNumId w:val="30"/>
+    <w:abstractNumId w:val="31"/>
+  </w:num>
+  <w:num w:numId="33">
+    <w:abstractNumId w:val="23"/>
   </w:num>
 </w:numbering>
 </file>
@@ -15909,22 +16205,22 @@
     </dgm:pt>
   </dgm:ptLst>
   <dgm:cxnLst>
+    <dgm:cxn modelId="{2519AE1E-F128-4436-8745-B7388BF4B5F8}" type="presOf" srcId="{C10563B1-D17B-4828-B40F-E64A77D38593}" destId="{4D560F50-8F16-4794-86B3-C3D8DE2F9386}" srcOrd="0" destOrd="0" presId="urn:microsoft.com/office/officeart/2005/8/layout/chevron1"/>
+    <dgm:cxn modelId="{2AB96954-3C91-4F39-8FC5-0FC716C8EFC8}" type="presOf" srcId="{7C35FEF7-DC0D-43AE-8BE3-2149FB2A04A2}" destId="{CBCE1630-5EA0-49CF-B64F-8E2E518136D4}" srcOrd="0" destOrd="0" presId="urn:microsoft.com/office/officeart/2005/8/layout/chevron1"/>
+    <dgm:cxn modelId="{8418DA5C-DF5A-43CC-928A-19E37AA00E6F}" type="presOf" srcId="{518BBF31-5473-4647-89A8-1F7190FDD7CC}" destId="{5F46AD52-443D-445C-A0DE-55C3F3A14D43}" srcOrd="0" destOrd="0" presId="urn:microsoft.com/office/officeart/2005/8/layout/chevron1"/>
+    <dgm:cxn modelId="{4FE1FE6A-5803-4018-B509-658EC487FBE6}" srcId="{E4F40C07-A169-42D7-9A7C-EC1908A68E5F}" destId="{C10563B1-D17B-4828-B40F-E64A77D38593}" srcOrd="0" destOrd="0" parTransId="{EEE0B6B6-BBA2-456F-B015-6F0E37F436A8}" sibTransId="{402CAF88-2D00-497D-BD34-BD7D8188DA24}"/>
+    <dgm:cxn modelId="{FBE79D26-2316-4364-8F3B-5098C5BA0A92}" srcId="{E4F40C07-A169-42D7-9A7C-EC1908A68E5F}" destId="{518BBF31-5473-4647-89A8-1F7190FDD7CC}" srcOrd="1" destOrd="0" parTransId="{51A8C620-C424-463F-9BEF-6A08563C7A06}" sibTransId="{017B1192-391E-4A65-81D1-6D7C5AF2AA1D}"/>
     <dgm:cxn modelId="{E2A6A5E9-A2D0-4BF2-AF8E-ACB6C085CA8C}" srcId="{E4F40C07-A169-42D7-9A7C-EC1908A68E5F}" destId="{7C35FEF7-DC0D-43AE-8BE3-2149FB2A04A2}" srcOrd="2" destOrd="0" parTransId="{F35C3024-56BC-477B-B2DD-7628EC4D0598}" sibTransId="{5E9DDC1B-8E20-45BD-B2C4-DE21EC41E73E}"/>
+    <dgm:cxn modelId="{EAFDBDA5-9966-4AFF-ACAC-7D9802641980}" type="presOf" srcId="{E4F40C07-A169-42D7-9A7C-EC1908A68E5F}" destId="{73B709FB-7B30-472B-AD65-EC980FF821F6}" srcOrd="0" destOrd="0" presId="urn:microsoft.com/office/officeart/2005/8/layout/chevron1"/>
+    <dgm:cxn modelId="{B1980153-9A64-481F-814B-A68F72393AB6}" type="presOf" srcId="{12905BA0-FFBC-4F6F-A638-860052C3C22E}" destId="{7DC38E28-F114-44F6-A466-CCCEAA6E3A2B}" srcOrd="0" destOrd="0" presId="urn:microsoft.com/office/officeart/2005/8/layout/chevron1"/>
     <dgm:cxn modelId="{3C1C0D14-6DF2-4652-9E4E-340880213B41}" srcId="{E4F40C07-A169-42D7-9A7C-EC1908A68E5F}" destId="{12905BA0-FFBC-4F6F-A638-860052C3C22E}" srcOrd="3" destOrd="0" parTransId="{51C23596-DA0B-4497-9E19-6A9465F512F2}" sibTransId="{B30D78C5-2EE3-4FC4-ADE9-34EAB867FD7E}"/>
-    <dgm:cxn modelId="{FBE79D26-2316-4364-8F3B-5098C5BA0A92}" srcId="{E4F40C07-A169-42D7-9A7C-EC1908A68E5F}" destId="{518BBF31-5473-4647-89A8-1F7190FDD7CC}" srcOrd="1" destOrd="0" parTransId="{51A8C620-C424-463F-9BEF-6A08563C7A06}" sibTransId="{017B1192-391E-4A65-81D1-6D7C5AF2AA1D}"/>
-    <dgm:cxn modelId="{15A50B50-F5D1-4481-AC37-812422ADACED}" type="presOf" srcId="{C10563B1-D17B-4828-B40F-E64A77D38593}" destId="{4D560F50-8F16-4794-86B3-C3D8DE2F9386}" srcOrd="0" destOrd="0" presId="urn:microsoft.com/office/officeart/2005/8/layout/chevron1"/>
-    <dgm:cxn modelId="{06CF3F45-80C6-456F-AD8B-09FEA6D4FBE0}" type="presOf" srcId="{12905BA0-FFBC-4F6F-A638-860052C3C22E}" destId="{7DC38E28-F114-44F6-A466-CCCEAA6E3A2B}" srcOrd="0" destOrd="0" presId="urn:microsoft.com/office/officeart/2005/8/layout/chevron1"/>
-    <dgm:cxn modelId="{2843DFEB-8FE1-48F0-8F28-9B480A1EA2BB}" type="presOf" srcId="{518BBF31-5473-4647-89A8-1F7190FDD7CC}" destId="{5F46AD52-443D-445C-A0DE-55C3F3A14D43}" srcOrd="0" destOrd="0" presId="urn:microsoft.com/office/officeart/2005/8/layout/chevron1"/>
-    <dgm:cxn modelId="{63B1BBEE-2B19-4347-A942-C30A94415B92}" type="presOf" srcId="{E4F40C07-A169-42D7-9A7C-EC1908A68E5F}" destId="{73B709FB-7B30-472B-AD65-EC980FF821F6}" srcOrd="0" destOrd="0" presId="urn:microsoft.com/office/officeart/2005/8/layout/chevron1"/>
-    <dgm:cxn modelId="{4FE1FE6A-5803-4018-B509-658EC487FBE6}" srcId="{E4F40C07-A169-42D7-9A7C-EC1908A68E5F}" destId="{C10563B1-D17B-4828-B40F-E64A77D38593}" srcOrd="0" destOrd="0" parTransId="{EEE0B6B6-BBA2-456F-B015-6F0E37F436A8}" sibTransId="{402CAF88-2D00-497D-BD34-BD7D8188DA24}"/>
-    <dgm:cxn modelId="{A1EBADDC-538B-49CB-B46B-B3CBE1D7FBEA}" type="presOf" srcId="{7C35FEF7-DC0D-43AE-8BE3-2149FB2A04A2}" destId="{CBCE1630-5EA0-49CF-B64F-8E2E518136D4}" srcOrd="0" destOrd="0" presId="urn:microsoft.com/office/officeart/2005/8/layout/chevron1"/>
-    <dgm:cxn modelId="{E16B5841-61B2-4584-8431-7CC1D7F86476}" type="presParOf" srcId="{73B709FB-7B30-472B-AD65-EC980FF821F6}" destId="{4D560F50-8F16-4794-86B3-C3D8DE2F9386}" srcOrd="0" destOrd="0" presId="urn:microsoft.com/office/officeart/2005/8/layout/chevron1"/>
-    <dgm:cxn modelId="{E7F6DD5E-CA08-49F3-92C1-886C79E7A93E}" type="presParOf" srcId="{73B709FB-7B30-472B-AD65-EC980FF821F6}" destId="{154621DC-2D17-41EF-803D-3A82BFCEB308}" srcOrd="1" destOrd="0" presId="urn:microsoft.com/office/officeart/2005/8/layout/chevron1"/>
-    <dgm:cxn modelId="{5A5592B2-EE72-4651-872C-0F5C0A2A3632}" type="presParOf" srcId="{73B709FB-7B30-472B-AD65-EC980FF821F6}" destId="{5F46AD52-443D-445C-A0DE-55C3F3A14D43}" srcOrd="2" destOrd="0" presId="urn:microsoft.com/office/officeart/2005/8/layout/chevron1"/>
-    <dgm:cxn modelId="{EBA6007D-1AA3-4B3A-88D9-B6D10CAEB3B5}" type="presParOf" srcId="{73B709FB-7B30-472B-AD65-EC980FF821F6}" destId="{3E86C66D-943B-4F67-81EE-8C1894017E0F}" srcOrd="3" destOrd="0" presId="urn:microsoft.com/office/officeart/2005/8/layout/chevron1"/>
-    <dgm:cxn modelId="{4243C1A1-BC61-4106-90C1-5ED442899699}" type="presParOf" srcId="{73B709FB-7B30-472B-AD65-EC980FF821F6}" destId="{CBCE1630-5EA0-49CF-B64F-8E2E518136D4}" srcOrd="4" destOrd="0" presId="urn:microsoft.com/office/officeart/2005/8/layout/chevron1"/>
-    <dgm:cxn modelId="{8579FF74-B947-482E-B9AF-FFCD6ACF098E}" type="presParOf" srcId="{73B709FB-7B30-472B-AD65-EC980FF821F6}" destId="{594D3F54-EE82-44DD-84F9-B2DCBA830960}" srcOrd="5" destOrd="0" presId="urn:microsoft.com/office/officeart/2005/8/layout/chevron1"/>
-    <dgm:cxn modelId="{A2996563-363D-4FF8-868B-FCD2238AF0F8}" type="presParOf" srcId="{73B709FB-7B30-472B-AD65-EC980FF821F6}" destId="{7DC38E28-F114-44F6-A466-CCCEAA6E3A2B}" srcOrd="6" destOrd="0" presId="urn:microsoft.com/office/officeart/2005/8/layout/chevron1"/>
+    <dgm:cxn modelId="{F3864C2E-588A-4ADB-B4E6-39F386A13E55}" type="presParOf" srcId="{73B709FB-7B30-472B-AD65-EC980FF821F6}" destId="{4D560F50-8F16-4794-86B3-C3D8DE2F9386}" srcOrd="0" destOrd="0" presId="urn:microsoft.com/office/officeart/2005/8/layout/chevron1"/>
+    <dgm:cxn modelId="{E39938BE-6608-40CF-8340-D01C0432DD27}" type="presParOf" srcId="{73B709FB-7B30-472B-AD65-EC980FF821F6}" destId="{154621DC-2D17-41EF-803D-3A82BFCEB308}" srcOrd="1" destOrd="0" presId="urn:microsoft.com/office/officeart/2005/8/layout/chevron1"/>
+    <dgm:cxn modelId="{9023F50B-A62B-4F3F-BD79-F5EB5DFA13B2}" type="presParOf" srcId="{73B709FB-7B30-472B-AD65-EC980FF821F6}" destId="{5F46AD52-443D-445C-A0DE-55C3F3A14D43}" srcOrd="2" destOrd="0" presId="urn:microsoft.com/office/officeart/2005/8/layout/chevron1"/>
+    <dgm:cxn modelId="{37D7E59A-E93E-4579-A907-61B467EF5482}" type="presParOf" srcId="{73B709FB-7B30-472B-AD65-EC980FF821F6}" destId="{3E86C66D-943B-4F67-81EE-8C1894017E0F}" srcOrd="3" destOrd="0" presId="urn:microsoft.com/office/officeart/2005/8/layout/chevron1"/>
+    <dgm:cxn modelId="{2300B3E2-D461-4190-B96E-073B0F023E61}" type="presParOf" srcId="{73B709FB-7B30-472B-AD65-EC980FF821F6}" destId="{CBCE1630-5EA0-49CF-B64F-8E2E518136D4}" srcOrd="4" destOrd="0" presId="urn:microsoft.com/office/officeart/2005/8/layout/chevron1"/>
+    <dgm:cxn modelId="{F232DCC0-BF51-4705-9EC1-92A17C882BC4}" type="presParOf" srcId="{73B709FB-7B30-472B-AD65-EC980FF821F6}" destId="{594D3F54-EE82-44DD-84F9-B2DCBA830960}" srcOrd="5" destOrd="0" presId="urn:microsoft.com/office/officeart/2005/8/layout/chevron1"/>
+    <dgm:cxn modelId="{15928D5B-5FC8-49C9-95CF-BAA84DD2E0B7}" type="presParOf" srcId="{73B709FB-7B30-472B-AD65-EC980FF821F6}" destId="{7DC38E28-F114-44F6-A466-CCCEAA6E3A2B}" srcOrd="6" destOrd="0" presId="urn:microsoft.com/office/officeart/2005/8/layout/chevron1"/>
   </dgm:cxnLst>
   <dgm:bg/>
   <dgm:whole/>

</xml_diff>

<commit_message>
Date: 17 Sept 2025
</commit_message>
<xml_diff>
--- a/Notes.docx
+++ b/Notes.docx
@@ -11189,17 +11189,1574 @@
     </w:p>
     <w:p>
       <w:pPr>
+        <w:rPr>
+          <w:sz w:val="24"/>
+          <w:szCs w:val="22"/>
+          <w:lang w:val="en-US"/>
+        </w:rPr>
+      </w:pPr>
+      <w:r>
+        <w:rPr>
+          <w:sz w:val="24"/>
+          <w:szCs w:val="22"/>
+          <w:lang w:val="en-US"/>
+        </w:rPr>
+        <w:br w:type="page"/>
+      </w:r>
+    </w:p>
+    <w:p>
+      <w:pPr>
+        <w:rPr>
+          <w:b/>
+          <w:bCs/>
+          <w:sz w:val="24"/>
+          <w:szCs w:val="22"/>
+          <w:lang w:val="en-US"/>
+        </w:rPr>
+      </w:pPr>
+      <w:r>
+        <w:rPr>
+          <w:b/>
+          <w:bCs/>
+          <w:sz w:val="24"/>
+          <w:szCs w:val="22"/>
+          <w:lang w:val="en-US"/>
+        </w:rPr>
+        <w:lastRenderedPageBreak/>
+        <w:t>BDD Approach (Behavior Driven Development)</w:t>
+      </w:r>
+    </w:p>
+    <w:p>
+      <w:pPr>
         <w:pStyle w:val="ListParagraph"/>
         <w:numPr>
           <w:ilvl w:val="0"/>
-          <w:numId w:val="33"/>
-        </w:numPr>
-        <w:rPr>
-          <w:sz w:val="24"/>
-          <w:szCs w:val="22"/>
-          <w:lang w:val="en-US"/>
-        </w:rPr>
-      </w:pPr>
+          <w:numId w:val="34"/>
+        </w:numPr>
+        <w:rPr>
+          <w:sz w:val="24"/>
+          <w:szCs w:val="22"/>
+          <w:lang w:val="en-US"/>
+        </w:rPr>
+      </w:pPr>
+      <w:r>
+        <w:rPr>
+          <w:sz w:val="24"/>
+          <w:szCs w:val="22"/>
+          <w:lang w:val="en-US"/>
+        </w:rPr>
+        <w:t>BA, Developer &amp; QA team will gather the requirements.</w:t>
+      </w:r>
+    </w:p>
+    <w:p>
+      <w:pPr>
+        <w:pStyle w:val="ListParagraph"/>
+        <w:numPr>
+          <w:ilvl w:val="0"/>
+          <w:numId w:val="34"/>
+        </w:numPr>
+        <w:rPr>
+          <w:sz w:val="24"/>
+          <w:szCs w:val="22"/>
+          <w:lang w:val="en-US"/>
+        </w:rPr>
+      </w:pPr>
+      <w:r>
+        <w:rPr>
+          <w:sz w:val="24"/>
+          <w:szCs w:val="22"/>
+          <w:lang w:val="en-US"/>
+        </w:rPr>
+        <w:t xml:space="preserve">Requirements will be shared with QA team and QA team will create </w:t>
+      </w:r>
+      <w:r>
+        <w:rPr>
+          <w:b/>
+          <w:bCs/>
+          <w:sz w:val="24"/>
+          <w:szCs w:val="22"/>
+          <w:lang w:val="en-US"/>
+        </w:rPr>
+        <w:t>Feature file (1</w:t>
+      </w:r>
+      <w:r>
+        <w:rPr>
+          <w:b/>
+          <w:bCs/>
+          <w:sz w:val="24"/>
+          <w:szCs w:val="22"/>
+          <w:vertAlign w:val="superscript"/>
+          <w:lang w:val="en-US"/>
+        </w:rPr>
+        <w:t>st</w:t>
+      </w:r>
+      <w:r>
+        <w:rPr>
+          <w:b/>
+          <w:bCs/>
+          <w:sz w:val="24"/>
+          <w:szCs w:val="22"/>
+          <w:lang w:val="en-US"/>
+        </w:rPr>
+        <w:t xml:space="preserve"> component of BDD)</w:t>
+      </w:r>
+    </w:p>
+    <w:p>
+      <w:pPr>
+        <w:pStyle w:val="ListParagraph"/>
+        <w:numPr>
+          <w:ilvl w:val="0"/>
+          <w:numId w:val="34"/>
+        </w:numPr>
+        <w:rPr>
+          <w:sz w:val="24"/>
+          <w:szCs w:val="22"/>
+          <w:lang w:val="en-US"/>
+        </w:rPr>
+      </w:pPr>
+      <w:r>
+        <w:rPr>
+          <w:sz w:val="24"/>
+          <w:szCs w:val="22"/>
+          <w:lang w:val="en-US"/>
+        </w:rPr>
+        <w:t>The feature file will be shared with</w:t>
+      </w:r>
+    </w:p>
+    <w:p>
+      <w:pPr>
+        <w:pStyle w:val="ListParagraph"/>
+        <w:numPr>
+          <w:ilvl w:val="1"/>
+          <w:numId w:val="34"/>
+        </w:numPr>
+        <w:rPr>
+          <w:sz w:val="24"/>
+          <w:szCs w:val="22"/>
+          <w:lang w:val="en-US"/>
+        </w:rPr>
+      </w:pPr>
+      <w:r>
+        <w:rPr>
+          <w:sz w:val="24"/>
+          <w:szCs w:val="22"/>
+          <w:lang w:val="en-US"/>
+        </w:rPr>
+        <w:t xml:space="preserve">Developer </w:t>
+      </w:r>
+    </w:p>
+    <w:p>
+      <w:pPr>
+        <w:pStyle w:val="ListParagraph"/>
+        <w:numPr>
+          <w:ilvl w:val="1"/>
+          <w:numId w:val="34"/>
+        </w:numPr>
+        <w:rPr>
+          <w:sz w:val="24"/>
+          <w:szCs w:val="22"/>
+          <w:lang w:val="en-US"/>
+        </w:rPr>
+      </w:pPr>
+      <w:r>
+        <w:rPr>
+          <w:sz w:val="24"/>
+          <w:szCs w:val="22"/>
+          <w:lang w:val="en-US"/>
+        </w:rPr>
+        <w:t>Manual Tester</w:t>
+      </w:r>
+    </w:p>
+    <w:p>
+      <w:pPr>
+        <w:pStyle w:val="ListParagraph"/>
+        <w:numPr>
+          <w:ilvl w:val="1"/>
+          <w:numId w:val="34"/>
+        </w:numPr>
+        <w:rPr>
+          <w:sz w:val="24"/>
+          <w:szCs w:val="22"/>
+          <w:lang w:val="en-US"/>
+        </w:rPr>
+      </w:pPr>
+      <w:r>
+        <w:rPr>
+          <w:sz w:val="24"/>
+          <w:szCs w:val="22"/>
+          <w:lang w:val="en-US"/>
+        </w:rPr>
+        <w:t>Automation Tester</w:t>
+      </w:r>
+    </w:p>
+    <w:p>
+      <w:pPr>
+        <w:pStyle w:val="ListParagraph"/>
+        <w:numPr>
+          <w:ilvl w:val="0"/>
+          <w:numId w:val="34"/>
+        </w:numPr>
+        <w:rPr>
+          <w:sz w:val="24"/>
+          <w:szCs w:val="22"/>
+          <w:lang w:val="en-US"/>
+        </w:rPr>
+      </w:pPr>
+      <w:r>
+        <w:rPr>
+          <w:sz w:val="24"/>
+          <w:szCs w:val="22"/>
+          <w:lang w:val="en-US"/>
+        </w:rPr>
+        <w:t>Automation tester will execute this feature file.</w:t>
+      </w:r>
+    </w:p>
+    <w:p>
+      <w:pPr>
+        <w:pStyle w:val="ListParagraph"/>
+        <w:numPr>
+          <w:ilvl w:val="0"/>
+          <w:numId w:val="34"/>
+        </w:numPr>
+        <w:rPr>
+          <w:sz w:val="24"/>
+          <w:szCs w:val="22"/>
+          <w:lang w:val="en-US"/>
+        </w:rPr>
+      </w:pPr>
+      <w:r>
+        <w:rPr>
+          <w:sz w:val="24"/>
+          <w:szCs w:val="22"/>
+          <w:lang w:val="en-US"/>
+        </w:rPr>
+        <w:t xml:space="preserve">After execution automation tester will get </w:t>
+      </w:r>
+      <w:r>
+        <w:rPr>
+          <w:b/>
+          <w:bCs/>
+          <w:sz w:val="24"/>
+          <w:szCs w:val="22"/>
+          <w:lang w:val="en-US"/>
+        </w:rPr>
+        <w:t>Step Definition / Glue Code (2</w:t>
+      </w:r>
+      <w:r>
+        <w:rPr>
+          <w:b/>
+          <w:bCs/>
+          <w:sz w:val="24"/>
+          <w:szCs w:val="22"/>
+          <w:vertAlign w:val="superscript"/>
+          <w:lang w:val="en-US"/>
+        </w:rPr>
+        <w:t>nd</w:t>
+      </w:r>
+      <w:r>
+        <w:rPr>
+          <w:b/>
+          <w:bCs/>
+          <w:sz w:val="24"/>
+          <w:szCs w:val="22"/>
+          <w:lang w:val="en-US"/>
+        </w:rPr>
+        <w:t xml:space="preserve"> Component of BDD)</w:t>
+      </w:r>
+    </w:p>
+    <w:p>
+      <w:pPr>
+        <w:pStyle w:val="ListParagraph"/>
+        <w:numPr>
+          <w:ilvl w:val="0"/>
+          <w:numId w:val="34"/>
+        </w:numPr>
+        <w:rPr>
+          <w:sz w:val="24"/>
+          <w:szCs w:val="22"/>
+          <w:lang w:val="en-US"/>
+        </w:rPr>
+      </w:pPr>
+      <w:r>
+        <w:rPr>
+          <w:b/>
+          <w:bCs/>
+          <w:sz w:val="24"/>
+          <w:szCs w:val="22"/>
+          <w:lang w:val="en-US"/>
+        </w:rPr>
+        <w:t>Runner Class (3</w:t>
+      </w:r>
+      <w:r>
+        <w:rPr>
+          <w:b/>
+          <w:bCs/>
+          <w:sz w:val="24"/>
+          <w:szCs w:val="22"/>
+          <w:vertAlign w:val="superscript"/>
+          <w:lang w:val="en-US"/>
+        </w:rPr>
+        <w:t>rd</w:t>
+      </w:r>
+      <w:r>
+        <w:rPr>
+          <w:b/>
+          <w:bCs/>
+          <w:sz w:val="24"/>
+          <w:szCs w:val="22"/>
+          <w:lang w:val="en-US"/>
+        </w:rPr>
+        <w:t xml:space="preserve"> Component of BDD) </w:t>
+      </w:r>
+      <w:r>
+        <w:rPr>
+          <w:sz w:val="24"/>
+          <w:szCs w:val="22"/>
+          <w:lang w:val="en-US"/>
+        </w:rPr>
+        <w:t>used to execute the automation code.</w:t>
+      </w:r>
+    </w:p>
+    <w:p>
+      <w:pPr>
+        <w:rPr>
+          <w:sz w:val="24"/>
+          <w:szCs w:val="22"/>
+          <w:lang w:val="en-US"/>
+        </w:rPr>
+      </w:pPr>
+    </w:p>
+    <w:p>
+      <w:pPr>
+        <w:rPr>
+          <w:b/>
+          <w:bCs/>
+          <w:sz w:val="24"/>
+          <w:szCs w:val="22"/>
+          <w:lang w:val="en-US"/>
+        </w:rPr>
+      </w:pPr>
+      <w:r>
+        <w:rPr>
+          <w:b/>
+          <w:bCs/>
+          <w:sz w:val="24"/>
+          <w:szCs w:val="22"/>
+          <w:lang w:val="en-US"/>
+        </w:rPr>
+        <w:t>Feature File</w:t>
+      </w:r>
+    </w:p>
+    <w:p>
+      <w:pPr>
+        <w:pStyle w:val="ListParagraph"/>
+        <w:numPr>
+          <w:ilvl w:val="0"/>
+          <w:numId w:val="35"/>
+        </w:numPr>
+        <w:rPr>
+          <w:sz w:val="24"/>
+          <w:szCs w:val="22"/>
+          <w:lang w:val="en-US"/>
+        </w:rPr>
+      </w:pPr>
+      <w:r>
+        <w:rPr>
+          <w:sz w:val="24"/>
+          <w:szCs w:val="22"/>
+          <w:lang w:val="en-US"/>
+        </w:rPr>
+        <w:t>It is collection of test scenarios.</w:t>
+      </w:r>
+    </w:p>
+    <w:p>
+      <w:pPr>
+        <w:pStyle w:val="ListParagraph"/>
+        <w:numPr>
+          <w:ilvl w:val="0"/>
+          <w:numId w:val="35"/>
+        </w:numPr>
+        <w:rPr>
+          <w:sz w:val="24"/>
+          <w:szCs w:val="22"/>
+          <w:lang w:val="en-US"/>
+        </w:rPr>
+      </w:pPr>
+      <w:r>
+        <w:rPr>
+          <w:sz w:val="24"/>
+          <w:szCs w:val="22"/>
+          <w:lang w:val="en-US"/>
+        </w:rPr>
+        <w:t xml:space="preserve">Created using Gherkin language / syntax </w:t>
+      </w:r>
+    </w:p>
+    <w:p>
+      <w:pPr>
+        <w:pStyle w:val="ListParagraph"/>
+        <w:numPr>
+          <w:ilvl w:val="0"/>
+          <w:numId w:val="35"/>
+        </w:numPr>
+        <w:rPr>
+          <w:sz w:val="24"/>
+          <w:szCs w:val="22"/>
+          <w:lang w:val="en-US"/>
+        </w:rPr>
+      </w:pPr>
+      <w:r>
+        <w:rPr>
+          <w:sz w:val="24"/>
+          <w:szCs w:val="22"/>
+          <w:lang w:val="en-US"/>
+        </w:rPr>
+        <w:t>Keywords are used to create feature file</w:t>
+      </w:r>
+    </w:p>
+    <w:p>
+      <w:pPr>
+        <w:pStyle w:val="ListParagraph"/>
+        <w:numPr>
+          <w:ilvl w:val="1"/>
+          <w:numId w:val="35"/>
+        </w:numPr>
+        <w:rPr>
+          <w:sz w:val="24"/>
+          <w:szCs w:val="22"/>
+          <w:lang w:val="en-US"/>
+        </w:rPr>
+      </w:pPr>
+      <w:r>
+        <w:rPr>
+          <w:sz w:val="24"/>
+          <w:szCs w:val="22"/>
+          <w:lang w:val="en-US"/>
+        </w:rPr>
+        <w:t xml:space="preserve">Feature: </w:t>
+      </w:r>
+      <w:r>
+        <w:rPr>
+          <w:sz w:val="24"/>
+          <w:szCs w:val="22"/>
+          <w:lang w:val="en-US"/>
+        </w:rPr>
+        <w:sym w:font="Wingdings" w:char="F0E0"/>
+      </w:r>
+      <w:r>
+        <w:rPr>
+          <w:sz w:val="24"/>
+          <w:szCs w:val="22"/>
+          <w:lang w:val="en-US"/>
+        </w:rPr>
+        <w:t xml:space="preserve"> Represents requirement</w:t>
+      </w:r>
+    </w:p>
+    <w:p>
+      <w:pPr>
+        <w:pStyle w:val="ListParagraph"/>
+        <w:numPr>
+          <w:ilvl w:val="1"/>
+          <w:numId w:val="35"/>
+        </w:numPr>
+        <w:rPr>
+          <w:sz w:val="24"/>
+          <w:szCs w:val="22"/>
+          <w:lang w:val="en-US"/>
+        </w:rPr>
+      </w:pPr>
+      <w:r>
+        <w:rPr>
+          <w:sz w:val="24"/>
+          <w:szCs w:val="22"/>
+          <w:lang w:val="en-US"/>
+        </w:rPr>
+        <w:t xml:space="preserve">Scenario: </w:t>
+      </w:r>
+      <w:r>
+        <w:rPr>
+          <w:sz w:val="24"/>
+          <w:szCs w:val="22"/>
+          <w:lang w:val="en-US"/>
+        </w:rPr>
+        <w:sym w:font="Wingdings" w:char="F0E0"/>
+      </w:r>
+      <w:r>
+        <w:rPr>
+          <w:sz w:val="24"/>
+          <w:szCs w:val="22"/>
+          <w:lang w:val="en-US"/>
+        </w:rPr>
+        <w:t xml:space="preserve"> Represents Test case Objective</w:t>
+      </w:r>
+    </w:p>
+    <w:p>
+      <w:pPr>
+        <w:pStyle w:val="ListParagraph"/>
+        <w:numPr>
+          <w:ilvl w:val="1"/>
+          <w:numId w:val="35"/>
+        </w:numPr>
+        <w:rPr>
+          <w:sz w:val="24"/>
+          <w:szCs w:val="22"/>
+          <w:lang w:val="en-US"/>
+        </w:rPr>
+      </w:pPr>
+      <w:r>
+        <w:rPr>
+          <w:sz w:val="24"/>
+          <w:szCs w:val="22"/>
+          <w:lang w:val="en-US"/>
+        </w:rPr>
+        <w:t xml:space="preserve">Given </w:t>
+      </w:r>
+      <w:r>
+        <w:rPr>
+          <w:sz w:val="24"/>
+          <w:szCs w:val="22"/>
+          <w:lang w:val="en-US"/>
+        </w:rPr>
+        <w:sym w:font="Wingdings" w:char="F0E0"/>
+      </w:r>
+      <w:r>
+        <w:rPr>
+          <w:sz w:val="24"/>
+          <w:szCs w:val="22"/>
+          <w:lang w:val="en-US"/>
+        </w:rPr>
+        <w:t xml:space="preserve"> Represents pre-requisite</w:t>
+      </w:r>
+    </w:p>
+    <w:p>
+      <w:pPr>
+        <w:pStyle w:val="ListParagraph"/>
+        <w:numPr>
+          <w:ilvl w:val="1"/>
+          <w:numId w:val="35"/>
+        </w:numPr>
+        <w:rPr>
+          <w:sz w:val="24"/>
+          <w:szCs w:val="22"/>
+          <w:lang w:val="en-US"/>
+        </w:rPr>
+      </w:pPr>
+      <w:r>
+        <w:rPr>
+          <w:sz w:val="24"/>
+          <w:szCs w:val="22"/>
+          <w:lang w:val="en-US"/>
+        </w:rPr>
+        <w:t xml:space="preserve">When </w:t>
+      </w:r>
+      <w:r>
+        <w:rPr>
+          <w:sz w:val="24"/>
+          <w:szCs w:val="22"/>
+          <w:lang w:val="en-US"/>
+        </w:rPr>
+        <w:sym w:font="Wingdings" w:char="F0E0"/>
+      </w:r>
+      <w:r>
+        <w:rPr>
+          <w:sz w:val="24"/>
+          <w:szCs w:val="22"/>
+          <w:lang w:val="en-US"/>
+        </w:rPr>
+        <w:t xml:space="preserve"> Represents steps to be implemented </w:t>
+      </w:r>
+    </w:p>
+    <w:p>
+      <w:pPr>
+        <w:pStyle w:val="ListParagraph"/>
+        <w:numPr>
+          <w:ilvl w:val="1"/>
+          <w:numId w:val="35"/>
+        </w:numPr>
+        <w:rPr>
+          <w:sz w:val="24"/>
+          <w:szCs w:val="22"/>
+          <w:lang w:val="en-US"/>
+        </w:rPr>
+      </w:pPr>
+      <w:r>
+        <w:rPr>
+          <w:sz w:val="24"/>
+          <w:szCs w:val="22"/>
+          <w:lang w:val="en-US"/>
+        </w:rPr>
+        <w:t xml:space="preserve">And </w:t>
+      </w:r>
+      <w:r>
+        <w:rPr>
+          <w:sz w:val="24"/>
+          <w:szCs w:val="22"/>
+          <w:lang w:val="en-US"/>
+        </w:rPr>
+        <w:sym w:font="Wingdings" w:char="F0E0"/>
+      </w:r>
+      <w:r>
+        <w:rPr>
+          <w:sz w:val="24"/>
+          <w:szCs w:val="22"/>
+          <w:lang w:val="en-US"/>
+        </w:rPr>
+        <w:t xml:space="preserve"> To combine multiple When statements</w:t>
+      </w:r>
+    </w:p>
+    <w:p>
+      <w:pPr>
+        <w:pStyle w:val="ListParagraph"/>
+        <w:numPr>
+          <w:ilvl w:val="1"/>
+          <w:numId w:val="35"/>
+        </w:numPr>
+        <w:rPr>
+          <w:sz w:val="24"/>
+          <w:szCs w:val="22"/>
+          <w:lang w:val="en-US"/>
+        </w:rPr>
+      </w:pPr>
+      <w:r>
+        <w:rPr>
+          <w:sz w:val="24"/>
+          <w:szCs w:val="22"/>
+          <w:lang w:val="en-US"/>
+        </w:rPr>
+        <w:t xml:space="preserve">Then </w:t>
+      </w:r>
+      <w:r>
+        <w:rPr>
+          <w:sz w:val="24"/>
+          <w:szCs w:val="22"/>
+          <w:lang w:val="en-US"/>
+        </w:rPr>
+        <w:sym w:font="Wingdings" w:char="F0E0"/>
+      </w:r>
+      <w:r>
+        <w:rPr>
+          <w:sz w:val="24"/>
+          <w:szCs w:val="22"/>
+          <w:lang w:val="en-US"/>
+        </w:rPr>
+        <w:t xml:space="preserve"> Represents expected result</w:t>
+      </w:r>
+    </w:p>
+    <w:p>
+      <w:pPr>
+        <w:pStyle w:val="ListParagraph"/>
+        <w:numPr>
+          <w:ilvl w:val="1"/>
+          <w:numId w:val="35"/>
+        </w:numPr>
+        <w:rPr>
+          <w:sz w:val="24"/>
+          <w:szCs w:val="22"/>
+          <w:lang w:val="en-US"/>
+        </w:rPr>
+      </w:pPr>
+      <w:r>
+        <w:rPr>
+          <w:sz w:val="24"/>
+          <w:szCs w:val="22"/>
+          <w:lang w:val="en-US"/>
+        </w:rPr>
+        <w:t xml:space="preserve">Background: </w:t>
+      </w:r>
+      <w:r>
+        <w:rPr>
+          <w:sz w:val="24"/>
+          <w:szCs w:val="22"/>
+          <w:lang w:val="en-US"/>
+        </w:rPr>
+        <w:sym w:font="Wingdings" w:char="F0E0"/>
+      </w:r>
+      <w:r>
+        <w:rPr>
+          <w:sz w:val="24"/>
+          <w:szCs w:val="22"/>
+          <w:lang w:val="en-US"/>
+        </w:rPr>
+        <w:t xml:space="preserve"> To avoid multiple </w:t>
+      </w:r>
+      <w:proofErr w:type="gramStart"/>
+      <w:r>
+        <w:rPr>
+          <w:sz w:val="24"/>
+          <w:szCs w:val="22"/>
+          <w:lang w:val="en-US"/>
+        </w:rPr>
+        <w:t>Given</w:t>
+      </w:r>
+      <w:proofErr w:type="gramEnd"/>
+      <w:r>
+        <w:rPr>
+          <w:sz w:val="24"/>
+          <w:szCs w:val="22"/>
+          <w:lang w:val="en-US"/>
+        </w:rPr>
+        <w:t xml:space="preserve"> statements.</w:t>
+      </w:r>
+    </w:p>
+    <w:p>
+      <w:pPr>
+        <w:pStyle w:val="ListParagraph"/>
+        <w:numPr>
+          <w:ilvl w:val="1"/>
+          <w:numId w:val="35"/>
+        </w:numPr>
+        <w:rPr>
+          <w:sz w:val="24"/>
+          <w:szCs w:val="22"/>
+          <w:lang w:val="en-US"/>
+        </w:rPr>
+      </w:pPr>
+      <w:r>
+        <w:rPr>
+          <w:sz w:val="24"/>
+          <w:szCs w:val="22"/>
+          <w:lang w:val="en-US"/>
+        </w:rPr>
+        <w:t xml:space="preserve">Examples: </w:t>
+      </w:r>
+      <w:r>
+        <w:rPr>
+          <w:sz w:val="24"/>
+          <w:szCs w:val="22"/>
+          <w:lang w:val="en-US"/>
+        </w:rPr>
+        <w:sym w:font="Wingdings" w:char="F0E0"/>
+      </w:r>
+      <w:r>
+        <w:rPr>
+          <w:sz w:val="24"/>
+          <w:szCs w:val="22"/>
+          <w:lang w:val="en-US"/>
+        </w:rPr>
+        <w:t xml:space="preserve"> Used for data driven testing</w:t>
+      </w:r>
+    </w:p>
+    <w:p>
+      <w:pPr>
+        <w:pStyle w:val="ListParagraph"/>
+        <w:numPr>
+          <w:ilvl w:val="1"/>
+          <w:numId w:val="35"/>
+        </w:numPr>
+        <w:rPr>
+          <w:sz w:val="24"/>
+          <w:szCs w:val="22"/>
+          <w:lang w:val="en-US"/>
+        </w:rPr>
+      </w:pPr>
+      <w:r>
+        <w:rPr>
+          <w:sz w:val="24"/>
+          <w:szCs w:val="22"/>
+          <w:lang w:val="en-US"/>
+        </w:rPr>
+        <w:t xml:space="preserve">Scenario Outline: </w:t>
+      </w:r>
+      <w:r>
+        <w:rPr>
+          <w:sz w:val="24"/>
+          <w:szCs w:val="22"/>
+          <w:lang w:val="en-US"/>
+        </w:rPr>
+        <w:sym w:font="Wingdings" w:char="F0E0"/>
+      </w:r>
+      <w:r>
+        <w:rPr>
+          <w:sz w:val="24"/>
+          <w:szCs w:val="22"/>
+          <w:lang w:val="en-US"/>
+        </w:rPr>
+        <w:t xml:space="preserve"> Used for data driven testing with Examples:</w:t>
+      </w:r>
+    </w:p>
+    <w:p>
+      <w:pPr>
+        <w:pBdr>
+          <w:bottom w:val="single" w:sz="6" w:space="1" w:color="auto"/>
+        </w:pBdr>
+        <w:rPr>
+          <w:sz w:val="24"/>
+          <w:szCs w:val="22"/>
+          <w:lang w:val="en-US"/>
+        </w:rPr>
+      </w:pPr>
+    </w:p>
+    <w:p>
+      <w:pPr>
+        <w:rPr>
+          <w:sz w:val="24"/>
+          <w:szCs w:val="22"/>
+          <w:lang w:val="en-US"/>
+        </w:rPr>
+      </w:pPr>
+      <w:r>
+        <w:rPr>
+          <w:sz w:val="24"/>
+          <w:szCs w:val="22"/>
+          <w:lang w:val="en-US"/>
+        </w:rPr>
+        <w:t>Requirement – Validate Google title</w:t>
+      </w:r>
+    </w:p>
+    <w:p>
+      <w:pPr>
+        <w:pStyle w:val="ListParagraph"/>
+        <w:numPr>
+          <w:ilvl w:val="0"/>
+          <w:numId w:val="36"/>
+        </w:numPr>
+        <w:rPr>
+          <w:sz w:val="24"/>
+          <w:szCs w:val="22"/>
+          <w:lang w:val="en-US"/>
+        </w:rPr>
+      </w:pPr>
+      <w:r>
+        <w:rPr>
+          <w:sz w:val="24"/>
+          <w:szCs w:val="22"/>
+          <w:lang w:val="en-US"/>
+        </w:rPr>
+        <w:t>Open Google</w:t>
+      </w:r>
+    </w:p>
+    <w:p>
+      <w:pPr>
+        <w:pStyle w:val="ListParagraph"/>
+        <w:numPr>
+          <w:ilvl w:val="0"/>
+          <w:numId w:val="36"/>
+        </w:numPr>
+        <w:rPr>
+          <w:sz w:val="24"/>
+          <w:szCs w:val="22"/>
+          <w:lang w:val="en-US"/>
+        </w:rPr>
+      </w:pPr>
+      <w:r>
+        <w:rPr>
+          <w:sz w:val="24"/>
+          <w:szCs w:val="22"/>
+          <w:lang w:val="en-US"/>
+        </w:rPr>
+        <w:t>Read title</w:t>
+      </w:r>
+    </w:p>
+    <w:p>
+      <w:pPr>
+        <w:pStyle w:val="ListParagraph"/>
+        <w:numPr>
+          <w:ilvl w:val="0"/>
+          <w:numId w:val="36"/>
+        </w:numPr>
+        <w:rPr>
+          <w:sz w:val="24"/>
+          <w:szCs w:val="22"/>
+          <w:lang w:val="en-US"/>
+        </w:rPr>
+      </w:pPr>
+      <w:r>
+        <w:rPr>
+          <w:sz w:val="24"/>
+          <w:szCs w:val="22"/>
+          <w:lang w:val="en-US"/>
+        </w:rPr>
+        <w:t>Validate title as Google</w:t>
+      </w:r>
+    </w:p>
+    <w:p>
+      <w:pPr>
+        <w:rPr>
+          <w:sz w:val="24"/>
+          <w:szCs w:val="22"/>
+          <w:lang w:val="en-US"/>
+        </w:rPr>
+      </w:pPr>
+      <w:r>
+        <w:rPr>
+          <w:sz w:val="24"/>
+          <w:szCs w:val="22"/>
+          <w:lang w:val="en-US"/>
+        </w:rPr>
+        <w:t>Features File</w:t>
+      </w:r>
+    </w:p>
+    <w:p>
+      <w:pPr>
+        <w:rPr>
+          <w:sz w:val="24"/>
+          <w:szCs w:val="22"/>
+          <w:lang w:val="en-US"/>
+        </w:rPr>
+      </w:pPr>
+      <w:r>
+        <w:rPr>
+          <w:sz w:val="24"/>
+          <w:szCs w:val="22"/>
+          <w:lang w:val="en-US"/>
+        </w:rPr>
+        <w:t>Feature: Validate Google title</w:t>
+      </w:r>
+    </w:p>
+    <w:p>
+      <w:pPr>
+        <w:rPr>
+          <w:sz w:val="24"/>
+          <w:szCs w:val="22"/>
+          <w:lang w:val="en-US"/>
+        </w:rPr>
+      </w:pPr>
+      <w:r>
+        <w:rPr>
+          <w:sz w:val="24"/>
+          <w:szCs w:val="22"/>
+          <w:lang w:val="en-US"/>
+        </w:rPr>
+        <w:t>Scenario: To validate title of Google</w:t>
+      </w:r>
+    </w:p>
+    <w:p>
+      <w:pPr>
+        <w:rPr>
+          <w:sz w:val="24"/>
+          <w:szCs w:val="22"/>
+          <w:lang w:val="en-US"/>
+        </w:rPr>
+      </w:pPr>
+      <w:r>
+        <w:rPr>
+          <w:sz w:val="24"/>
+          <w:szCs w:val="22"/>
+          <w:lang w:val="en-US"/>
+        </w:rPr>
+        <w:t>Given Open Google</w:t>
+      </w:r>
+    </w:p>
+    <w:p>
+      <w:pPr>
+        <w:rPr>
+          <w:sz w:val="24"/>
+          <w:szCs w:val="22"/>
+          <w:lang w:val="en-US"/>
+        </w:rPr>
+      </w:pPr>
+      <w:r>
+        <w:rPr>
+          <w:sz w:val="24"/>
+          <w:szCs w:val="22"/>
+          <w:lang w:val="en-US"/>
+        </w:rPr>
+        <w:t>When Read the title</w:t>
+      </w:r>
+    </w:p>
+    <w:p>
+      <w:pPr>
+        <w:pBdr>
+          <w:bottom w:val="single" w:sz="6" w:space="1" w:color="auto"/>
+        </w:pBdr>
+        <w:rPr>
+          <w:sz w:val="24"/>
+          <w:szCs w:val="22"/>
+          <w:lang w:val="en-US"/>
+        </w:rPr>
+      </w:pPr>
+      <w:r>
+        <w:rPr>
+          <w:sz w:val="24"/>
+          <w:szCs w:val="22"/>
+          <w:lang w:val="en-US"/>
+        </w:rPr>
+        <w:t>Then Title should be Google</w:t>
+      </w:r>
+    </w:p>
+    <w:p>
+      <w:pPr>
+        <w:rPr>
+          <w:sz w:val="24"/>
+          <w:szCs w:val="22"/>
+          <w:lang w:val="en-US"/>
+        </w:rPr>
+      </w:pPr>
+      <w:r>
+        <w:rPr>
+          <w:sz w:val="24"/>
+          <w:szCs w:val="22"/>
+          <w:lang w:val="en-US"/>
+        </w:rPr>
+        <w:lastRenderedPageBreak/>
+        <w:t>Requirement – Search functionality on Google</w:t>
+      </w:r>
+    </w:p>
+    <w:p>
+      <w:pPr>
+        <w:pStyle w:val="ListParagraph"/>
+        <w:numPr>
+          <w:ilvl w:val="0"/>
+          <w:numId w:val="37"/>
+        </w:numPr>
+        <w:rPr>
+          <w:sz w:val="24"/>
+          <w:szCs w:val="22"/>
+          <w:lang w:val="en-US"/>
+        </w:rPr>
+      </w:pPr>
+      <w:r>
+        <w:rPr>
+          <w:sz w:val="24"/>
+          <w:szCs w:val="22"/>
+          <w:lang w:val="en-US"/>
+        </w:rPr>
+        <w:t>Open Google</w:t>
+      </w:r>
+    </w:p>
+    <w:p>
+      <w:pPr>
+        <w:pStyle w:val="ListParagraph"/>
+        <w:numPr>
+          <w:ilvl w:val="0"/>
+          <w:numId w:val="37"/>
+        </w:numPr>
+        <w:rPr>
+          <w:sz w:val="24"/>
+          <w:szCs w:val="22"/>
+          <w:lang w:val="en-US"/>
+        </w:rPr>
+      </w:pPr>
+      <w:r>
+        <w:rPr>
+          <w:sz w:val="24"/>
+          <w:szCs w:val="22"/>
+          <w:lang w:val="en-US"/>
+        </w:rPr>
+        <w:t>Enter text to search</w:t>
+      </w:r>
+    </w:p>
+    <w:p>
+      <w:pPr>
+        <w:pStyle w:val="ListParagraph"/>
+        <w:numPr>
+          <w:ilvl w:val="0"/>
+          <w:numId w:val="37"/>
+        </w:numPr>
+        <w:rPr>
+          <w:sz w:val="24"/>
+          <w:szCs w:val="22"/>
+          <w:lang w:val="en-US"/>
+        </w:rPr>
+      </w:pPr>
+      <w:r>
+        <w:rPr>
+          <w:sz w:val="24"/>
+          <w:szCs w:val="22"/>
+          <w:lang w:val="en-US"/>
+        </w:rPr>
+        <w:t>Hit Enter</w:t>
+      </w:r>
+    </w:p>
+    <w:p>
+      <w:pPr>
+        <w:pStyle w:val="ListParagraph"/>
+        <w:numPr>
+          <w:ilvl w:val="0"/>
+          <w:numId w:val="37"/>
+        </w:numPr>
+        <w:rPr>
+          <w:sz w:val="24"/>
+          <w:szCs w:val="22"/>
+          <w:lang w:val="en-US"/>
+        </w:rPr>
+      </w:pPr>
+      <w:r>
+        <w:rPr>
+          <w:sz w:val="24"/>
+          <w:szCs w:val="22"/>
+          <w:lang w:val="en-US"/>
+        </w:rPr>
+        <w:t>Valid search result should display</w:t>
+      </w:r>
+    </w:p>
+    <w:p>
+      <w:pPr>
+        <w:rPr>
+          <w:sz w:val="24"/>
+          <w:szCs w:val="22"/>
+          <w:lang w:val="en-US"/>
+        </w:rPr>
+      </w:pPr>
+      <w:r>
+        <w:rPr>
+          <w:sz w:val="24"/>
+          <w:szCs w:val="22"/>
+          <w:lang w:val="en-US"/>
+        </w:rPr>
+        <w:t>Feature File</w:t>
+      </w:r>
+    </w:p>
+    <w:p>
+      <w:pPr>
+        <w:rPr>
+          <w:sz w:val="24"/>
+          <w:szCs w:val="22"/>
+          <w:lang w:val="en-US"/>
+        </w:rPr>
+      </w:pPr>
+      <w:r>
+        <w:rPr>
+          <w:sz w:val="24"/>
+          <w:szCs w:val="22"/>
+          <w:lang w:val="en-US"/>
+        </w:rPr>
+        <w:t>Feature: Search functionality on Google</w:t>
+      </w:r>
+    </w:p>
+    <w:p>
+      <w:pPr>
+        <w:rPr>
+          <w:sz w:val="24"/>
+          <w:szCs w:val="22"/>
+          <w:lang w:val="en-US"/>
+        </w:rPr>
+      </w:pPr>
+      <w:r>
+        <w:rPr>
+          <w:sz w:val="24"/>
+          <w:szCs w:val="22"/>
+          <w:lang w:val="en-US"/>
+        </w:rPr>
+        <w:t>Scenario: To validate search functionality on Google</w:t>
+      </w:r>
+    </w:p>
+    <w:p>
+      <w:pPr>
+        <w:rPr>
+          <w:sz w:val="24"/>
+          <w:szCs w:val="22"/>
+          <w:lang w:val="en-US"/>
+        </w:rPr>
+      </w:pPr>
+      <w:r>
+        <w:rPr>
+          <w:sz w:val="24"/>
+          <w:szCs w:val="22"/>
+          <w:lang w:val="en-US"/>
+        </w:rPr>
+        <w:t>Given Launch Google</w:t>
+      </w:r>
+    </w:p>
+    <w:p>
+      <w:pPr>
+        <w:rPr>
+          <w:sz w:val="24"/>
+          <w:szCs w:val="22"/>
+          <w:lang w:val="en-US"/>
+        </w:rPr>
+      </w:pPr>
+      <w:r>
+        <w:rPr>
+          <w:sz w:val="24"/>
+          <w:szCs w:val="22"/>
+          <w:lang w:val="en-US"/>
+        </w:rPr>
+        <w:t xml:space="preserve">When </w:t>
+      </w:r>
+      <w:proofErr w:type="gramStart"/>
+      <w:r>
+        <w:rPr>
+          <w:sz w:val="24"/>
+          <w:szCs w:val="22"/>
+          <w:lang w:val="en-US"/>
+        </w:rPr>
+        <w:t>Enter</w:t>
+      </w:r>
+      <w:proofErr w:type="gramEnd"/>
+      <w:r>
+        <w:rPr>
+          <w:sz w:val="24"/>
+          <w:szCs w:val="22"/>
+          <w:lang w:val="en-US"/>
+        </w:rPr>
+        <w:t xml:space="preserve"> text to be searched</w:t>
+      </w:r>
+    </w:p>
+    <w:p>
+      <w:pPr>
+        <w:rPr>
+          <w:sz w:val="24"/>
+          <w:szCs w:val="22"/>
+          <w:lang w:val="en-US"/>
+        </w:rPr>
+      </w:pPr>
+      <w:r>
+        <w:rPr>
+          <w:sz w:val="24"/>
+          <w:szCs w:val="22"/>
+          <w:lang w:val="en-US"/>
+        </w:rPr>
+        <w:t>And Hit Enter</w:t>
+      </w:r>
+    </w:p>
+    <w:p>
+      <w:pPr>
+        <w:rPr>
+          <w:sz w:val="24"/>
+          <w:szCs w:val="22"/>
+          <w:lang w:val="en-US"/>
+        </w:rPr>
+      </w:pPr>
+      <w:r>
+        <w:rPr>
+          <w:sz w:val="24"/>
+          <w:szCs w:val="22"/>
+          <w:lang w:val="en-US"/>
+        </w:rPr>
+        <w:t xml:space="preserve">Then </w:t>
+      </w:r>
+      <w:proofErr w:type="gramStart"/>
+      <w:r>
+        <w:rPr>
+          <w:sz w:val="24"/>
+          <w:szCs w:val="22"/>
+          <w:lang w:val="en-US"/>
+        </w:rPr>
+        <w:t>A</w:t>
+      </w:r>
+      <w:proofErr w:type="gramEnd"/>
+      <w:r>
+        <w:rPr>
+          <w:sz w:val="24"/>
+          <w:szCs w:val="22"/>
+          <w:lang w:val="en-US"/>
+        </w:rPr>
+        <w:t xml:space="preserve"> valid search result should display</w:t>
+      </w:r>
+    </w:p>
+    <w:p>
+      <w:pPr>
+        <w:rPr>
+          <w:sz w:val="24"/>
+          <w:szCs w:val="22"/>
+          <w:lang w:val="en-US"/>
+        </w:rPr>
+      </w:pPr>
+    </w:p>
+    <w:p>
+      <w:pPr>
+        <w:rPr>
+          <w:sz w:val="24"/>
+          <w:szCs w:val="22"/>
+          <w:lang w:val="en-US"/>
+        </w:rPr>
+      </w:pPr>
+    </w:p>
+    <w:p>
+      <w:pPr>
+        <w:rPr>
+          <w:sz w:val="24"/>
+          <w:szCs w:val="22"/>
+          <w:lang w:val="en-US"/>
+        </w:rPr>
+      </w:pPr>
+      <w:r>
+        <w:rPr>
+          <w:sz w:val="24"/>
+          <w:szCs w:val="22"/>
+          <w:lang w:val="en-US"/>
+        </w:rPr>
+        <w:t xml:space="preserve">Interesting types of </w:t>
+      </w:r>
+      <w:proofErr w:type="spellStart"/>
+      <w:r>
+        <w:rPr>
+          <w:sz w:val="24"/>
+          <w:szCs w:val="22"/>
+          <w:lang w:val="en-US"/>
+        </w:rPr>
+        <w:t>XPaths</w:t>
+      </w:r>
+      <w:proofErr w:type="spellEnd"/>
+    </w:p>
+    <w:p>
+      <w:pPr>
+        <w:rPr>
+          <w:sz w:val="24"/>
+          <w:szCs w:val="22"/>
+          <w:lang w:val="en-US"/>
+        </w:rPr>
+      </w:pPr>
+      <w:r>
+        <w:rPr>
+          <w:sz w:val="24"/>
+          <w:szCs w:val="22"/>
+          <w:lang w:val="en-US"/>
+        </w:rPr>
+        <w:t>//</w:t>
+      </w:r>
+      <w:proofErr w:type="gramStart"/>
+      <w:r>
+        <w:rPr>
+          <w:sz w:val="24"/>
+          <w:szCs w:val="22"/>
+          <w:lang w:val="en-US"/>
+        </w:rPr>
+        <w:t>span[</w:t>
+      </w:r>
+      <w:proofErr w:type="gramEnd"/>
+      <w:r>
+        <w:rPr>
+          <w:sz w:val="24"/>
+          <w:szCs w:val="22"/>
+          <w:lang w:val="en-US"/>
+        </w:rPr>
+        <w:t>contains(text(), "16")]</w:t>
+      </w:r>
+    </w:p>
+    <w:p>
+      <w:pPr>
+        <w:rPr>
+          <w:sz w:val="24"/>
+          <w:szCs w:val="22"/>
+          <w:lang w:val="en-US"/>
+        </w:rPr>
+      </w:pPr>
+      <w:r>
+        <w:rPr>
+          <w:sz w:val="24"/>
+          <w:szCs w:val="22"/>
+          <w:lang w:val="en-US"/>
+        </w:rPr>
+        <w:t>//</w:t>
+      </w:r>
+      <w:proofErr w:type="gramStart"/>
+      <w:r>
+        <w:rPr>
+          <w:sz w:val="24"/>
+          <w:szCs w:val="22"/>
+          <w:lang w:val="en-US"/>
+        </w:rPr>
+        <w:t>input[</w:t>
+      </w:r>
+      <w:proofErr w:type="gramEnd"/>
+      <w:r>
+        <w:rPr>
+          <w:sz w:val="24"/>
+          <w:szCs w:val="22"/>
+          <w:lang w:val="en-US"/>
+        </w:rPr>
+        <w:t>starts-with(@id, "txt")][1]</w:t>
+      </w:r>
+    </w:p>
+    <w:p>
+      <w:pPr>
+        <w:rPr>
+          <w:sz w:val="24"/>
+          <w:szCs w:val="22"/>
+          <w:lang w:val="en-US"/>
+        </w:rPr>
+      </w:pPr>
+      <w:r>
+        <w:rPr>
+          <w:sz w:val="24"/>
+          <w:szCs w:val="22"/>
+          <w:lang w:val="en-US"/>
+        </w:rPr>
+        <w:t>//</w:t>
+      </w:r>
+      <w:proofErr w:type="gramStart"/>
+      <w:r>
+        <w:rPr>
+          <w:sz w:val="24"/>
+          <w:szCs w:val="22"/>
+          <w:lang w:val="en-US"/>
+        </w:rPr>
+        <w:t>span[</w:t>
+      </w:r>
+      <w:proofErr w:type="gramEnd"/>
+      <w:r>
+        <w:rPr>
+          <w:sz w:val="24"/>
+          <w:szCs w:val="22"/>
+          <w:lang w:val="en-US"/>
+        </w:rPr>
+        <w:t>text()="Invalid Username/Password"]</w:t>
+      </w:r>
+    </w:p>
+    <w:p>
+      <w:pPr>
+        <w:rPr>
+          <w:sz w:val="24"/>
+          <w:szCs w:val="22"/>
+          <w:lang w:val="en-US"/>
+        </w:rPr>
+      </w:pPr>
+      <w:r>
+        <w:rPr>
+          <w:sz w:val="24"/>
+          <w:szCs w:val="22"/>
+          <w:lang w:val="en-US"/>
+        </w:rPr>
+        <w:t>//</w:t>
+      </w:r>
+      <w:proofErr w:type="gramStart"/>
+      <w:r>
+        <w:rPr>
+          <w:sz w:val="24"/>
+          <w:szCs w:val="22"/>
+          <w:lang w:val="en-US"/>
+        </w:rPr>
+        <w:t>input[</w:t>
+      </w:r>
+      <w:proofErr w:type="gramEnd"/>
+      <w:r>
+        <w:rPr>
+          <w:sz w:val="24"/>
+          <w:szCs w:val="22"/>
+          <w:lang w:val="en-US"/>
+        </w:rPr>
+        <w:t>contains(@id, "But")]</w:t>
+      </w:r>
+    </w:p>
+    <w:p>
+      <w:pPr>
+        <w:rPr>
+          <w:sz w:val="24"/>
+          <w:szCs w:val="22"/>
+          <w:lang w:val="en-US"/>
+        </w:rPr>
+      </w:pPr>
+      <w:r>
+        <w:rPr>
+          <w:sz w:val="24"/>
+          <w:szCs w:val="22"/>
+          <w:lang w:val="en-US"/>
+        </w:rPr>
+        <w:t>//*[</w:t>
+      </w:r>
+      <w:proofErr w:type="gramStart"/>
+      <w:r>
+        <w:rPr>
+          <w:sz w:val="24"/>
+          <w:szCs w:val="22"/>
+          <w:lang w:val="en-US"/>
+        </w:rPr>
+        <w:t>text(</w:t>
+      </w:r>
+      <w:proofErr w:type="gramEnd"/>
+      <w:r>
+        <w:rPr>
+          <w:sz w:val="24"/>
+          <w:szCs w:val="22"/>
+          <w:lang w:val="en-US"/>
+        </w:rPr>
+        <w:t>)="The password that you've entered is incorrect. "]</w:t>
+      </w:r>
+    </w:p>
+    <w:p>
+      <w:pPr>
+        <w:rPr>
+          <w:sz w:val="24"/>
+          <w:szCs w:val="22"/>
+          <w:lang w:val="en-US"/>
+        </w:rPr>
+      </w:pPr>
+      <w:r>
+        <w:rPr>
+          <w:sz w:val="24"/>
+          <w:szCs w:val="22"/>
+          <w:lang w:val="en-US"/>
+        </w:rPr>
+        <w:t>//*[</w:t>
+      </w:r>
+      <w:proofErr w:type="gramStart"/>
+      <w:r>
+        <w:rPr>
+          <w:sz w:val="24"/>
+          <w:szCs w:val="22"/>
+          <w:lang w:val="en-US"/>
+        </w:rPr>
+        <w:t>contains(</w:t>
+      </w:r>
+      <w:proofErr w:type="gramEnd"/>
+      <w:r>
+        <w:rPr>
+          <w:sz w:val="24"/>
+          <w:szCs w:val="22"/>
+          <w:lang w:val="en-US"/>
+        </w:rPr>
+        <w:t>text(), "password that")]</w:t>
+      </w:r>
+    </w:p>
+    <w:p>
+      <w:pPr>
+        <w:rPr>
+          <w:sz w:val="24"/>
+          <w:szCs w:val="22"/>
+          <w:lang w:val="en-US"/>
+        </w:rPr>
+      </w:pPr>
+      <w:r>
+        <w:rPr>
+          <w:sz w:val="24"/>
+          <w:szCs w:val="22"/>
+          <w:lang w:val="en-US"/>
+        </w:rPr>
+        <w:t>//*[@id="leftcontainer"]/table/tbody/tr[10]//preceding-sibling::tr/td[1]/a</w:t>
+      </w:r>
+    </w:p>
+    <w:p>
+      <w:pPr>
+        <w:rPr>
+          <w:sz w:val="24"/>
+          <w:szCs w:val="22"/>
+          <w:lang w:val="en-US"/>
+        </w:rPr>
+      </w:pPr>
+      <w:r>
+        <w:rPr>
+          <w:sz w:val="24"/>
+          <w:szCs w:val="22"/>
+          <w:lang w:val="en-US"/>
+        </w:rPr>
+        <w:t>//*[@id="leftcontainer"]/table/tbody/tr[10]//following-sibling::tr/td[1]/a</w:t>
+      </w:r>
+    </w:p>
+    <w:p>
+      <w:pPr>
+        <w:rPr>
+          <w:sz w:val="24"/>
+          <w:szCs w:val="22"/>
+          <w:lang w:val="en-US"/>
+        </w:rPr>
+      </w:pPr>
+      <w:r>
+        <w:rPr>
+          <w:sz w:val="24"/>
+          <w:szCs w:val="22"/>
+          <w:lang w:val="en-US"/>
+        </w:rPr>
+        <w:t>(//</w:t>
+      </w:r>
+      <w:proofErr w:type="gramStart"/>
+      <w:r>
+        <w:rPr>
+          <w:sz w:val="24"/>
+          <w:szCs w:val="22"/>
+          <w:lang w:val="en-US"/>
+        </w:rPr>
+        <w:t>div[</w:t>
+      </w:r>
+      <w:proofErr w:type="gramEnd"/>
+      <w:r>
+        <w:rPr>
+          <w:sz w:val="24"/>
+          <w:szCs w:val="22"/>
+          <w:lang w:val="en-US"/>
+        </w:rPr>
+        <w:t>contains(@class, "placeHolderContainer___8dac15")])[1]</w:t>
+      </w:r>
       <w:bookmarkStart w:id="0" w:name="_GoBack"/>
       <w:bookmarkEnd w:id="0"/>
     </w:p>
@@ -11822,6 +13379,95 @@
     </w:lvl>
   </w:abstractNum>
   <w:abstractNum w:abstractNumId="6">
+    <w:nsid w:val="26275AB3"/>
+    <w:multiLevelType w:val="hybridMultilevel"/>
+    <w:tmpl w:val="E496D43E"/>
+    <w:lvl w:ilvl="0" w:tplc="4009000F">
+      <w:start w:val="1"/>
+      <w:numFmt w:val="decimal"/>
+      <w:lvlText w:val="%1."/>
+      <w:lvlJc w:val="left"/>
+      <w:pPr>
+        <w:ind w:left="720" w:hanging="360"/>
+      </w:pPr>
+      <w:rPr>
+        <w:rFonts w:hint="default"/>
+      </w:rPr>
+    </w:lvl>
+    <w:lvl w:ilvl="1" w:tplc="40090019" w:tentative="1">
+      <w:start w:val="1"/>
+      <w:numFmt w:val="lowerLetter"/>
+      <w:lvlText w:val="%2."/>
+      <w:lvlJc w:val="left"/>
+      <w:pPr>
+        <w:ind w:left="1440" w:hanging="360"/>
+      </w:pPr>
+    </w:lvl>
+    <w:lvl w:ilvl="2" w:tplc="4009001B" w:tentative="1">
+      <w:start w:val="1"/>
+      <w:numFmt w:val="lowerRoman"/>
+      <w:lvlText w:val="%3."/>
+      <w:lvlJc w:val="right"/>
+      <w:pPr>
+        <w:ind w:left="2160" w:hanging="180"/>
+      </w:pPr>
+    </w:lvl>
+    <w:lvl w:ilvl="3" w:tplc="4009000F" w:tentative="1">
+      <w:start w:val="1"/>
+      <w:numFmt w:val="decimal"/>
+      <w:lvlText w:val="%4."/>
+      <w:lvlJc w:val="left"/>
+      <w:pPr>
+        <w:ind w:left="2880" w:hanging="360"/>
+      </w:pPr>
+    </w:lvl>
+    <w:lvl w:ilvl="4" w:tplc="40090019" w:tentative="1">
+      <w:start w:val="1"/>
+      <w:numFmt w:val="lowerLetter"/>
+      <w:lvlText w:val="%5."/>
+      <w:lvlJc w:val="left"/>
+      <w:pPr>
+        <w:ind w:left="3600" w:hanging="360"/>
+      </w:pPr>
+    </w:lvl>
+    <w:lvl w:ilvl="5" w:tplc="4009001B" w:tentative="1">
+      <w:start w:val="1"/>
+      <w:numFmt w:val="lowerRoman"/>
+      <w:lvlText w:val="%6."/>
+      <w:lvlJc w:val="right"/>
+      <w:pPr>
+        <w:ind w:left="4320" w:hanging="180"/>
+      </w:pPr>
+    </w:lvl>
+    <w:lvl w:ilvl="6" w:tplc="4009000F" w:tentative="1">
+      <w:start w:val="1"/>
+      <w:numFmt w:val="decimal"/>
+      <w:lvlText w:val="%7."/>
+      <w:lvlJc w:val="left"/>
+      <w:pPr>
+        <w:ind w:left="5040" w:hanging="360"/>
+      </w:pPr>
+    </w:lvl>
+    <w:lvl w:ilvl="7" w:tplc="40090019" w:tentative="1">
+      <w:start w:val="1"/>
+      <w:numFmt w:val="lowerLetter"/>
+      <w:lvlText w:val="%8."/>
+      <w:lvlJc w:val="left"/>
+      <w:pPr>
+        <w:ind w:left="5760" w:hanging="360"/>
+      </w:pPr>
+    </w:lvl>
+    <w:lvl w:ilvl="8" w:tplc="4009001B" w:tentative="1">
+      <w:start w:val="1"/>
+      <w:numFmt w:val="lowerRoman"/>
+      <w:lvlText w:val="%9."/>
+      <w:lvlJc w:val="right"/>
+      <w:pPr>
+        <w:ind w:left="6480" w:hanging="180"/>
+      </w:pPr>
+    </w:lvl>
+  </w:abstractNum>
+  <w:abstractNum w:abstractNumId="7">
     <w:nsid w:val="265957C8"/>
     <w:multiLevelType w:val="hybridMultilevel"/>
     <w:tmpl w:val="5748EBC0"/>
@@ -11910,7 +13556,7 @@
       </w:pPr>
     </w:lvl>
   </w:abstractNum>
-  <w:abstractNum w:abstractNumId="7">
+  <w:abstractNum w:abstractNumId="8">
     <w:nsid w:val="265C5007"/>
     <w:multiLevelType w:val="hybridMultilevel"/>
     <w:tmpl w:val="A4D64746"/>
@@ -12023,7 +13669,7 @@
       </w:rPr>
     </w:lvl>
   </w:abstractNum>
-  <w:abstractNum w:abstractNumId="8">
+  <w:abstractNum w:abstractNumId="9">
     <w:nsid w:val="2A553A44"/>
     <w:multiLevelType w:val="hybridMultilevel"/>
     <w:tmpl w:val="F2845826"/>
@@ -12136,7 +13782,7 @@
       </w:rPr>
     </w:lvl>
   </w:abstractNum>
-  <w:abstractNum w:abstractNumId="9">
+  <w:abstractNum w:abstractNumId="10">
     <w:nsid w:val="2C6C6B11"/>
     <w:multiLevelType w:val="hybridMultilevel"/>
     <w:tmpl w:val="54D27682"/>
@@ -12249,7 +13895,7 @@
       </w:rPr>
     </w:lvl>
   </w:abstractNum>
-  <w:abstractNum w:abstractNumId="10">
+  <w:abstractNum w:abstractNumId="11">
     <w:nsid w:val="2D6F4250"/>
     <w:multiLevelType w:val="hybridMultilevel"/>
     <w:tmpl w:val="5DCCE37A"/>
@@ -12362,7 +14008,7 @@
       </w:rPr>
     </w:lvl>
   </w:abstractNum>
-  <w:abstractNum w:abstractNumId="11">
+  <w:abstractNum w:abstractNumId="12">
     <w:nsid w:val="2F10367A"/>
     <w:multiLevelType w:val="hybridMultilevel"/>
     <w:tmpl w:val="65084898"/>
@@ -12475,7 +14121,7 @@
       </w:rPr>
     </w:lvl>
   </w:abstractNum>
-  <w:abstractNum w:abstractNumId="12">
+  <w:abstractNum w:abstractNumId="13">
     <w:nsid w:val="352D3A5C"/>
     <w:multiLevelType w:val="hybridMultilevel"/>
     <w:tmpl w:val="7244368A"/>
@@ -12564,7 +14210,7 @@
       </w:pPr>
     </w:lvl>
   </w:abstractNum>
-  <w:abstractNum w:abstractNumId="13">
+  <w:abstractNum w:abstractNumId="14">
     <w:nsid w:val="359B3FD5"/>
     <w:multiLevelType w:val="hybridMultilevel"/>
     <w:tmpl w:val="874AA4A8"/>
@@ -12653,7 +14299,7 @@
       </w:pPr>
     </w:lvl>
   </w:abstractNum>
-  <w:abstractNum w:abstractNumId="14">
+  <w:abstractNum w:abstractNumId="15">
     <w:nsid w:val="36A069BE"/>
     <w:multiLevelType w:val="hybridMultilevel"/>
     <w:tmpl w:val="B666D886"/>
@@ -12766,7 +14412,96 @@
       </w:rPr>
     </w:lvl>
   </w:abstractNum>
-  <w:abstractNum w:abstractNumId="15">
+  <w:abstractNum w:abstractNumId="16">
+    <w:nsid w:val="378E0C8E"/>
+    <w:multiLevelType w:val="hybridMultilevel"/>
+    <w:tmpl w:val="D18C73AE"/>
+    <w:lvl w:ilvl="0" w:tplc="4009000F">
+      <w:start w:val="1"/>
+      <w:numFmt w:val="decimal"/>
+      <w:lvlText w:val="%1."/>
+      <w:lvlJc w:val="left"/>
+      <w:pPr>
+        <w:ind w:left="720" w:hanging="360"/>
+      </w:pPr>
+      <w:rPr>
+        <w:rFonts w:hint="default"/>
+      </w:rPr>
+    </w:lvl>
+    <w:lvl w:ilvl="1" w:tplc="40090019" w:tentative="1">
+      <w:start w:val="1"/>
+      <w:numFmt w:val="lowerLetter"/>
+      <w:lvlText w:val="%2."/>
+      <w:lvlJc w:val="left"/>
+      <w:pPr>
+        <w:ind w:left="1440" w:hanging="360"/>
+      </w:pPr>
+    </w:lvl>
+    <w:lvl w:ilvl="2" w:tplc="4009001B" w:tentative="1">
+      <w:start w:val="1"/>
+      <w:numFmt w:val="lowerRoman"/>
+      <w:lvlText w:val="%3."/>
+      <w:lvlJc w:val="right"/>
+      <w:pPr>
+        <w:ind w:left="2160" w:hanging="180"/>
+      </w:pPr>
+    </w:lvl>
+    <w:lvl w:ilvl="3" w:tplc="4009000F" w:tentative="1">
+      <w:start w:val="1"/>
+      <w:numFmt w:val="decimal"/>
+      <w:lvlText w:val="%4."/>
+      <w:lvlJc w:val="left"/>
+      <w:pPr>
+        <w:ind w:left="2880" w:hanging="360"/>
+      </w:pPr>
+    </w:lvl>
+    <w:lvl w:ilvl="4" w:tplc="40090019" w:tentative="1">
+      <w:start w:val="1"/>
+      <w:numFmt w:val="lowerLetter"/>
+      <w:lvlText w:val="%5."/>
+      <w:lvlJc w:val="left"/>
+      <w:pPr>
+        <w:ind w:left="3600" w:hanging="360"/>
+      </w:pPr>
+    </w:lvl>
+    <w:lvl w:ilvl="5" w:tplc="4009001B" w:tentative="1">
+      <w:start w:val="1"/>
+      <w:numFmt w:val="lowerRoman"/>
+      <w:lvlText w:val="%6."/>
+      <w:lvlJc w:val="right"/>
+      <w:pPr>
+        <w:ind w:left="4320" w:hanging="180"/>
+      </w:pPr>
+    </w:lvl>
+    <w:lvl w:ilvl="6" w:tplc="4009000F" w:tentative="1">
+      <w:start w:val="1"/>
+      <w:numFmt w:val="decimal"/>
+      <w:lvlText w:val="%7."/>
+      <w:lvlJc w:val="left"/>
+      <w:pPr>
+        <w:ind w:left="5040" w:hanging="360"/>
+      </w:pPr>
+    </w:lvl>
+    <w:lvl w:ilvl="7" w:tplc="40090019" w:tentative="1">
+      <w:start w:val="1"/>
+      <w:numFmt w:val="lowerLetter"/>
+      <w:lvlText w:val="%8."/>
+      <w:lvlJc w:val="left"/>
+      <w:pPr>
+        <w:ind w:left="5760" w:hanging="360"/>
+      </w:pPr>
+    </w:lvl>
+    <w:lvl w:ilvl="8" w:tplc="4009001B" w:tentative="1">
+      <w:start w:val="1"/>
+      <w:numFmt w:val="lowerRoman"/>
+      <w:lvlText w:val="%9."/>
+      <w:lvlJc w:val="right"/>
+      <w:pPr>
+        <w:ind w:left="6480" w:hanging="180"/>
+      </w:pPr>
+    </w:lvl>
+  </w:abstractNum>
+  <w:abstractNum w:abstractNumId="17">
     <w:nsid w:val="3DBF0974"/>
     <w:multiLevelType w:val="hybridMultilevel"/>
     <w:tmpl w:val="656C528C"/>
@@ -12855,7 +14590,7 @@
       </w:pPr>
     </w:lvl>
   </w:abstractNum>
-  <w:abstractNum w:abstractNumId="16">
+  <w:abstractNum w:abstractNumId="18">
     <w:nsid w:val="3E3F3676"/>
     <w:multiLevelType w:val="hybridMultilevel"/>
     <w:tmpl w:val="CDAE370A"/>
@@ -12944,7 +14679,7 @@
       </w:pPr>
     </w:lvl>
   </w:abstractNum>
-  <w:abstractNum w:abstractNumId="17">
+  <w:abstractNum w:abstractNumId="19">
     <w:nsid w:val="3F6D0AB0"/>
     <w:multiLevelType w:val="hybridMultilevel"/>
     <w:tmpl w:val="0876E60C"/>
@@ -13033,7 +14768,7 @@
       </w:pPr>
     </w:lvl>
   </w:abstractNum>
-  <w:abstractNum w:abstractNumId="18">
+  <w:abstractNum w:abstractNumId="20">
     <w:nsid w:val="3F863012"/>
     <w:multiLevelType w:val="hybridMultilevel"/>
     <w:tmpl w:val="794CFB18"/>
@@ -13122,7 +14857,7 @@
       </w:pPr>
     </w:lvl>
   </w:abstractNum>
-  <w:abstractNum w:abstractNumId="19">
+  <w:abstractNum w:abstractNumId="21">
     <w:nsid w:val="41F63E31"/>
     <w:multiLevelType w:val="hybridMultilevel"/>
     <w:tmpl w:val="47F60D22"/>
@@ -13235,7 +14970,7 @@
       </w:rPr>
     </w:lvl>
   </w:abstractNum>
-  <w:abstractNum w:abstractNumId="20">
+  <w:abstractNum w:abstractNumId="22">
     <w:nsid w:val="48BF0798"/>
     <w:multiLevelType w:val="hybridMultilevel"/>
     <w:tmpl w:val="1CCABF8C"/>
@@ -13324,7 +15059,7 @@
       </w:pPr>
     </w:lvl>
   </w:abstractNum>
-  <w:abstractNum w:abstractNumId="21">
+  <w:abstractNum w:abstractNumId="23">
     <w:nsid w:val="4A6953B6"/>
     <w:multiLevelType w:val="hybridMultilevel"/>
     <w:tmpl w:val="F8C434D8"/>
@@ -13413,7 +15148,120 @@
       </w:pPr>
     </w:lvl>
   </w:abstractNum>
-  <w:abstractNum w:abstractNumId="22">
+  <w:abstractNum w:abstractNumId="24">
+    <w:nsid w:val="4AE60F2B"/>
+    <w:multiLevelType w:val="hybridMultilevel"/>
+    <w:tmpl w:val="17AA51A2"/>
+    <w:lvl w:ilvl="0" w:tplc="40090001">
+      <w:start w:val="1"/>
+      <w:numFmt w:val="bullet"/>
+      <w:lvlText w:val=""/>
+      <w:lvlJc w:val="left"/>
+      <w:pPr>
+        <w:ind w:left="720" w:hanging="360"/>
+      </w:pPr>
+      <w:rPr>
+        <w:rFonts w:ascii="Symbol" w:hAnsi="Symbol" w:hint="default"/>
+      </w:rPr>
+    </w:lvl>
+    <w:lvl w:ilvl="1" w:tplc="40090003">
+      <w:start w:val="1"/>
+      <w:numFmt w:val="bullet"/>
+      <w:lvlText w:val="o"/>
+      <w:lvlJc w:val="left"/>
+      <w:pPr>
+        <w:ind w:left="1440" w:hanging="360"/>
+      </w:pPr>
+      <w:rPr>
+        <w:rFonts w:ascii="Courier New" w:hAnsi="Courier New" w:cs="Courier New" w:hint="default"/>
+      </w:rPr>
+    </w:lvl>
+    <w:lvl w:ilvl="2" w:tplc="40090005" w:tentative="1">
+      <w:start w:val="1"/>
+      <w:numFmt w:val="bullet"/>
+      <w:lvlText w:val=""/>
+      <w:lvlJc w:val="left"/>
+      <w:pPr>
+        <w:ind w:left="2160" w:hanging="360"/>
+      </w:pPr>
+      <w:rPr>
+        <w:rFonts w:ascii="Wingdings" w:hAnsi="Wingdings" w:hint="default"/>
+      </w:rPr>
+    </w:lvl>
+    <w:lvl w:ilvl="3" w:tplc="40090001" w:tentative="1">
+      <w:start w:val="1"/>
+      <w:numFmt w:val="bullet"/>
+      <w:lvlText w:val=""/>
+      <w:lvlJc w:val="left"/>
+      <w:pPr>
+        <w:ind w:left="2880" w:hanging="360"/>
+      </w:pPr>
+      <w:rPr>
+        <w:rFonts w:ascii="Symbol" w:hAnsi="Symbol" w:hint="default"/>
+      </w:rPr>
+    </w:lvl>
+    <w:lvl w:ilvl="4" w:tplc="40090003" w:tentative="1">
+      <w:start w:val="1"/>
+      <w:numFmt w:val="bullet"/>
+      <w:lvlText w:val="o"/>
+      <w:lvlJc w:val="left"/>
+      <w:pPr>
+        <w:ind w:left="3600" w:hanging="360"/>
+      </w:pPr>
+      <w:rPr>
+        <w:rFonts w:ascii="Courier New" w:hAnsi="Courier New" w:cs="Courier New" w:hint="default"/>
+      </w:rPr>
+    </w:lvl>
+    <w:lvl w:ilvl="5" w:tplc="40090005" w:tentative="1">
+      <w:start w:val="1"/>
+      <w:numFmt w:val="bullet"/>
+      <w:lvlText w:val=""/>
+      <w:lvlJc w:val="left"/>
+      <w:pPr>
+        <w:ind w:left="4320" w:hanging="360"/>
+      </w:pPr>
+      <w:rPr>
+        <w:rFonts w:ascii="Wingdings" w:hAnsi="Wingdings" w:hint="default"/>
+      </w:rPr>
+    </w:lvl>
+    <w:lvl w:ilvl="6" w:tplc="40090001" w:tentative="1">
+      <w:start w:val="1"/>
+      <w:numFmt w:val="bullet"/>
+      <w:lvlText w:val=""/>
+      <w:lvlJc w:val="left"/>
+      <w:pPr>
+        <w:ind w:left="5040" w:hanging="360"/>
+      </w:pPr>
+      <w:rPr>
+        <w:rFonts w:ascii="Symbol" w:hAnsi="Symbol" w:hint="default"/>
+      </w:rPr>
+    </w:lvl>
+    <w:lvl w:ilvl="7" w:tplc="40090003" w:tentative="1">
+      <w:start w:val="1"/>
+      <w:numFmt w:val="bullet"/>
+      <w:lvlText w:val="o"/>
+      <w:lvlJc w:val="left"/>
+      <w:pPr>
+        <w:ind w:left="5760" w:hanging="360"/>
+      </w:pPr>
+      <w:rPr>
+        <w:rFonts w:ascii="Courier New" w:hAnsi="Courier New" w:cs="Courier New" w:hint="default"/>
+      </w:rPr>
+    </w:lvl>
+    <w:lvl w:ilvl="8" w:tplc="40090005" w:tentative="1">
+      <w:start w:val="1"/>
+      <w:numFmt w:val="bullet"/>
+      <w:lvlText w:val=""/>
+      <w:lvlJc w:val="left"/>
+      <w:pPr>
+        <w:ind w:left="6480" w:hanging="360"/>
+      </w:pPr>
+      <w:rPr>
+        <w:rFonts w:ascii="Wingdings" w:hAnsi="Wingdings" w:hint="default"/>
+      </w:rPr>
+    </w:lvl>
+  </w:abstractNum>
+  <w:abstractNum w:abstractNumId="25">
     <w:nsid w:val="4B7A4655"/>
     <w:multiLevelType w:val="hybridMultilevel"/>
     <w:tmpl w:val="EC7AB170"/>
@@ -13526,7 +15374,7 @@
       </w:rPr>
     </w:lvl>
   </w:abstractNum>
-  <w:abstractNum w:abstractNumId="23">
+  <w:abstractNum w:abstractNumId="26">
     <w:nsid w:val="4D7B2612"/>
     <w:multiLevelType w:val="hybridMultilevel"/>
     <w:tmpl w:val="8752CAAA"/>
@@ -13639,7 +15487,7 @@
       </w:rPr>
     </w:lvl>
   </w:abstractNum>
-  <w:abstractNum w:abstractNumId="24">
+  <w:abstractNum w:abstractNumId="27">
     <w:nsid w:val="5310622E"/>
     <w:multiLevelType w:val="hybridMultilevel"/>
     <w:tmpl w:val="9906F9CE"/>
@@ -13752,7 +15600,120 @@
       </w:rPr>
     </w:lvl>
   </w:abstractNum>
-  <w:abstractNum w:abstractNumId="25">
+  <w:abstractNum w:abstractNumId="28">
+    <w:nsid w:val="57483BA6"/>
+    <w:multiLevelType w:val="hybridMultilevel"/>
+    <w:tmpl w:val="13F4B4FC"/>
+    <w:lvl w:ilvl="0" w:tplc="40090001">
+      <w:start w:val="1"/>
+      <w:numFmt w:val="bullet"/>
+      <w:lvlText w:val=""/>
+      <w:lvlJc w:val="left"/>
+      <w:pPr>
+        <w:ind w:left="720" w:hanging="360"/>
+      </w:pPr>
+      <w:rPr>
+        <w:rFonts w:ascii="Symbol" w:hAnsi="Symbol" w:hint="default"/>
+      </w:rPr>
+    </w:lvl>
+    <w:lvl w:ilvl="1" w:tplc="40090003">
+      <w:start w:val="1"/>
+      <w:numFmt w:val="bullet"/>
+      <w:lvlText w:val="o"/>
+      <w:lvlJc w:val="left"/>
+      <w:pPr>
+        <w:ind w:left="1440" w:hanging="360"/>
+      </w:pPr>
+      <w:rPr>
+        <w:rFonts w:ascii="Courier New" w:hAnsi="Courier New" w:cs="Courier New" w:hint="default"/>
+      </w:rPr>
+    </w:lvl>
+    <w:lvl w:ilvl="2" w:tplc="40090005" w:tentative="1">
+      <w:start w:val="1"/>
+      <w:numFmt w:val="bullet"/>
+      <w:lvlText w:val=""/>
+      <w:lvlJc w:val="left"/>
+      <w:pPr>
+        <w:ind w:left="2160" w:hanging="360"/>
+      </w:pPr>
+      <w:rPr>
+        <w:rFonts w:ascii="Wingdings" w:hAnsi="Wingdings" w:hint="default"/>
+      </w:rPr>
+    </w:lvl>
+    <w:lvl w:ilvl="3" w:tplc="40090001" w:tentative="1">
+      <w:start w:val="1"/>
+      <w:numFmt w:val="bullet"/>
+      <w:lvlText w:val=""/>
+      <w:lvlJc w:val="left"/>
+      <w:pPr>
+        <w:ind w:left="2880" w:hanging="360"/>
+      </w:pPr>
+      <w:rPr>
+        <w:rFonts w:ascii="Symbol" w:hAnsi="Symbol" w:hint="default"/>
+      </w:rPr>
+    </w:lvl>
+    <w:lvl w:ilvl="4" w:tplc="40090003" w:tentative="1">
+      <w:start w:val="1"/>
+      <w:numFmt w:val="bullet"/>
+      <w:lvlText w:val="o"/>
+      <w:lvlJc w:val="left"/>
+      <w:pPr>
+        <w:ind w:left="3600" w:hanging="360"/>
+      </w:pPr>
+      <w:rPr>
+        <w:rFonts w:ascii="Courier New" w:hAnsi="Courier New" w:cs="Courier New" w:hint="default"/>
+      </w:rPr>
+    </w:lvl>
+    <w:lvl w:ilvl="5" w:tplc="40090005" w:tentative="1">
+      <w:start w:val="1"/>
+      <w:numFmt w:val="bullet"/>
+      <w:lvlText w:val=""/>
+      <w:lvlJc w:val="left"/>
+      <w:pPr>
+        <w:ind w:left="4320" w:hanging="360"/>
+      </w:pPr>
+      <w:rPr>
+        <w:rFonts w:ascii="Wingdings" w:hAnsi="Wingdings" w:hint="default"/>
+      </w:rPr>
+    </w:lvl>
+    <w:lvl w:ilvl="6" w:tplc="40090001" w:tentative="1">
+      <w:start w:val="1"/>
+      <w:numFmt w:val="bullet"/>
+      <w:lvlText w:val=""/>
+      <w:lvlJc w:val="left"/>
+      <w:pPr>
+        <w:ind w:left="5040" w:hanging="360"/>
+      </w:pPr>
+      <w:rPr>
+        <w:rFonts w:ascii="Symbol" w:hAnsi="Symbol" w:hint="default"/>
+      </w:rPr>
+    </w:lvl>
+    <w:lvl w:ilvl="7" w:tplc="40090003" w:tentative="1">
+      <w:start w:val="1"/>
+      <w:numFmt w:val="bullet"/>
+      <w:lvlText w:val="o"/>
+      <w:lvlJc w:val="left"/>
+      <w:pPr>
+        <w:ind w:left="5760" w:hanging="360"/>
+      </w:pPr>
+      <w:rPr>
+        <w:rFonts w:ascii="Courier New" w:hAnsi="Courier New" w:cs="Courier New" w:hint="default"/>
+      </w:rPr>
+    </w:lvl>
+    <w:lvl w:ilvl="8" w:tplc="40090005" w:tentative="1">
+      <w:start w:val="1"/>
+      <w:numFmt w:val="bullet"/>
+      <w:lvlText w:val=""/>
+      <w:lvlJc w:val="left"/>
+      <w:pPr>
+        <w:ind w:left="6480" w:hanging="360"/>
+      </w:pPr>
+      <w:rPr>
+        <w:rFonts w:ascii="Wingdings" w:hAnsi="Wingdings" w:hint="default"/>
+      </w:rPr>
+    </w:lvl>
+  </w:abstractNum>
+  <w:abstractNum w:abstractNumId="29">
     <w:nsid w:val="58E925AA"/>
     <w:multiLevelType w:val="hybridMultilevel"/>
     <w:tmpl w:val="4C34E418"/>
@@ -13841,7 +15802,7 @@
       </w:pPr>
     </w:lvl>
   </w:abstractNum>
-  <w:abstractNum w:abstractNumId="26">
+  <w:abstractNum w:abstractNumId="30">
     <w:nsid w:val="625A54F2"/>
     <w:multiLevelType w:val="hybridMultilevel"/>
     <w:tmpl w:val="0694B584"/>
@@ -13927,7 +15888,7 @@
       </w:pPr>
     </w:lvl>
   </w:abstractNum>
-  <w:abstractNum w:abstractNumId="27">
+  <w:abstractNum w:abstractNumId="31">
     <w:nsid w:val="636D1023"/>
     <w:multiLevelType w:val="hybridMultilevel"/>
     <w:tmpl w:val="817E55B8"/>
@@ -14040,7 +16001,7 @@
       </w:rPr>
     </w:lvl>
   </w:abstractNum>
-  <w:abstractNum w:abstractNumId="28">
+  <w:abstractNum w:abstractNumId="32">
     <w:nsid w:val="729755FC"/>
     <w:multiLevelType w:val="hybridMultilevel"/>
     <w:tmpl w:val="25D6C8E0"/>
@@ -14129,7 +16090,7 @@
       </w:pPr>
     </w:lvl>
   </w:abstractNum>
-  <w:abstractNum w:abstractNumId="29">
+  <w:abstractNum w:abstractNumId="33">
     <w:nsid w:val="73AD1520"/>
     <w:multiLevelType w:val="hybridMultilevel"/>
     <w:tmpl w:val="56149FBA"/>
@@ -14215,7 +16176,7 @@
       </w:pPr>
     </w:lvl>
   </w:abstractNum>
-  <w:abstractNum w:abstractNumId="30">
+  <w:abstractNum w:abstractNumId="34">
     <w:nsid w:val="747C125B"/>
     <w:multiLevelType w:val="hybridMultilevel"/>
     <w:tmpl w:val="7AB85DE6"/>
@@ -14304,7 +16265,7 @@
       </w:pPr>
     </w:lvl>
   </w:abstractNum>
-  <w:abstractNum w:abstractNumId="31">
+  <w:abstractNum w:abstractNumId="35">
     <w:nsid w:val="7B0F502E"/>
     <w:multiLevelType w:val="hybridMultilevel"/>
     <w:tmpl w:val="D0CA6452"/>
@@ -14393,7 +16354,7 @@
       </w:pPr>
     </w:lvl>
   </w:abstractNum>
-  <w:abstractNum w:abstractNumId="32">
+  <w:abstractNum w:abstractNumId="36">
     <w:nsid w:val="7EE72A42"/>
     <w:multiLevelType w:val="hybridMultilevel"/>
     <w:tmpl w:val="E0164236"/>
@@ -14483,40 +16444,40 @@
     </w:lvl>
   </w:abstractNum>
   <w:num w:numId="1">
+    <w:abstractNumId w:val="11"/>
+  </w:num>
+  <w:num w:numId="2">
+    <w:abstractNumId w:val="8"/>
+  </w:num>
+  <w:num w:numId="3">
+    <w:abstractNumId w:val="15"/>
+  </w:num>
+  <w:num w:numId="4">
     <w:abstractNumId w:val="10"/>
   </w:num>
-  <w:num w:numId="2">
-    <w:abstractNumId w:val="7"/>
-  </w:num>
-  <w:num w:numId="3">
-    <w:abstractNumId w:val="14"/>
-  </w:num>
-  <w:num w:numId="4">
-    <w:abstractNumId w:val="9"/>
-  </w:num>
   <w:num w:numId="5">
-    <w:abstractNumId w:val="24"/>
+    <w:abstractNumId w:val="27"/>
   </w:num>
   <w:num w:numId="6">
-    <w:abstractNumId w:val="15"/>
+    <w:abstractNumId w:val="17"/>
   </w:num>
   <w:num w:numId="7">
     <w:abstractNumId w:val="3"/>
   </w:num>
   <w:num w:numId="8">
-    <w:abstractNumId w:val="30"/>
+    <w:abstractNumId w:val="34"/>
   </w:num>
   <w:num w:numId="9">
-    <w:abstractNumId w:val="27"/>
+    <w:abstractNumId w:val="31"/>
   </w:num>
   <w:num w:numId="10">
-    <w:abstractNumId w:val="22"/>
+    <w:abstractNumId w:val="25"/>
   </w:num>
   <w:num w:numId="11">
     <w:abstractNumId w:val="2"/>
   </w:num>
   <w:num w:numId="12">
-    <w:abstractNumId w:val="21"/>
+    <w:abstractNumId w:val="23"/>
   </w:num>
   <w:num w:numId="13">
     <w:abstractNumId w:val="4"/>
@@ -14525,61 +16486,73 @@
     <w:abstractNumId w:val="0"/>
   </w:num>
   <w:num w:numId="15">
-    <w:abstractNumId w:val="11"/>
+    <w:abstractNumId w:val="12"/>
   </w:num>
   <w:num w:numId="16">
-    <w:abstractNumId w:val="26"/>
+    <w:abstractNumId w:val="30"/>
   </w:num>
   <w:num w:numId="17">
-    <w:abstractNumId w:val="28"/>
+    <w:abstractNumId w:val="32"/>
   </w:num>
   <w:num w:numId="18">
-    <w:abstractNumId w:val="25"/>
+    <w:abstractNumId w:val="29"/>
   </w:num>
   <w:num w:numId="19">
     <w:abstractNumId w:val="5"/>
   </w:num>
   <w:num w:numId="20">
-    <w:abstractNumId w:val="16"/>
+    <w:abstractNumId w:val="18"/>
   </w:num>
   <w:num w:numId="21">
     <w:abstractNumId w:val="1"/>
   </w:num>
   <w:num w:numId="22">
+    <w:abstractNumId w:val="14"/>
+  </w:num>
+  <w:num w:numId="23">
+    <w:abstractNumId w:val="22"/>
+  </w:num>
+  <w:num w:numId="24">
+    <w:abstractNumId w:val="20"/>
+  </w:num>
+  <w:num w:numId="25">
+    <w:abstractNumId w:val="7"/>
+  </w:num>
+  <w:num w:numId="26">
+    <w:abstractNumId w:val="19"/>
+  </w:num>
+  <w:num w:numId="27">
+    <w:abstractNumId w:val="36"/>
+  </w:num>
+  <w:num w:numId="28">
+    <w:abstractNumId w:val="21"/>
+  </w:num>
+  <w:num w:numId="29">
+    <w:abstractNumId w:val="33"/>
+  </w:num>
+  <w:num w:numId="30">
     <w:abstractNumId w:val="13"/>
   </w:num>
-  <w:num w:numId="23">
-    <w:abstractNumId w:val="20"/>
-  </w:num>
-  <w:num w:numId="24">
-    <w:abstractNumId w:val="18"/>
-  </w:num>
-  <w:num w:numId="25">
-    <w:abstractNumId w:val="6"/>
-  </w:num>
-  <w:num w:numId="26">
-    <w:abstractNumId w:val="17"/>
-  </w:num>
-  <w:num w:numId="27">
-    <w:abstractNumId w:val="32"/>
-  </w:num>
-  <w:num w:numId="28">
-    <w:abstractNumId w:val="19"/>
-  </w:num>
-  <w:num w:numId="29">
-    <w:abstractNumId w:val="29"/>
-  </w:num>
-  <w:num w:numId="30">
-    <w:abstractNumId w:val="12"/>
-  </w:num>
   <w:num w:numId="31">
-    <w:abstractNumId w:val="8"/>
+    <w:abstractNumId w:val="9"/>
   </w:num>
   <w:num w:numId="32">
-    <w:abstractNumId w:val="31"/>
+    <w:abstractNumId w:val="35"/>
   </w:num>
   <w:num w:numId="33">
-    <w:abstractNumId w:val="23"/>
+    <w:abstractNumId w:val="26"/>
+  </w:num>
+  <w:num w:numId="34">
+    <w:abstractNumId w:val="28"/>
+  </w:num>
+  <w:num w:numId="35">
+    <w:abstractNumId w:val="24"/>
+  </w:num>
+  <w:num w:numId="36">
+    <w:abstractNumId w:val="16"/>
+  </w:num>
+  <w:num w:numId="37">
+    <w:abstractNumId w:val="6"/>
   </w:num>
 </w:numbering>
 </file>
@@ -16205,22 +18178,22 @@
     </dgm:pt>
   </dgm:ptLst>
   <dgm:cxnLst>
-    <dgm:cxn modelId="{2519AE1E-F128-4436-8745-B7388BF4B5F8}" type="presOf" srcId="{C10563B1-D17B-4828-B40F-E64A77D38593}" destId="{4D560F50-8F16-4794-86B3-C3D8DE2F9386}" srcOrd="0" destOrd="0" presId="urn:microsoft.com/office/officeart/2005/8/layout/chevron1"/>
-    <dgm:cxn modelId="{2AB96954-3C91-4F39-8FC5-0FC716C8EFC8}" type="presOf" srcId="{7C35FEF7-DC0D-43AE-8BE3-2149FB2A04A2}" destId="{CBCE1630-5EA0-49CF-B64F-8E2E518136D4}" srcOrd="0" destOrd="0" presId="urn:microsoft.com/office/officeart/2005/8/layout/chevron1"/>
-    <dgm:cxn modelId="{8418DA5C-DF5A-43CC-928A-19E37AA00E6F}" type="presOf" srcId="{518BBF31-5473-4647-89A8-1F7190FDD7CC}" destId="{5F46AD52-443D-445C-A0DE-55C3F3A14D43}" srcOrd="0" destOrd="0" presId="urn:microsoft.com/office/officeart/2005/8/layout/chevron1"/>
+    <dgm:cxn modelId="{A28532B3-B960-4F7D-BD02-C7056E8EF0CA}" type="presOf" srcId="{C10563B1-D17B-4828-B40F-E64A77D38593}" destId="{4D560F50-8F16-4794-86B3-C3D8DE2F9386}" srcOrd="0" destOrd="0" presId="urn:microsoft.com/office/officeart/2005/8/layout/chevron1"/>
+    <dgm:cxn modelId="{E2A6A5E9-A2D0-4BF2-AF8E-ACB6C085CA8C}" srcId="{E4F40C07-A169-42D7-9A7C-EC1908A68E5F}" destId="{7C35FEF7-DC0D-43AE-8BE3-2149FB2A04A2}" srcOrd="2" destOrd="0" parTransId="{F35C3024-56BC-477B-B2DD-7628EC4D0598}" sibTransId="{5E9DDC1B-8E20-45BD-B2C4-DE21EC41E73E}"/>
+    <dgm:cxn modelId="{7F681B91-D65D-483F-AD98-6749903E8E4D}" type="presOf" srcId="{E4F40C07-A169-42D7-9A7C-EC1908A68E5F}" destId="{73B709FB-7B30-472B-AD65-EC980FF821F6}" srcOrd="0" destOrd="0" presId="urn:microsoft.com/office/officeart/2005/8/layout/chevron1"/>
+    <dgm:cxn modelId="{3C1C0D14-6DF2-4652-9E4E-340880213B41}" srcId="{E4F40C07-A169-42D7-9A7C-EC1908A68E5F}" destId="{12905BA0-FFBC-4F6F-A638-860052C3C22E}" srcOrd="3" destOrd="0" parTransId="{51C23596-DA0B-4497-9E19-6A9465F512F2}" sibTransId="{B30D78C5-2EE3-4FC4-ADE9-34EAB867FD7E}"/>
+    <dgm:cxn modelId="{FBE79D26-2316-4364-8F3B-5098C5BA0A92}" srcId="{E4F40C07-A169-42D7-9A7C-EC1908A68E5F}" destId="{518BBF31-5473-4647-89A8-1F7190FDD7CC}" srcOrd="1" destOrd="0" parTransId="{51A8C620-C424-463F-9BEF-6A08563C7A06}" sibTransId="{017B1192-391E-4A65-81D1-6D7C5AF2AA1D}"/>
+    <dgm:cxn modelId="{3D835F83-D4F7-4390-B45A-5CE41E2F8C01}" type="presOf" srcId="{7C35FEF7-DC0D-43AE-8BE3-2149FB2A04A2}" destId="{CBCE1630-5EA0-49CF-B64F-8E2E518136D4}" srcOrd="0" destOrd="0" presId="urn:microsoft.com/office/officeart/2005/8/layout/chevron1"/>
+    <dgm:cxn modelId="{3091ED59-274F-4A0B-A592-75E135D6E103}" type="presOf" srcId="{518BBF31-5473-4647-89A8-1F7190FDD7CC}" destId="{5F46AD52-443D-445C-A0DE-55C3F3A14D43}" srcOrd="0" destOrd="0" presId="urn:microsoft.com/office/officeart/2005/8/layout/chevron1"/>
     <dgm:cxn modelId="{4FE1FE6A-5803-4018-B509-658EC487FBE6}" srcId="{E4F40C07-A169-42D7-9A7C-EC1908A68E5F}" destId="{C10563B1-D17B-4828-B40F-E64A77D38593}" srcOrd="0" destOrd="0" parTransId="{EEE0B6B6-BBA2-456F-B015-6F0E37F436A8}" sibTransId="{402CAF88-2D00-497D-BD34-BD7D8188DA24}"/>
-    <dgm:cxn modelId="{FBE79D26-2316-4364-8F3B-5098C5BA0A92}" srcId="{E4F40C07-A169-42D7-9A7C-EC1908A68E5F}" destId="{518BBF31-5473-4647-89A8-1F7190FDD7CC}" srcOrd="1" destOrd="0" parTransId="{51A8C620-C424-463F-9BEF-6A08563C7A06}" sibTransId="{017B1192-391E-4A65-81D1-6D7C5AF2AA1D}"/>
-    <dgm:cxn modelId="{E2A6A5E9-A2D0-4BF2-AF8E-ACB6C085CA8C}" srcId="{E4F40C07-A169-42D7-9A7C-EC1908A68E5F}" destId="{7C35FEF7-DC0D-43AE-8BE3-2149FB2A04A2}" srcOrd="2" destOrd="0" parTransId="{F35C3024-56BC-477B-B2DD-7628EC4D0598}" sibTransId="{5E9DDC1B-8E20-45BD-B2C4-DE21EC41E73E}"/>
-    <dgm:cxn modelId="{EAFDBDA5-9966-4AFF-ACAC-7D9802641980}" type="presOf" srcId="{E4F40C07-A169-42D7-9A7C-EC1908A68E5F}" destId="{73B709FB-7B30-472B-AD65-EC980FF821F6}" srcOrd="0" destOrd="0" presId="urn:microsoft.com/office/officeart/2005/8/layout/chevron1"/>
-    <dgm:cxn modelId="{B1980153-9A64-481F-814B-A68F72393AB6}" type="presOf" srcId="{12905BA0-FFBC-4F6F-A638-860052C3C22E}" destId="{7DC38E28-F114-44F6-A466-CCCEAA6E3A2B}" srcOrd="0" destOrd="0" presId="urn:microsoft.com/office/officeart/2005/8/layout/chevron1"/>
-    <dgm:cxn modelId="{3C1C0D14-6DF2-4652-9E4E-340880213B41}" srcId="{E4F40C07-A169-42D7-9A7C-EC1908A68E5F}" destId="{12905BA0-FFBC-4F6F-A638-860052C3C22E}" srcOrd="3" destOrd="0" parTransId="{51C23596-DA0B-4497-9E19-6A9465F512F2}" sibTransId="{B30D78C5-2EE3-4FC4-ADE9-34EAB867FD7E}"/>
-    <dgm:cxn modelId="{F3864C2E-588A-4ADB-B4E6-39F386A13E55}" type="presParOf" srcId="{73B709FB-7B30-472B-AD65-EC980FF821F6}" destId="{4D560F50-8F16-4794-86B3-C3D8DE2F9386}" srcOrd="0" destOrd="0" presId="urn:microsoft.com/office/officeart/2005/8/layout/chevron1"/>
-    <dgm:cxn modelId="{E39938BE-6608-40CF-8340-D01C0432DD27}" type="presParOf" srcId="{73B709FB-7B30-472B-AD65-EC980FF821F6}" destId="{154621DC-2D17-41EF-803D-3A82BFCEB308}" srcOrd="1" destOrd="0" presId="urn:microsoft.com/office/officeart/2005/8/layout/chevron1"/>
-    <dgm:cxn modelId="{9023F50B-A62B-4F3F-BD79-F5EB5DFA13B2}" type="presParOf" srcId="{73B709FB-7B30-472B-AD65-EC980FF821F6}" destId="{5F46AD52-443D-445C-A0DE-55C3F3A14D43}" srcOrd="2" destOrd="0" presId="urn:microsoft.com/office/officeart/2005/8/layout/chevron1"/>
-    <dgm:cxn modelId="{37D7E59A-E93E-4579-A907-61B467EF5482}" type="presParOf" srcId="{73B709FB-7B30-472B-AD65-EC980FF821F6}" destId="{3E86C66D-943B-4F67-81EE-8C1894017E0F}" srcOrd="3" destOrd="0" presId="urn:microsoft.com/office/officeart/2005/8/layout/chevron1"/>
-    <dgm:cxn modelId="{2300B3E2-D461-4190-B96E-073B0F023E61}" type="presParOf" srcId="{73B709FB-7B30-472B-AD65-EC980FF821F6}" destId="{CBCE1630-5EA0-49CF-B64F-8E2E518136D4}" srcOrd="4" destOrd="0" presId="urn:microsoft.com/office/officeart/2005/8/layout/chevron1"/>
-    <dgm:cxn modelId="{F232DCC0-BF51-4705-9EC1-92A17C882BC4}" type="presParOf" srcId="{73B709FB-7B30-472B-AD65-EC980FF821F6}" destId="{594D3F54-EE82-44DD-84F9-B2DCBA830960}" srcOrd="5" destOrd="0" presId="urn:microsoft.com/office/officeart/2005/8/layout/chevron1"/>
-    <dgm:cxn modelId="{15928D5B-5FC8-49C9-95CF-BAA84DD2E0B7}" type="presParOf" srcId="{73B709FB-7B30-472B-AD65-EC980FF821F6}" destId="{7DC38E28-F114-44F6-A466-CCCEAA6E3A2B}" srcOrd="6" destOrd="0" presId="urn:microsoft.com/office/officeart/2005/8/layout/chevron1"/>
+    <dgm:cxn modelId="{09F40737-D2B7-461D-9491-F9114AC31049}" type="presOf" srcId="{12905BA0-FFBC-4F6F-A638-860052C3C22E}" destId="{7DC38E28-F114-44F6-A466-CCCEAA6E3A2B}" srcOrd="0" destOrd="0" presId="urn:microsoft.com/office/officeart/2005/8/layout/chevron1"/>
+    <dgm:cxn modelId="{A237ED23-1ED0-413E-9B68-566055A86333}" type="presParOf" srcId="{73B709FB-7B30-472B-AD65-EC980FF821F6}" destId="{4D560F50-8F16-4794-86B3-C3D8DE2F9386}" srcOrd="0" destOrd="0" presId="urn:microsoft.com/office/officeart/2005/8/layout/chevron1"/>
+    <dgm:cxn modelId="{605C3E73-BCD8-41D0-B367-09FB97A39246}" type="presParOf" srcId="{73B709FB-7B30-472B-AD65-EC980FF821F6}" destId="{154621DC-2D17-41EF-803D-3A82BFCEB308}" srcOrd="1" destOrd="0" presId="urn:microsoft.com/office/officeart/2005/8/layout/chevron1"/>
+    <dgm:cxn modelId="{32302F35-0C2E-45CE-BF3F-C7A893562040}" type="presParOf" srcId="{73B709FB-7B30-472B-AD65-EC980FF821F6}" destId="{5F46AD52-443D-445C-A0DE-55C3F3A14D43}" srcOrd="2" destOrd="0" presId="urn:microsoft.com/office/officeart/2005/8/layout/chevron1"/>
+    <dgm:cxn modelId="{DF5175DD-693A-4F4D-BDFD-7F28C56576F3}" type="presParOf" srcId="{73B709FB-7B30-472B-AD65-EC980FF821F6}" destId="{3E86C66D-943B-4F67-81EE-8C1894017E0F}" srcOrd="3" destOrd="0" presId="urn:microsoft.com/office/officeart/2005/8/layout/chevron1"/>
+    <dgm:cxn modelId="{9256DA60-12C8-4ED6-9834-45CBA271D4A1}" type="presParOf" srcId="{73B709FB-7B30-472B-AD65-EC980FF821F6}" destId="{CBCE1630-5EA0-49CF-B64F-8E2E518136D4}" srcOrd="4" destOrd="0" presId="urn:microsoft.com/office/officeart/2005/8/layout/chevron1"/>
+    <dgm:cxn modelId="{C0E6853A-17EE-4071-A73F-46F482FCED4B}" type="presParOf" srcId="{73B709FB-7B30-472B-AD65-EC980FF821F6}" destId="{594D3F54-EE82-44DD-84F9-B2DCBA830960}" srcOrd="5" destOrd="0" presId="urn:microsoft.com/office/officeart/2005/8/layout/chevron1"/>
+    <dgm:cxn modelId="{FAE47DDD-8F72-4002-8BF1-EB6DB28DC390}" type="presParOf" srcId="{73B709FB-7B30-472B-AD65-EC980FF821F6}" destId="{7DC38E28-F114-44F6-A466-CCCEAA6E3A2B}" srcOrd="6" destOrd="0" presId="urn:microsoft.com/office/officeart/2005/8/layout/chevron1"/>
   </dgm:cxnLst>
   <dgm:bg/>
   <dgm:whole/>

</xml_diff>